<commit_message>
Refactor data preparation in prepare_pipeline function: improve variable naming for clarity and ensure consistent usage of normalized datasets across training, validation, combined, and test splits.
</commit_message>
<xml_diff>
--- a/docs/Relatório.docx
+++ b/docs/Relatório.docx
@@ -904,6 +904,7 @@
           <w:lang w:val="en-US"/>
         </w:rPr>
       </w:pPr>
+      <w:proofErr w:type="spellStart"/>
       <w:r>
         <w:rPr>
           <w:rFonts w:ascii="Times New Roman" w:hAnsi="Times New Roman" w:cs="Times New Roman"/>
@@ -935,7 +936,19 @@
           <w:szCs w:val="40"/>
           <w:lang w:val="en-US"/>
         </w:rPr>
-        <w:t xml:space="preserve">ção de Outliers </w:t>
+        <w:t>ção</w:t>
+      </w:r>
+      <w:proofErr w:type="spellEnd"/>
+      <w:r>
+        <w:rPr>
+          <w:rFonts w:ascii="Times New Roman" w:hAnsi="Times New Roman" w:cs="Times New Roman"/>
+          <w:b/>
+          <w:bCs/>
+          <w:sz w:val="40"/>
+          <w:szCs w:val="40"/>
+          <w:lang w:val="en-US"/>
+        </w:rPr>
+        <w:t xml:space="preserve"> de Outliers </w:t>
       </w:r>
     </w:p>
     <w:p>
@@ -964,8 +977,21 @@
           <w:szCs w:val="40"/>
           <w:lang w:val="en-US"/>
         </w:rPr>
-        <w:t>Testes de Normalidade</w:t>
-      </w:r>
+        <w:t xml:space="preserve">Testes de </w:t>
+      </w:r>
+      <w:proofErr w:type="spellStart"/>
+      <w:r>
+        <w:rPr>
+          <w:rFonts w:ascii="Times New Roman" w:hAnsi="Times New Roman" w:cs="Times New Roman"/>
+          <w:b/>
+          <w:bCs/>
+          <w:sz w:val="40"/>
+          <w:szCs w:val="40"/>
+          <w:lang w:val="en-US"/>
+        </w:rPr>
+        <w:t>Normalidade</w:t>
+      </w:r>
+      <w:proofErr w:type="spellEnd"/>
     </w:p>
     <w:p>
       <w:pPr>
@@ -4859,7 +4885,7 @@
           <w:szCs w:val="28"/>
         </w:rPr>
         <w:drawing>
-          <wp:anchor distT="0" distB="0" distL="114300" distR="114300" simplePos="0" relativeHeight="251675648" behindDoc="1" locked="0" layoutInCell="1" allowOverlap="1" wp14:anchorId="54A8846A" wp14:editId="4266B45D">
+          <wp:anchor distT="0" distB="0" distL="114300" distR="114300" simplePos="0" relativeHeight="251675648" behindDoc="1" locked="0" layoutInCell="1" allowOverlap="1" wp14:anchorId="54A8846A" wp14:editId="2D42F058">
             <wp:simplePos x="0" y="0"/>
             <wp:positionH relativeFrom="margin">
               <wp:posOffset>-325289</wp:posOffset>
@@ -6391,15 +6417,7 @@
           <w:sz w:val="28"/>
           <w:szCs w:val="28"/>
         </w:rPr>
-        <w:t>Na divisão</w:t>
-      </w:r>
-      <w:r>
-        <w:rPr>
-          <w:rFonts w:ascii="Times New Roman" w:hAnsi="Times New Roman" w:cs="Times New Roman"/>
-          <w:sz w:val="28"/>
-          <w:szCs w:val="28"/>
-        </w:rPr>
-        <w:t xml:space="preserve"> intra-participante</w:t>
+        <w:t>Na divisão intra-participante</w:t>
       </w:r>
       <w:r>
         <w:rPr>
@@ -6609,15 +6627,7 @@
           <w:sz w:val="28"/>
           <w:szCs w:val="28"/>
         </w:rPr>
-        <w:t xml:space="preserve">Na divisão </w:t>
-      </w:r>
-      <w:r>
-        <w:rPr>
-          <w:rFonts w:ascii="Times New Roman" w:hAnsi="Times New Roman" w:cs="Times New Roman"/>
-          <w:sz w:val="28"/>
-          <w:szCs w:val="28"/>
-        </w:rPr>
-        <w:t>int</w:t>
+        <w:t>Na divisão int</w:t>
       </w:r>
       <w:r>
         <w:rPr>
@@ -7460,16 +7470,6 @@
         <w:jc w:val="both"/>
         <w:rPr>
           <w:rFonts w:ascii="Times New Roman" w:hAnsi="Times New Roman" w:cs="Times New Roman"/>
-          <w:sz w:val="28"/>
-          <w:szCs w:val="28"/>
-        </w:rPr>
-      </w:pPr>
-    </w:p>
-    <w:p>
-      <w:pPr>
-        <w:jc w:val="both"/>
-        <w:rPr>
-          <w:rFonts w:ascii="Times New Roman" w:hAnsi="Times New Roman" w:cs="Times New Roman"/>
           <w:b/>
           <w:bCs/>
           <w:sz w:val="28"/>
@@ -7710,7 +7710,6 @@
           <w:sz w:val="28"/>
           <w:szCs w:val="28"/>
         </w:rPr>
-        <w:lastRenderedPageBreak/>
         <w:t>Desempenho por estratégia de divisão</w:t>
       </w:r>
     </w:p>

</xml_diff>

<commit_message>
Refactor evaluation output: replace print statements with logging for improved traceability and consistency in metrics summary and accuracy tables.
</commit_message>
<xml_diff>
--- a/docs/Relatório.docx
+++ b/docs/Relatório.docx
@@ -4885,7 +4885,7 @@
           <w:szCs w:val="28"/>
         </w:rPr>
         <w:drawing>
-          <wp:anchor distT="0" distB="0" distL="114300" distR="114300" simplePos="0" relativeHeight="251675648" behindDoc="1" locked="0" layoutInCell="1" allowOverlap="1" wp14:anchorId="54A8846A" wp14:editId="2D42F058">
+          <wp:anchor distT="0" distB="0" distL="114300" distR="114300" simplePos="0" relativeHeight="251675648" behindDoc="1" locked="0" layoutInCell="1" allowOverlap="1" wp14:anchorId="54A8846A" wp14:editId="373A10DB">
             <wp:simplePos x="0" y="0"/>
             <wp:positionH relativeFrom="margin">
               <wp:posOffset>-325289</wp:posOffset>
@@ -7034,6 +7034,196 @@
           <w:szCs w:val="28"/>
         </w:rPr>
       </w:pPr>
+      <w:r>
+        <w:rPr>
+          <w:rFonts w:ascii="Times New Roman" w:hAnsi="Times New Roman" w:cs="Times New Roman"/>
+          <w:sz w:val="28"/>
+          <w:szCs w:val="28"/>
+        </w:rPr>
+        <w:t>Após a definição das métricas e dos critérios de avaliação, avançou-se para a comparação sistemática dos 12 modelos resultantes da combinação entre:</w:t>
+      </w:r>
+    </w:p>
+    <w:p>
+      <w:pPr>
+        <w:pStyle w:val="ListParagraph"/>
+        <w:numPr>
+          <w:ilvl w:val="0"/>
+          <w:numId w:val="23"/>
+        </w:numPr>
+        <w:rPr>
+          <w:rFonts w:ascii="Times New Roman" w:hAnsi="Times New Roman" w:cs="Times New Roman"/>
+          <w:sz w:val="28"/>
+          <w:szCs w:val="28"/>
+        </w:rPr>
+      </w:pPr>
+      <w:r>
+        <w:rPr>
+          <w:rFonts w:ascii="Times New Roman" w:hAnsi="Times New Roman" w:cs="Times New Roman"/>
+          <w:sz w:val="28"/>
+          <w:szCs w:val="28"/>
+        </w:rPr>
+        <w:t>D</w:t>
+      </w:r>
+      <w:r>
+        <w:rPr>
+          <w:rFonts w:ascii="Times New Roman" w:hAnsi="Times New Roman" w:cs="Times New Roman"/>
+          <w:sz w:val="28"/>
+          <w:szCs w:val="28"/>
+        </w:rPr>
+        <w:t>uas estratégias de divisão do dataset (mixed e participant-based).</w:t>
+      </w:r>
+    </w:p>
+    <w:p>
+      <w:pPr>
+        <w:pStyle w:val="ListParagraph"/>
+        <w:numPr>
+          <w:ilvl w:val="0"/>
+          <w:numId w:val="23"/>
+        </w:numPr>
+        <w:rPr>
+          <w:rFonts w:ascii="Times New Roman" w:hAnsi="Times New Roman" w:cs="Times New Roman"/>
+          <w:sz w:val="28"/>
+          <w:szCs w:val="28"/>
+        </w:rPr>
+      </w:pPr>
+      <w:r>
+        <w:rPr>
+          <w:rFonts w:ascii="Times New Roman" w:hAnsi="Times New Roman" w:cs="Times New Roman"/>
+          <w:sz w:val="28"/>
+          <w:szCs w:val="28"/>
+        </w:rPr>
+        <w:t>Dois tipos de dados (Features, Embeddings)</w:t>
+      </w:r>
+    </w:p>
+    <w:p>
+      <w:pPr>
+        <w:pStyle w:val="ListParagraph"/>
+        <w:numPr>
+          <w:ilvl w:val="0"/>
+          <w:numId w:val="23"/>
+        </w:numPr>
+        <w:rPr>
+          <w:rFonts w:ascii="Times New Roman" w:hAnsi="Times New Roman" w:cs="Times New Roman"/>
+          <w:sz w:val="28"/>
+          <w:szCs w:val="28"/>
+        </w:rPr>
+      </w:pPr>
+      <w:r>
+        <w:rPr>
+          <w:rFonts w:ascii="Times New Roman" w:hAnsi="Times New Roman" w:cs="Times New Roman"/>
+          <w:sz w:val="28"/>
+          <w:szCs w:val="28"/>
+        </w:rPr>
+        <w:t xml:space="preserve">Três cenários </w:t>
+      </w:r>
+      <w:r>
+        <w:rPr>
+          <w:rFonts w:ascii="Times New Roman" w:hAnsi="Times New Roman" w:cs="Times New Roman"/>
+          <w:sz w:val="28"/>
+          <w:szCs w:val="28"/>
+        </w:rPr>
+        <w:t>(Completas, PCA, ReliefF)</w:t>
+      </w:r>
+    </w:p>
+    <w:p>
+      <w:pPr>
+        <w:jc w:val="both"/>
+        <w:rPr>
+          <w:rFonts w:ascii="Times New Roman" w:hAnsi="Times New Roman" w:cs="Times New Roman"/>
+          <w:sz w:val="28"/>
+          <w:szCs w:val="28"/>
+        </w:rPr>
+      </w:pPr>
+      <w:r>
+        <w:rPr>
+          <w:rFonts w:ascii="Times New Roman" w:hAnsi="Times New Roman" w:cs="Times New Roman"/>
+          <w:sz w:val="28"/>
+          <w:szCs w:val="28"/>
+        </w:rPr>
+        <w:t xml:space="preserve">Para cada um dos 12 modelos, testaram-se múltiplos valores de </w:t>
+      </w:r>
+      <w:r>
+        <w:rPr>
+          <w:rFonts w:ascii="Times New Roman" w:hAnsi="Times New Roman" w:cs="Times New Roman"/>
+          <w:i/>
+          <w:iCs/>
+          <w:sz w:val="28"/>
+          <w:szCs w:val="28"/>
+        </w:rPr>
+        <w:t>k</w:t>
+      </w:r>
+      <w:r>
+        <w:rPr>
+          <w:rFonts w:ascii="Times New Roman" w:hAnsi="Times New Roman" w:cs="Times New Roman"/>
+          <w:sz w:val="28"/>
+          <w:szCs w:val="28"/>
+        </w:rPr>
+        <w:t xml:space="preserve">, avaliando o F1-score de validação em cada caso. O valor de </w:t>
+      </w:r>
+      <w:r>
+        <w:rPr>
+          <w:rFonts w:ascii="Times New Roman" w:hAnsi="Times New Roman" w:cs="Times New Roman"/>
+          <w:i/>
+          <w:iCs/>
+          <w:sz w:val="28"/>
+          <w:szCs w:val="28"/>
+        </w:rPr>
+        <w:t>k</w:t>
+      </w:r>
+      <w:r>
+        <w:rPr>
+          <w:rFonts w:ascii="Times New Roman" w:hAnsi="Times New Roman" w:cs="Times New Roman"/>
+          <w:sz w:val="28"/>
+          <w:szCs w:val="28"/>
+        </w:rPr>
+        <w:t xml:space="preserve"> que maximizou este desempenho foi então adotado para a fase final.</w:t>
+      </w:r>
+      <w:r>
+        <w:rPr>
+          <w:rFonts w:ascii="Times New Roman" w:hAnsi="Times New Roman" w:cs="Times New Roman"/>
+          <w:sz w:val="28"/>
+          <w:szCs w:val="28"/>
+        </w:rPr>
+        <w:t xml:space="preserve"> </w:t>
+      </w:r>
+      <w:r>
+        <w:rPr>
+          <w:rFonts w:ascii="Times New Roman" w:hAnsi="Times New Roman" w:cs="Times New Roman"/>
+          <w:sz w:val="28"/>
+          <w:szCs w:val="28"/>
+        </w:rPr>
+        <w:t xml:space="preserve">Concluída esta etapa, cada modelo foi novamente treinado com train + validation e avaliado no conjunto de teste. </w:t>
+      </w:r>
+    </w:p>
+    <w:p>
+      <w:pPr>
+        <w:jc w:val="both"/>
+        <w:rPr>
+          <w:rFonts w:ascii="Times New Roman" w:hAnsi="Times New Roman" w:cs="Times New Roman"/>
+          <w:sz w:val="28"/>
+          <w:szCs w:val="28"/>
+        </w:rPr>
+      </w:pPr>
+    </w:p>
+    <w:p>
+      <w:pPr>
+        <w:jc w:val="both"/>
+        <w:rPr>
+          <w:rFonts w:ascii="Times New Roman" w:hAnsi="Times New Roman" w:cs="Times New Roman"/>
+          <w:sz w:val="28"/>
+          <w:szCs w:val="28"/>
+        </w:rPr>
+      </w:pPr>
+    </w:p>
+    <w:p>
+      <w:pPr>
+        <w:jc w:val="both"/>
+        <w:rPr>
+          <w:rFonts w:ascii="Times New Roman" w:hAnsi="Times New Roman" w:cs="Times New Roman"/>
+          <w:sz w:val="28"/>
+          <w:szCs w:val="28"/>
+        </w:rPr>
+      </w:pPr>
     </w:p>
     <w:p>
       <w:pPr>
@@ -7045,9 +7235,6 @@
         <w:jc w:val="both"/>
         <w:rPr>
           <w:rFonts w:ascii="Times New Roman" w:hAnsi="Times New Roman" w:cs="Times New Roman"/>
-          <w:sz w:val="22"/>
-          <w:szCs w:val="22"/>
-          <w:lang w:val="en-US"/>
         </w:rPr>
       </w:pPr>
       <w:r>
@@ -7058,8 +7245,428 @@
           <w:sz w:val="48"/>
           <w:szCs w:val="48"/>
         </w:rPr>
-        <w:t xml:space="preserve">Avaliação dos </w:t>
-      </w:r>
+        <w:lastRenderedPageBreak/>
+        <w:t>Avaliação dos Modelos</w:t>
+      </w:r>
+    </w:p>
+    <w:p>
+      <w:pPr>
+        <w:jc w:val="both"/>
+        <w:rPr>
+          <w:rFonts w:ascii="Times New Roman" w:hAnsi="Times New Roman" w:cs="Times New Roman"/>
+          <w:sz w:val="28"/>
+          <w:szCs w:val="28"/>
+        </w:rPr>
+      </w:pPr>
+      <w:r>
+        <w:rPr>
+          <w:rFonts w:ascii="Times New Roman" w:hAnsi="Times New Roman" w:cs="Times New Roman"/>
+          <w:sz w:val="28"/>
+          <w:szCs w:val="28"/>
+        </w:rPr>
+        <w:t>Observando a</w:t>
+      </w:r>
+      <w:r>
+        <w:rPr>
+          <w:rFonts w:ascii="Times New Roman" w:hAnsi="Times New Roman" w:cs="Times New Roman"/>
+          <w:sz w:val="28"/>
+          <w:szCs w:val="28"/>
+        </w:rPr>
+        <w:t>s</w:t>
+      </w:r>
+      <w:r>
+        <w:rPr>
+          <w:rFonts w:ascii="Times New Roman" w:hAnsi="Times New Roman" w:cs="Times New Roman"/>
+          <w:sz w:val="28"/>
+          <w:szCs w:val="28"/>
+        </w:rPr>
+        <w:t xml:space="preserve"> matriz</w:t>
+      </w:r>
+      <w:r>
+        <w:rPr>
+          <w:rFonts w:ascii="Times New Roman" w:hAnsi="Times New Roman" w:cs="Times New Roman"/>
+          <w:sz w:val="28"/>
+          <w:szCs w:val="28"/>
+        </w:rPr>
+        <w:t>es</w:t>
+      </w:r>
+      <w:r>
+        <w:rPr>
+          <w:rFonts w:ascii="Times New Roman" w:hAnsi="Times New Roman" w:cs="Times New Roman"/>
+          <w:sz w:val="28"/>
+          <w:szCs w:val="28"/>
+        </w:rPr>
+        <w:t xml:space="preserve"> de confusão, nota-se que há uma confusão significativa entre pares de atividades muito semelhantes, sobretudo aquelas que diferem apenas pela presença da fala. Por exemplo, as classes 2 e 3 apresentam elevada taxa de erro cruzado, indicando que o modelo frequentemente confunde “</w:t>
+      </w:r>
+      <w:r>
+        <w:rPr>
+          <w:rFonts w:ascii="Times New Roman" w:hAnsi="Times New Roman" w:cs="Times New Roman"/>
+          <w:sz w:val="28"/>
+          <w:szCs w:val="28"/>
+        </w:rPr>
+        <w:t>Sit</w:t>
+      </w:r>
+      <w:r>
+        <w:rPr>
+          <w:rFonts w:ascii="Times New Roman" w:hAnsi="Times New Roman" w:cs="Times New Roman"/>
+          <w:sz w:val="28"/>
+          <w:szCs w:val="28"/>
+        </w:rPr>
+        <w:t>” com “</w:t>
+      </w:r>
+      <w:r>
+        <w:rPr>
+          <w:rFonts w:ascii="Times New Roman" w:hAnsi="Times New Roman" w:cs="Times New Roman"/>
+          <w:sz w:val="28"/>
+          <w:szCs w:val="28"/>
+        </w:rPr>
+        <w:t>Sit</w:t>
+      </w:r>
+      <w:r>
+        <w:rPr>
+          <w:rFonts w:ascii="Times New Roman" w:hAnsi="Times New Roman" w:cs="Times New Roman"/>
+          <w:sz w:val="28"/>
+          <w:szCs w:val="28"/>
+        </w:rPr>
+        <w:t xml:space="preserve"> and Talk”. Um padrão semelhante é observado entre as classes 4 e 5, onde “</w:t>
+      </w:r>
+      <w:r>
+        <w:rPr>
+          <w:rFonts w:ascii="Times New Roman" w:hAnsi="Times New Roman" w:cs="Times New Roman"/>
+          <w:sz w:val="28"/>
+          <w:szCs w:val="28"/>
+        </w:rPr>
+        <w:t>Walk</w:t>
+      </w:r>
+      <w:r>
+        <w:rPr>
+          <w:rFonts w:ascii="Times New Roman" w:hAnsi="Times New Roman" w:cs="Times New Roman"/>
+          <w:sz w:val="28"/>
+          <w:szCs w:val="28"/>
+        </w:rPr>
+        <w:t>” e “</w:t>
+      </w:r>
+      <w:r>
+        <w:rPr>
+          <w:rFonts w:ascii="Times New Roman" w:hAnsi="Times New Roman" w:cs="Times New Roman"/>
+          <w:sz w:val="28"/>
+          <w:szCs w:val="28"/>
+        </w:rPr>
+        <w:t>Walk</w:t>
+      </w:r>
+      <w:r>
+        <w:rPr>
+          <w:rFonts w:ascii="Times New Roman" w:hAnsi="Times New Roman" w:cs="Times New Roman"/>
+          <w:sz w:val="28"/>
+          <w:szCs w:val="28"/>
+        </w:rPr>
+        <w:t xml:space="preserve"> and Talk” também são erroneamente classificadas.</w:t>
+      </w:r>
+      <w:r>
+        <w:rPr>
+          <w:rFonts w:ascii="Times New Roman" w:hAnsi="Times New Roman" w:cs="Times New Roman"/>
+          <w:sz w:val="28"/>
+          <w:szCs w:val="28"/>
+        </w:rPr>
+        <w:t xml:space="preserve"> </w:t>
+      </w:r>
+      <w:r>
+        <w:rPr>
+          <w:rFonts w:ascii="Times New Roman" w:hAnsi="Times New Roman" w:cs="Times New Roman"/>
+          <w:sz w:val="28"/>
+          <w:szCs w:val="28"/>
+        </w:rPr>
+        <w:t>Este comportamento sugere que os sinais capturados pelo modelo não são suficientemente discriminativos para distinguir atividades que diferem apenas por falar, possivelmente porque o fator de fala introduz variações sutis no padrão de movimento que se sobrepõem aos sinais da atividade principal.</w:t>
+      </w:r>
+    </w:p>
+    <w:p>
+      <w:pPr>
+        <w:jc w:val="both"/>
+        <w:rPr>
+          <w:rFonts w:ascii="Times New Roman" w:hAnsi="Times New Roman" w:cs="Times New Roman"/>
+          <w:sz w:val="28"/>
+          <w:szCs w:val="28"/>
+        </w:rPr>
+      </w:pPr>
+      <w:r>
+        <w:rPr>
+          <w:rFonts w:ascii="Times New Roman" w:hAnsi="Times New Roman" w:cs="Times New Roman"/>
+          <w:sz w:val="28"/>
+          <w:szCs w:val="28"/>
+        </w:rPr>
+        <w:t>Fica</w:t>
+      </w:r>
+      <w:r>
+        <w:rPr>
+          <w:rFonts w:ascii="Times New Roman" w:hAnsi="Times New Roman" w:cs="Times New Roman"/>
+          <w:sz w:val="28"/>
+          <w:szCs w:val="28"/>
+        </w:rPr>
+        <w:t xml:space="preserve"> também</w:t>
+      </w:r>
+      <w:r>
+        <w:rPr>
+          <w:rFonts w:ascii="Times New Roman" w:hAnsi="Times New Roman" w:cs="Times New Roman"/>
+          <w:sz w:val="28"/>
+          <w:szCs w:val="28"/>
+        </w:rPr>
+        <w:t xml:space="preserve"> claro que os </w:t>
+      </w:r>
+      <w:r>
+        <w:rPr>
+          <w:rFonts w:ascii="Times New Roman" w:hAnsi="Times New Roman" w:cs="Times New Roman"/>
+          <w:sz w:val="28"/>
+          <w:szCs w:val="28"/>
+        </w:rPr>
+        <w:t>modelos baseados em features</w:t>
+      </w:r>
+      <w:r>
+        <w:rPr>
+          <w:rFonts w:ascii="Times New Roman" w:hAnsi="Times New Roman" w:cs="Times New Roman"/>
+          <w:sz w:val="28"/>
+          <w:szCs w:val="28"/>
+        </w:rPr>
+        <w:t xml:space="preserve"> superaram consistentemente os baseados em embeddings em todos os cenários. Esse padrão repete-se em todas as variações dos datasets </w:t>
+      </w:r>
+      <w:r>
+        <w:rPr>
+          <w:rFonts w:ascii="Times New Roman" w:hAnsi="Times New Roman" w:cs="Times New Roman"/>
+          <w:sz w:val="28"/>
+          <w:szCs w:val="28"/>
+        </w:rPr>
+        <w:t xml:space="preserve">intra-participante </w:t>
+      </w:r>
+      <w:r>
+        <w:rPr>
+          <w:rFonts w:ascii="Times New Roman" w:hAnsi="Times New Roman" w:cs="Times New Roman"/>
+          <w:sz w:val="28"/>
+          <w:szCs w:val="28"/>
+        </w:rPr>
+        <w:t xml:space="preserve">e </w:t>
+      </w:r>
+      <w:r>
+        <w:rPr>
+          <w:rFonts w:ascii="Times New Roman" w:hAnsi="Times New Roman" w:cs="Times New Roman"/>
+          <w:sz w:val="28"/>
+          <w:szCs w:val="28"/>
+        </w:rPr>
+        <w:t>int</w:t>
+      </w:r>
+      <w:r>
+        <w:rPr>
+          <w:rFonts w:ascii="Times New Roman" w:hAnsi="Times New Roman" w:cs="Times New Roman"/>
+          <w:sz w:val="28"/>
+          <w:szCs w:val="28"/>
+        </w:rPr>
+        <w:t>er</w:t>
+      </w:r>
+      <w:r>
+        <w:rPr>
+          <w:rFonts w:ascii="Times New Roman" w:hAnsi="Times New Roman" w:cs="Times New Roman"/>
+          <w:sz w:val="28"/>
+          <w:szCs w:val="28"/>
+        </w:rPr>
+        <w:t>-participante</w:t>
+      </w:r>
+      <w:r>
+        <w:rPr>
+          <w:rFonts w:ascii="Times New Roman" w:hAnsi="Times New Roman" w:cs="Times New Roman"/>
+          <w:sz w:val="28"/>
+          <w:szCs w:val="28"/>
+        </w:rPr>
+        <w:t>. Es</w:t>
+      </w:r>
+      <w:r>
+        <w:rPr>
+          <w:rFonts w:ascii="Times New Roman" w:hAnsi="Times New Roman" w:cs="Times New Roman"/>
+          <w:sz w:val="28"/>
+          <w:szCs w:val="28"/>
+        </w:rPr>
+        <w:t>t</w:t>
+      </w:r>
+      <w:r>
+        <w:rPr>
+          <w:rFonts w:ascii="Times New Roman" w:hAnsi="Times New Roman" w:cs="Times New Roman"/>
+          <w:sz w:val="28"/>
+          <w:szCs w:val="28"/>
+        </w:rPr>
+        <w:t>es resultados indicam que</w:t>
+      </w:r>
+      <w:r>
+        <w:rPr>
+          <w:rFonts w:ascii="Times New Roman" w:hAnsi="Times New Roman" w:cs="Times New Roman"/>
+          <w:sz w:val="28"/>
+          <w:szCs w:val="28"/>
+        </w:rPr>
+        <w:t xml:space="preserve"> </w:t>
+      </w:r>
+      <w:r>
+        <w:rPr>
+          <w:rFonts w:ascii="Times New Roman" w:hAnsi="Times New Roman" w:cs="Times New Roman"/>
+          <w:sz w:val="28"/>
+          <w:szCs w:val="28"/>
+        </w:rPr>
+        <w:t>as features extraídas manualmente</w:t>
+      </w:r>
+      <w:r>
+        <w:rPr>
+          <w:rFonts w:ascii="Times New Roman" w:hAnsi="Times New Roman" w:cs="Times New Roman"/>
+          <w:sz w:val="28"/>
+          <w:szCs w:val="28"/>
+        </w:rPr>
+        <w:t xml:space="preserve"> </w:t>
+      </w:r>
+      <w:r>
+        <w:rPr>
+          <w:rFonts w:ascii="Times New Roman" w:hAnsi="Times New Roman" w:cs="Times New Roman"/>
+          <w:sz w:val="28"/>
+          <w:szCs w:val="28"/>
+        </w:rPr>
+        <w:t>fornecem sinais mais discriminativos para a classificação das atividades do que</w:t>
+      </w:r>
+      <w:r>
+        <w:rPr>
+          <w:rFonts w:ascii="Times New Roman" w:hAnsi="Times New Roman" w:cs="Times New Roman"/>
+          <w:sz w:val="28"/>
+          <w:szCs w:val="28"/>
+        </w:rPr>
+        <w:t xml:space="preserve"> embeddings</w:t>
+      </w:r>
+      <w:r>
+        <w:rPr>
+          <w:rFonts w:ascii="Times New Roman" w:hAnsi="Times New Roman" w:cs="Times New Roman"/>
+          <w:sz w:val="28"/>
+          <w:szCs w:val="28"/>
+        </w:rPr>
+        <w:t>. Os embeddings parecem perder informações importantes para distinguir entre atividades, sobretudo quando há variações sutis entre classes.</w:t>
+      </w:r>
+    </w:p>
+    <w:p>
+      <w:pPr>
+        <w:jc w:val="both"/>
+        <w:rPr>
+          <w:rFonts w:ascii="Times New Roman" w:hAnsi="Times New Roman" w:cs="Times New Roman"/>
+          <w:sz w:val="28"/>
+          <w:szCs w:val="28"/>
+        </w:rPr>
+      </w:pPr>
+      <w:r>
+        <w:rPr>
+          <w:rFonts w:ascii="Times New Roman" w:hAnsi="Times New Roman" w:cs="Times New Roman"/>
+          <w:sz w:val="28"/>
+          <w:szCs w:val="28"/>
+        </w:rPr>
+        <w:t>O</w:t>
+      </w:r>
+      <w:r>
+        <w:rPr>
+          <w:rFonts w:ascii="Times New Roman" w:hAnsi="Times New Roman" w:cs="Times New Roman"/>
+          <w:sz w:val="28"/>
+          <w:szCs w:val="28"/>
+        </w:rPr>
+        <w:t xml:space="preserve"> efeito da seleção de features, observa-se que </w:t>
+      </w:r>
+      <w:r>
+        <w:rPr>
+          <w:rFonts w:ascii="Times New Roman" w:hAnsi="Times New Roman" w:cs="Times New Roman"/>
+          <w:sz w:val="28"/>
+          <w:szCs w:val="28"/>
+        </w:rPr>
+        <w:t>o cenário</w:t>
+      </w:r>
+      <w:r>
+        <w:rPr>
+          <w:rFonts w:ascii="Times New Roman" w:hAnsi="Times New Roman" w:cs="Times New Roman"/>
+          <w:sz w:val="28"/>
+          <w:szCs w:val="28"/>
+        </w:rPr>
+        <w:t xml:space="preserve"> A de cada dataset apresentou consistentemente o melhor desempenho, enquanto as versões B e C, que representam variações com menos features, registraram quedas nas métricas. Es</w:t>
+      </w:r>
+      <w:r>
+        <w:rPr>
+          <w:rFonts w:ascii="Times New Roman" w:hAnsi="Times New Roman" w:cs="Times New Roman"/>
+          <w:sz w:val="28"/>
+          <w:szCs w:val="28"/>
+        </w:rPr>
+        <w:t>t</w:t>
+      </w:r>
+      <w:r>
+        <w:rPr>
+          <w:rFonts w:ascii="Times New Roman" w:hAnsi="Times New Roman" w:cs="Times New Roman"/>
+          <w:sz w:val="28"/>
+          <w:szCs w:val="28"/>
+        </w:rPr>
+        <w:t>e padrão sugere que a seleção de features não melhorou o desempenho</w:t>
+      </w:r>
+      <w:r>
+        <w:rPr>
+          <w:rFonts w:ascii="Times New Roman" w:hAnsi="Times New Roman" w:cs="Times New Roman"/>
+          <w:sz w:val="28"/>
+          <w:szCs w:val="28"/>
+        </w:rPr>
+        <w:t>,</w:t>
+      </w:r>
+      <w:r>
+        <w:rPr>
+          <w:rFonts w:ascii="Times New Roman" w:hAnsi="Times New Roman" w:cs="Times New Roman"/>
+          <w:sz w:val="28"/>
+          <w:szCs w:val="28"/>
+        </w:rPr>
+        <w:t xml:space="preserve"> pelo contrário, a redução ou modificação de features parece ter eliminado informações importantes para a discriminação entre atividades. Nos datasets baseados em embeddings, a diferença entre A, B e C é ainda mais marcada, embora todos apresentem resultados inferiores aos datasets de features.</w:t>
+      </w:r>
+    </w:p>
+    <w:p>
+      <w:pPr>
+        <w:jc w:val="both"/>
+        <w:rPr>
+          <w:rFonts w:ascii="Times New Roman" w:hAnsi="Times New Roman" w:cs="Times New Roman"/>
+          <w:sz w:val="28"/>
+          <w:szCs w:val="28"/>
+        </w:rPr>
+      </w:pPr>
+    </w:p>
+    <w:p>
+      <w:pPr>
+        <w:jc w:val="both"/>
+        <w:rPr>
+          <w:rFonts w:ascii="Times New Roman" w:hAnsi="Times New Roman" w:cs="Times New Roman"/>
+          <w:sz w:val="28"/>
+          <w:szCs w:val="28"/>
+        </w:rPr>
+      </w:pPr>
+    </w:p>
+    <w:p>
+      <w:pPr>
+        <w:jc w:val="both"/>
+        <w:rPr>
+          <w:rFonts w:ascii="Times New Roman" w:hAnsi="Times New Roman" w:cs="Times New Roman"/>
+          <w:sz w:val="28"/>
+          <w:szCs w:val="28"/>
+        </w:rPr>
+      </w:pPr>
+    </w:p>
+    <w:p>
+      <w:pPr>
+        <w:jc w:val="both"/>
+        <w:rPr>
+          <w:rFonts w:ascii="Times New Roman" w:hAnsi="Times New Roman" w:cs="Times New Roman"/>
+          <w:sz w:val="28"/>
+          <w:szCs w:val="28"/>
+        </w:rPr>
+      </w:pPr>
+    </w:p>
+    <w:p>
+      <w:pPr>
+        <w:pStyle w:val="ListParagraph"/>
+        <w:numPr>
+          <w:ilvl w:val="0"/>
+          <w:numId w:val="2"/>
+        </w:numPr>
+        <w:jc w:val="both"/>
+        <w:rPr>
+          <w:rFonts w:ascii="Times New Roman" w:hAnsi="Times New Roman" w:cs="Times New Roman"/>
+        </w:rPr>
+      </w:pPr>
       <w:r>
         <w:rPr>
           <w:rFonts w:ascii="Times New Roman" w:hAnsi="Times New Roman" w:cs="Times New Roman"/>
@@ -7068,115 +7675,150 @@
           <w:sz w:val="48"/>
           <w:szCs w:val="48"/>
         </w:rPr>
-        <w:t>M</w:t>
-      </w:r>
+        <w:lastRenderedPageBreak/>
+        <w:t>Testes de Hipótese</w:t>
+      </w:r>
+    </w:p>
+    <w:p>
+      <w:pPr>
+        <w:jc w:val="both"/>
+        <w:rPr>
+          <w:rFonts w:ascii="Times New Roman" w:hAnsi="Times New Roman" w:cs="Times New Roman"/>
+          <w:sz w:val="28"/>
+          <w:szCs w:val="28"/>
+        </w:rPr>
+      </w:pPr>
+      <w:r>
+        <w:rPr>
+          <w:rFonts w:ascii="Times New Roman" w:hAnsi="Times New Roman" w:cs="Times New Roman"/>
+          <w:sz w:val="28"/>
+          <w:szCs w:val="28"/>
+        </w:rPr>
+        <w:t>Para determinar se as diferenças entre modelos eram estatisticamente significativas, repetiu-se todo o processo train → validation → test várias vezes, obtendo distribuições de F1-score para cada um dos 12 modelos.</w:t>
+      </w:r>
+    </w:p>
+    <w:p>
+      <w:pPr>
+        <w:jc w:val="both"/>
+        <w:rPr>
+          <w:rFonts w:ascii="Times New Roman" w:hAnsi="Times New Roman" w:cs="Times New Roman"/>
+          <w:sz w:val="28"/>
+          <w:szCs w:val="28"/>
+        </w:rPr>
+      </w:pPr>
+      <w:r>
+        <w:rPr>
+          <w:rFonts w:ascii="Times New Roman" w:hAnsi="Times New Roman" w:cs="Times New Roman"/>
+          <w:sz w:val="28"/>
+          <w:szCs w:val="28"/>
+        </w:rPr>
+        <w:t>Como as distribuições não satisfaziam o pressuposto de normalidade, aplicaram-se testes não paramétricos:</w:t>
+      </w:r>
+    </w:p>
+    <w:p>
+      <w:pPr>
+        <w:numPr>
+          <w:ilvl w:val="0"/>
+          <w:numId w:val="26"/>
+        </w:numPr>
+        <w:jc w:val="both"/>
+        <w:rPr>
+          <w:rFonts w:ascii="Times New Roman" w:hAnsi="Times New Roman" w:cs="Times New Roman"/>
+          <w:sz w:val="28"/>
+          <w:szCs w:val="28"/>
+        </w:rPr>
+      </w:pPr>
+      <w:r>
+        <w:rPr>
+          <w:rFonts w:ascii="Times New Roman" w:hAnsi="Times New Roman" w:cs="Times New Roman"/>
+          <w:sz w:val="28"/>
+          <w:szCs w:val="28"/>
+        </w:rPr>
+        <w:t>Wilcoxon signed-rank test, quando os modelos eram comparados sobre as mesmas repetições;</w:t>
+      </w:r>
+    </w:p>
+    <w:p>
+      <w:pPr>
+        <w:numPr>
+          <w:ilvl w:val="0"/>
+          <w:numId w:val="26"/>
+        </w:numPr>
+        <w:jc w:val="both"/>
+        <w:rPr>
+          <w:rFonts w:ascii="Times New Roman" w:hAnsi="Times New Roman" w:cs="Times New Roman"/>
+          <w:sz w:val="28"/>
+          <w:szCs w:val="28"/>
+        </w:rPr>
+      </w:pPr>
       <w:r>
         <w:rPr>
           <w:rFonts w:ascii="Times New Roman" w:hAnsi="Times New Roman" w:cs="Times New Roman"/>
           <w:b/>
           <w:bCs/>
-          <w:sz w:val="48"/>
-          <w:szCs w:val="48"/>
-        </w:rPr>
-        <w:t>odelos</w:t>
-      </w:r>
-    </w:p>
-    <w:p>
-      <w:pPr>
-        <w:jc w:val="both"/>
-        <w:rPr>
-          <w:rFonts w:ascii="Times New Roman" w:hAnsi="Times New Roman" w:cs="Times New Roman"/>
-          <w:sz w:val="28"/>
-          <w:szCs w:val="28"/>
-        </w:rPr>
-      </w:pPr>
-      <w:r>
-        <w:rPr>
-          <w:rFonts w:ascii="Times New Roman" w:hAnsi="Times New Roman" w:cs="Times New Roman"/>
-          <w:sz w:val="28"/>
-          <w:szCs w:val="28"/>
-        </w:rPr>
-        <w:t>Após a definição das estratégias de divisão do dataset e a preparação dos três cenários de representação</w:t>
-      </w:r>
-      <w:r>
-        <w:rPr>
-          <w:rFonts w:ascii="Times New Roman" w:hAnsi="Times New Roman" w:cs="Times New Roman"/>
-          <w:sz w:val="28"/>
-          <w:szCs w:val="28"/>
-        </w:rPr>
-        <w:t xml:space="preserve"> </w:t>
-      </w:r>
-      <w:r>
-        <w:rPr>
-          <w:rFonts w:ascii="Times New Roman" w:hAnsi="Times New Roman" w:cs="Times New Roman"/>
-          <w:sz w:val="28"/>
-          <w:szCs w:val="28"/>
-        </w:rPr>
-        <w:t xml:space="preserve">tanto para </w:t>
-      </w:r>
-      <w:r>
-        <w:rPr>
-          <w:rFonts w:ascii="Times New Roman" w:hAnsi="Times New Roman" w:cs="Times New Roman"/>
-          <w:sz w:val="28"/>
-          <w:szCs w:val="28"/>
-        </w:rPr>
-        <w:t>as features</w:t>
-      </w:r>
-      <w:r>
-        <w:rPr>
-          <w:rFonts w:ascii="Times New Roman" w:hAnsi="Times New Roman" w:cs="Times New Roman"/>
-          <w:sz w:val="28"/>
-          <w:szCs w:val="28"/>
-        </w:rPr>
-        <w:t xml:space="preserve"> como para o </w:t>
-      </w:r>
-      <w:r>
-        <w:rPr>
-          <w:rFonts w:ascii="Times New Roman" w:hAnsi="Times New Roman" w:cs="Times New Roman"/>
-          <w:sz w:val="28"/>
-          <w:szCs w:val="28"/>
-        </w:rPr>
-        <w:t>e</w:t>
-      </w:r>
-      <w:r>
-        <w:rPr>
-          <w:rFonts w:ascii="Times New Roman" w:hAnsi="Times New Roman" w:cs="Times New Roman"/>
-          <w:sz w:val="28"/>
-          <w:szCs w:val="28"/>
-        </w:rPr>
-        <w:t>mbedding</w:t>
-      </w:r>
-      <w:r>
-        <w:rPr>
-          <w:rFonts w:ascii="Times New Roman" w:hAnsi="Times New Roman" w:cs="Times New Roman"/>
-          <w:sz w:val="28"/>
-          <w:szCs w:val="28"/>
-        </w:rPr>
-        <w:t>s</w:t>
-      </w:r>
-      <w:r>
-        <w:rPr>
-          <w:rFonts w:ascii="Times New Roman" w:hAnsi="Times New Roman" w:cs="Times New Roman"/>
-          <w:sz w:val="28"/>
-          <w:szCs w:val="28"/>
-        </w:rPr>
-        <w:t>:</w:t>
-      </w:r>
-      <w:r>
-        <w:rPr>
-          <w:rFonts w:ascii="Times New Roman" w:hAnsi="Times New Roman" w:cs="Times New Roman"/>
-          <w:sz w:val="28"/>
-          <w:szCs w:val="28"/>
-        </w:rPr>
-        <w:t xml:space="preserve"> </w:t>
-      </w:r>
-    </w:p>
-    <w:p>
-      <w:pPr>
-        <w:pStyle w:val="ListParagraph"/>
+          <w:sz w:val="28"/>
+          <w:szCs w:val="28"/>
+        </w:rPr>
+        <w:t>Mann–Whitney U test</w:t>
+      </w:r>
+      <w:r>
+        <w:rPr>
+          <w:rFonts w:ascii="Times New Roman" w:hAnsi="Times New Roman" w:cs="Times New Roman"/>
+          <w:sz w:val="28"/>
+          <w:szCs w:val="28"/>
+        </w:rPr>
+        <w:t>, quando as comparações não eram emparelhadas.</w:t>
+      </w:r>
+      <w:r>
+        <w:rPr>
+          <w:rFonts w:ascii="Times New Roman" w:hAnsi="Times New Roman" w:cs="Times New Roman"/>
+          <w:sz w:val="28"/>
+          <w:szCs w:val="28"/>
+        </w:rPr>
+        <w:br/>
+        <w:t xml:space="preserve">O nível de significância adotado foi </w:t>
+      </w:r>
+      <w:r>
+        <w:rPr>
+          <w:rFonts w:ascii="Times New Roman" w:hAnsi="Times New Roman" w:cs="Times New Roman"/>
+          <w:b/>
+          <w:bCs/>
+          <w:sz w:val="28"/>
+          <w:szCs w:val="28"/>
+        </w:rPr>
+        <w:t>α = 0.05</w:t>
+      </w:r>
+      <w:r>
+        <w:rPr>
+          <w:rFonts w:ascii="Times New Roman" w:hAnsi="Times New Roman" w:cs="Times New Roman"/>
+          <w:sz w:val="28"/>
+          <w:szCs w:val="28"/>
+        </w:rPr>
+        <w:t>.</w:t>
+      </w:r>
+    </w:p>
+    <w:p>
+      <w:pPr>
+        <w:jc w:val="both"/>
+        <w:rPr>
+          <w:rFonts w:ascii="Times New Roman" w:hAnsi="Times New Roman" w:cs="Times New Roman"/>
+          <w:sz w:val="28"/>
+          <w:szCs w:val="28"/>
+        </w:rPr>
+      </w:pPr>
+      <w:r>
+        <w:rPr>
+          <w:rFonts w:ascii="Times New Roman" w:hAnsi="Times New Roman" w:cs="Times New Roman"/>
+          <w:sz w:val="28"/>
+          <w:szCs w:val="28"/>
+        </w:rPr>
+        <w:t>Os testes revelaram que:</w:t>
+      </w:r>
+    </w:p>
+    <w:p>
+      <w:pPr>
         <w:numPr>
           <w:ilvl w:val="0"/>
-          <w:numId w:val="22"/>
+          <w:numId w:val="27"/>
         </w:numPr>
         <w:jc w:val="both"/>
         <w:rPr>
@@ -7191,55 +7833,32 @@
           <w:sz w:val="28"/>
           <w:szCs w:val="28"/>
         </w:rPr>
-        <w:t>D</w:t>
-      </w:r>
-      <w:r>
-        <w:rPr>
-          <w:rFonts w:ascii="Times New Roman" w:hAnsi="Times New Roman" w:cs="Times New Roman"/>
-          <w:sz w:val="28"/>
-          <w:szCs w:val="28"/>
-        </w:rPr>
-        <w:t>ataset</w:t>
-      </w:r>
-      <w:r>
-        <w:rPr>
-          <w:rFonts w:ascii="Times New Roman" w:hAnsi="Times New Roman" w:cs="Times New Roman"/>
-          <w:sz w:val="28"/>
-          <w:szCs w:val="28"/>
-        </w:rPr>
-        <w:t xml:space="preserve"> </w:t>
-      </w:r>
-      <w:r>
-        <w:rPr>
-          <w:rFonts w:ascii="Times New Roman" w:hAnsi="Times New Roman" w:cs="Times New Roman"/>
-          <w:sz w:val="28"/>
-          <w:szCs w:val="28"/>
-        </w:rPr>
-        <w:t>C</w:t>
-      </w:r>
-      <w:r>
-        <w:rPr>
-          <w:rFonts w:ascii="Times New Roman" w:hAnsi="Times New Roman" w:cs="Times New Roman"/>
-          <w:sz w:val="28"/>
-          <w:szCs w:val="28"/>
-        </w:rPr>
-        <w:t>omplet</w:t>
-      </w:r>
-      <w:r>
-        <w:rPr>
-          <w:rFonts w:ascii="Times New Roman" w:hAnsi="Times New Roman" w:cs="Times New Roman"/>
-          <w:sz w:val="28"/>
-          <w:szCs w:val="28"/>
-        </w:rPr>
-        <w:t>o</w:t>
-      </w:r>
-    </w:p>
-    <w:p>
-      <w:pPr>
-        <w:pStyle w:val="ListParagraph"/>
+        <w:t xml:space="preserve">O </w:t>
+      </w:r>
+      <w:r>
+        <w:rPr>
+          <w:rFonts w:ascii="Times New Roman" w:hAnsi="Times New Roman" w:cs="Times New Roman"/>
+          <w:b/>
+          <w:bCs/>
+          <w:sz w:val="28"/>
+          <w:szCs w:val="28"/>
+        </w:rPr>
+        <w:t>Participant Features A</w:t>
+      </w:r>
+      <w:r>
+        <w:rPr>
+          <w:rFonts w:ascii="Times New Roman" w:hAnsi="Times New Roman" w:cs="Times New Roman"/>
+          <w:sz w:val="28"/>
+          <w:szCs w:val="28"/>
+        </w:rPr>
+        <w:t xml:space="preserve"> teve desempenho estatisticamente superior aos restantes modelos baseados em features.</w:t>
+      </w:r>
+    </w:p>
+    <w:p>
+      <w:pPr>
         <w:numPr>
           <w:ilvl w:val="0"/>
-          <w:numId w:val="22"/>
+          <w:numId w:val="27"/>
         </w:numPr>
         <w:jc w:val="both"/>
         <w:rPr>
@@ -7254,47 +7873,14 @@
           <w:sz w:val="28"/>
           <w:szCs w:val="28"/>
         </w:rPr>
-        <w:t>PCA</w:t>
-      </w:r>
-      <w:r>
-        <w:rPr>
-          <w:rFonts w:ascii="Times New Roman" w:hAnsi="Times New Roman" w:cs="Times New Roman"/>
-          <w:sz w:val="28"/>
-          <w:szCs w:val="28"/>
-        </w:rPr>
-        <w:t xml:space="preserve"> do </w:t>
-      </w:r>
-      <w:r>
-        <w:rPr>
-          <w:rFonts w:ascii="Times New Roman" w:hAnsi="Times New Roman" w:cs="Times New Roman"/>
-          <w:sz w:val="28"/>
-          <w:szCs w:val="28"/>
-        </w:rPr>
-        <w:t>D</w:t>
-      </w:r>
-      <w:r>
-        <w:rPr>
-          <w:rFonts w:ascii="Times New Roman" w:hAnsi="Times New Roman" w:cs="Times New Roman"/>
-          <w:sz w:val="28"/>
-          <w:szCs w:val="28"/>
-        </w:rPr>
-        <w:t>taset</w:t>
-      </w:r>
-      <w:r>
-        <w:rPr>
-          <w:rFonts w:ascii="Times New Roman" w:hAnsi="Times New Roman" w:cs="Times New Roman"/>
-          <w:sz w:val="28"/>
-          <w:szCs w:val="28"/>
-        </w:rPr>
-        <w:t xml:space="preserve"> </w:t>
-      </w:r>
-    </w:p>
-    <w:p>
-      <w:pPr>
-        <w:pStyle w:val="ListParagraph"/>
+        <w:t>As abordagens PCA e ReliefF mostraram diferenças significativas entre si, mas ambas ficaram abaixo do Features A.</w:t>
+      </w:r>
+    </w:p>
+    <w:p>
+      <w:pPr>
         <w:numPr>
           <w:ilvl w:val="0"/>
-          <w:numId w:val="22"/>
+          <w:numId w:val="27"/>
         </w:numPr>
         <w:jc w:val="both"/>
         <w:rPr>
@@ -7309,1094 +7895,62 @@
           <w:sz w:val="28"/>
           <w:szCs w:val="28"/>
         </w:rPr>
-        <w:t>Top 15 ReliefF</w:t>
-      </w:r>
-      <w:r>
-        <w:rPr>
-          <w:rFonts w:ascii="Times New Roman" w:hAnsi="Times New Roman" w:cs="Times New Roman"/>
-          <w:sz w:val="28"/>
-          <w:szCs w:val="28"/>
-        </w:rPr>
-        <w:t xml:space="preserve"> do Dataset</w:t>
-      </w:r>
-      <w:r>
-        <w:rPr>
-          <w:rFonts w:ascii="Times New Roman" w:hAnsi="Times New Roman" w:cs="Times New Roman"/>
-          <w:sz w:val="28"/>
-          <w:szCs w:val="28"/>
-        </w:rPr>
-        <w:t xml:space="preserve"> </w:t>
-      </w:r>
-    </w:p>
-    <w:p>
-      <w:pPr>
-        <w:jc w:val="both"/>
-        <w:rPr>
-          <w:rFonts w:ascii="Times New Roman" w:hAnsi="Times New Roman" w:cs="Times New Roman"/>
-          <w:sz w:val="28"/>
-          <w:szCs w:val="28"/>
-        </w:rPr>
-      </w:pPr>
-      <w:r>
-        <w:rPr>
-          <w:rFonts w:ascii="Times New Roman" w:hAnsi="Times New Roman" w:cs="Times New Roman"/>
-          <w:sz w:val="28"/>
-          <w:szCs w:val="28"/>
-        </w:rPr>
-        <w:t>P</w:t>
-      </w:r>
-      <w:r>
-        <w:rPr>
-          <w:rFonts w:ascii="Times New Roman" w:hAnsi="Times New Roman" w:cs="Times New Roman"/>
-          <w:sz w:val="28"/>
-          <w:szCs w:val="28"/>
-        </w:rPr>
-        <w:t>rocedeu-se à fase de avaliação dos modelos de classificação</w:t>
-      </w:r>
-      <w:r>
-        <w:rPr>
-          <w:rFonts w:ascii="Times New Roman" w:hAnsi="Times New Roman" w:cs="Times New Roman"/>
-          <w:sz w:val="28"/>
-          <w:szCs w:val="28"/>
-        </w:rPr>
-        <w:t xml:space="preserve"> de modo a </w:t>
-      </w:r>
-      <w:r>
-        <w:rPr>
-          <w:rFonts w:ascii="Times New Roman" w:hAnsi="Times New Roman" w:cs="Times New Roman"/>
-          <w:sz w:val="28"/>
-          <w:szCs w:val="28"/>
-        </w:rPr>
-        <w:t>identificar a combinação mais eficaz de representações e quantificar a capacidade de generalização do sistema a novos participantes.</w:t>
-      </w:r>
-    </w:p>
-    <w:p>
-      <w:pPr>
-        <w:jc w:val="both"/>
-        <w:rPr>
-          <w:rFonts w:ascii="Times New Roman" w:hAnsi="Times New Roman" w:cs="Times New Roman"/>
-          <w:sz w:val="28"/>
-          <w:szCs w:val="28"/>
-        </w:rPr>
-      </w:pPr>
-      <w:r>
-        <w:rPr>
-          <w:rFonts w:ascii="Times New Roman" w:hAnsi="Times New Roman" w:cs="Times New Roman"/>
-          <w:sz w:val="28"/>
-          <w:szCs w:val="28"/>
-        </w:rPr>
-        <w:t>A avaliação foi realizada em duas fases principais</w:t>
-      </w:r>
-      <w:r>
-        <w:rPr>
-          <w:rFonts w:ascii="Times New Roman" w:hAnsi="Times New Roman" w:cs="Times New Roman"/>
-          <w:sz w:val="28"/>
-          <w:szCs w:val="28"/>
-        </w:rPr>
-        <w:t xml:space="preserve">: </w:t>
-      </w:r>
-      <w:r>
-        <w:rPr>
-          <w:rFonts w:ascii="Times New Roman" w:hAnsi="Times New Roman" w:cs="Times New Roman"/>
-          <w:sz w:val="28"/>
-          <w:szCs w:val="28"/>
-        </w:rPr>
-        <w:t>tuning do hiperparâmetro k, recorrendo exclusivamente aos conjuntos de treino e validação</w:t>
-      </w:r>
-      <w:r>
-        <w:rPr>
-          <w:rFonts w:ascii="Times New Roman" w:hAnsi="Times New Roman" w:cs="Times New Roman"/>
-          <w:sz w:val="28"/>
-          <w:szCs w:val="28"/>
-        </w:rPr>
-        <w:t xml:space="preserve"> e </w:t>
-      </w:r>
-      <w:r>
-        <w:rPr>
-          <w:rFonts w:ascii="Times New Roman" w:hAnsi="Times New Roman" w:cs="Times New Roman"/>
-          <w:sz w:val="28"/>
-          <w:szCs w:val="28"/>
-        </w:rPr>
-        <w:t xml:space="preserve">avaliação </w:t>
-      </w:r>
-      <w:r>
-        <w:rPr>
-          <w:rFonts w:ascii="Times New Roman" w:hAnsi="Times New Roman" w:cs="Times New Roman"/>
-          <w:sz w:val="28"/>
-          <w:szCs w:val="28"/>
-        </w:rPr>
-        <w:lastRenderedPageBreak/>
-        <w:t>final no conjunto de teste, seguida de análise das métricas, matrizes de confusão e testes de hipóteses.</w:t>
-      </w:r>
-    </w:p>
-    <w:p>
-      <w:pPr>
-        <w:jc w:val="both"/>
-        <w:rPr>
-          <w:rFonts w:ascii="Times New Roman" w:hAnsi="Times New Roman" w:cs="Times New Roman"/>
-          <w:sz w:val="28"/>
-          <w:szCs w:val="28"/>
-        </w:rPr>
-      </w:pPr>
-      <w:r>
-        <w:rPr>
-          <w:rFonts w:ascii="Times New Roman" w:hAnsi="Times New Roman" w:cs="Times New Roman"/>
-          <w:sz w:val="28"/>
-          <w:szCs w:val="28"/>
-        </w:rPr>
-        <w:t>A análise dos resultados obtidos permitiu observar tendências consistentes entre os diferentes cenários e métodos de representação.</w:t>
-      </w:r>
-    </w:p>
-    <w:p>
-      <w:pPr>
-        <w:jc w:val="both"/>
-        <w:rPr>
-          <w:rFonts w:ascii="Times New Roman" w:hAnsi="Times New Roman" w:cs="Times New Roman"/>
-          <w:sz w:val="28"/>
-          <w:szCs w:val="28"/>
-        </w:rPr>
-      </w:pPr>
-      <w:r>
-        <w:rPr>
-          <w:rFonts w:ascii="Times New Roman" w:hAnsi="Times New Roman" w:cs="Times New Roman"/>
-          <w:sz w:val="28"/>
-          <w:szCs w:val="28"/>
-        </w:rPr>
-        <w:t>Desempenho por tipo de representação:</w:t>
-      </w:r>
-    </w:p>
-    <w:p>
-      <w:pPr>
-        <w:jc w:val="both"/>
+        <w:t>Os modelos que usavam embeddings também apresentaram diferenças estatísticas relevantes, sem alcançar o desempenho do modelo final.</w:t>
+      </w:r>
+    </w:p>
+    <w:p>
+      <w:pPr>
+        <w:jc w:val="both"/>
+        <w:rPr>
+          <w:rFonts w:ascii="Times New Roman" w:hAnsi="Times New Roman" w:cs="Times New Roman"/>
+          <w:sz w:val="28"/>
+          <w:szCs w:val="28"/>
+        </w:rPr>
+      </w:pPr>
+      <w:r>
+        <w:rPr>
+          <w:rFonts w:ascii="Times New Roman" w:hAnsi="Times New Roman" w:cs="Times New Roman"/>
+          <w:sz w:val="28"/>
+          <w:szCs w:val="28"/>
+        </w:rPr>
+        <w:t xml:space="preserve">Assim, o modelo </w:t>
+      </w:r>
+      <w:r>
         <w:rPr>
           <w:rFonts w:ascii="Times New Roman" w:hAnsi="Times New Roman" w:cs="Times New Roman"/>
           <w:b/>
           <w:bCs/>
           <w:sz w:val="28"/>
           <w:szCs w:val="28"/>
-          <w:u w:val="single"/>
-        </w:rPr>
-      </w:pPr>
-      <w:r>
-        <w:rPr>
-          <w:rFonts w:ascii="Times New Roman" w:hAnsi="Times New Roman" w:cs="Times New Roman"/>
-          <w:b/>
-          <w:bCs/>
-          <w:sz w:val="28"/>
-          <w:szCs w:val="28"/>
-          <w:u w:val="single"/>
-        </w:rPr>
-        <w:t>Embeddings</w:t>
-      </w:r>
-    </w:p>
-    <w:p>
-      <w:pPr>
-        <w:jc w:val="both"/>
-        <w:rPr>
-          <w:rFonts w:ascii="Times New Roman" w:hAnsi="Times New Roman" w:cs="Times New Roman"/>
-          <w:sz w:val="28"/>
-          <w:szCs w:val="28"/>
-        </w:rPr>
-      </w:pPr>
-      <w:r>
-        <w:rPr>
-          <w:rFonts w:ascii="Times New Roman" w:hAnsi="Times New Roman" w:cs="Times New Roman"/>
-          <w:sz w:val="28"/>
-          <w:szCs w:val="28"/>
-        </w:rPr>
-        <w:t>Apresentaram, em geral, desempenho superior ao Feature Dataset, sobretudo na estratégia participant-based.</w:t>
-      </w:r>
-    </w:p>
-    <w:p>
-      <w:pPr>
-        <w:jc w:val="both"/>
-        <w:rPr>
-          <w:rFonts w:ascii="Times New Roman" w:hAnsi="Times New Roman" w:cs="Times New Roman"/>
-          <w:sz w:val="28"/>
-          <w:szCs w:val="28"/>
-        </w:rPr>
-      </w:pPr>
-      <w:r>
-        <w:rPr>
-          <w:rFonts w:ascii="Times New Roman" w:hAnsi="Times New Roman" w:cs="Times New Roman"/>
-          <w:sz w:val="28"/>
-          <w:szCs w:val="28"/>
-        </w:rPr>
-        <w:t>Isto confirma que os embeddings do modelo Harnet5 captam padrões temporais e espaciais complexos que se generalizam melhor a novos indivíduos.</w:t>
-      </w:r>
-    </w:p>
-    <w:p>
-      <w:pPr>
-        <w:jc w:val="both"/>
-        <w:rPr>
-          <w:rFonts w:ascii="Times New Roman" w:hAnsi="Times New Roman" w:cs="Times New Roman"/>
-          <w:sz w:val="28"/>
-          <w:szCs w:val="28"/>
-        </w:rPr>
-      </w:pPr>
-    </w:p>
-    <w:p>
-      <w:pPr>
-        <w:jc w:val="both"/>
-        <w:rPr>
-          <w:rFonts w:ascii="Times New Roman" w:hAnsi="Times New Roman" w:cs="Times New Roman"/>
-          <w:b/>
-          <w:bCs/>
-          <w:sz w:val="28"/>
-          <w:szCs w:val="28"/>
-          <w:u w:val="single"/>
-        </w:rPr>
-      </w:pPr>
-      <w:r>
-        <w:rPr>
-          <w:rFonts w:ascii="Times New Roman" w:hAnsi="Times New Roman" w:cs="Times New Roman"/>
-          <w:b/>
-          <w:bCs/>
-          <w:sz w:val="28"/>
-          <w:szCs w:val="28"/>
-          <w:u w:val="single"/>
-        </w:rPr>
-        <w:t>Features completas (cenário a)</w:t>
-      </w:r>
-    </w:p>
-    <w:p>
-      <w:pPr>
-        <w:jc w:val="both"/>
-        <w:rPr>
-          <w:rFonts w:ascii="Times New Roman" w:hAnsi="Times New Roman" w:cs="Times New Roman"/>
-          <w:sz w:val="28"/>
-          <w:szCs w:val="28"/>
-        </w:rPr>
-      </w:pPr>
-      <w:r>
-        <w:rPr>
-          <w:rFonts w:ascii="Times New Roman" w:hAnsi="Times New Roman" w:cs="Times New Roman"/>
-          <w:sz w:val="28"/>
-          <w:szCs w:val="28"/>
-        </w:rPr>
-        <w:t>Obtiveram desempenho razoável na estratégia mixed, mas sofreram uma quebra significativa quando avaliadas em participantes nunca vistos, o que confirma a elevada variabilidade interindividual.</w:t>
-      </w:r>
-    </w:p>
-    <w:p>
-      <w:pPr>
-        <w:jc w:val="both"/>
-        <w:rPr>
-          <w:rFonts w:ascii="Times New Roman" w:hAnsi="Times New Roman" w:cs="Times New Roman"/>
-          <w:sz w:val="28"/>
-          <w:szCs w:val="28"/>
-        </w:rPr>
-      </w:pPr>
-    </w:p>
-    <w:p>
-      <w:pPr>
-        <w:jc w:val="both"/>
-        <w:rPr>
-          <w:rFonts w:ascii="Times New Roman" w:hAnsi="Times New Roman" w:cs="Times New Roman"/>
-          <w:b/>
-          <w:bCs/>
-          <w:sz w:val="28"/>
-          <w:szCs w:val="28"/>
-          <w:u w:val="single"/>
-        </w:rPr>
-      </w:pPr>
-      <w:r>
-        <w:rPr>
-          <w:rFonts w:ascii="Times New Roman" w:hAnsi="Times New Roman" w:cs="Times New Roman"/>
-          <w:b/>
-          <w:bCs/>
-          <w:sz w:val="28"/>
-          <w:szCs w:val="28"/>
-          <w:u w:val="single"/>
-        </w:rPr>
-        <w:t>PCA (cenário b)</w:t>
-      </w:r>
-    </w:p>
-    <w:p>
-      <w:pPr>
-        <w:jc w:val="both"/>
-        <w:rPr>
-          <w:rFonts w:ascii="Times New Roman" w:hAnsi="Times New Roman" w:cs="Times New Roman"/>
-          <w:sz w:val="28"/>
-          <w:szCs w:val="28"/>
-        </w:rPr>
-      </w:pPr>
-      <w:r>
-        <w:rPr>
-          <w:rFonts w:ascii="Times New Roman" w:hAnsi="Times New Roman" w:cs="Times New Roman"/>
-          <w:sz w:val="28"/>
-          <w:szCs w:val="28"/>
-        </w:rPr>
-        <w:t>Teve desempenho intermédio. A redução para 90% da variância (≈17 componentes) ajudou a mitigar ruído, mas a perda de interpretabilidade reduziu a discriminação entre algumas atividades, especialmente Sit e Sit and Talk.</w:t>
-      </w:r>
-    </w:p>
-    <w:p>
-      <w:pPr>
-        <w:jc w:val="both"/>
-        <w:rPr>
-          <w:rFonts w:ascii="Times New Roman" w:hAnsi="Times New Roman" w:cs="Times New Roman"/>
-          <w:sz w:val="28"/>
-          <w:szCs w:val="28"/>
-        </w:rPr>
-      </w:pPr>
-    </w:p>
-    <w:p>
-      <w:pPr>
-        <w:jc w:val="both"/>
-        <w:rPr>
-          <w:rFonts w:ascii="Times New Roman" w:hAnsi="Times New Roman" w:cs="Times New Roman"/>
-          <w:b/>
-          <w:bCs/>
-          <w:sz w:val="28"/>
-          <w:szCs w:val="28"/>
-          <w:u w:val="single"/>
-        </w:rPr>
-      </w:pPr>
-      <w:r>
-        <w:rPr>
-          <w:rFonts w:ascii="Times New Roman" w:hAnsi="Times New Roman" w:cs="Times New Roman"/>
-          <w:b/>
-          <w:bCs/>
-          <w:sz w:val="28"/>
-          <w:szCs w:val="28"/>
-          <w:u w:val="single"/>
-        </w:rPr>
-        <w:t>ReliefF (cenário c)</w:t>
-      </w:r>
-    </w:p>
-    <w:p>
-      <w:pPr>
-        <w:jc w:val="both"/>
-        <w:rPr>
-          <w:rFonts w:ascii="Times New Roman" w:hAnsi="Times New Roman" w:cs="Times New Roman"/>
-          <w:sz w:val="28"/>
-          <w:szCs w:val="28"/>
-        </w:rPr>
-      </w:pPr>
-      <w:r>
-        <w:rPr>
-          <w:rFonts w:ascii="Times New Roman" w:hAnsi="Times New Roman" w:cs="Times New Roman"/>
-          <w:sz w:val="28"/>
-          <w:szCs w:val="28"/>
-        </w:rPr>
-        <w:t>A seleção das 15 features mais discriminantes resultou em desempenho competitivo no mixed splitting, mas menos robusto no cenário participant-based, sugerindo que a seleção pode favorecer padrões específicos de certos indivíduos.</w:t>
-      </w:r>
-    </w:p>
-    <w:p>
-      <w:pPr>
-        <w:jc w:val="both"/>
-        <w:rPr>
-          <w:rFonts w:ascii="Times New Roman" w:hAnsi="Times New Roman" w:cs="Times New Roman"/>
-          <w:sz w:val="28"/>
-          <w:szCs w:val="28"/>
-        </w:rPr>
-      </w:pPr>
-    </w:p>
-    <w:p>
-      <w:pPr>
-        <w:jc w:val="both"/>
-        <w:rPr>
-          <w:rFonts w:ascii="Times New Roman" w:hAnsi="Times New Roman" w:cs="Times New Roman"/>
-          <w:b/>
-          <w:bCs/>
-          <w:sz w:val="28"/>
-          <w:szCs w:val="28"/>
-        </w:rPr>
-      </w:pPr>
-      <w:r>
-        <w:rPr>
-          <w:rFonts w:ascii="Times New Roman" w:hAnsi="Times New Roman" w:cs="Times New Roman"/>
-          <w:b/>
-          <w:bCs/>
-          <w:sz w:val="28"/>
-          <w:szCs w:val="28"/>
-        </w:rPr>
-        <w:t>Desempenho por estratégia de divisão</w:t>
-      </w:r>
-    </w:p>
-    <w:p>
-      <w:pPr>
-        <w:jc w:val="both"/>
-        <w:rPr>
-          <w:rFonts w:ascii="Times New Roman" w:hAnsi="Times New Roman" w:cs="Times New Roman"/>
-          <w:sz w:val="28"/>
-          <w:szCs w:val="28"/>
-        </w:rPr>
-      </w:pPr>
-    </w:p>
-    <w:p>
-      <w:pPr>
-        <w:jc w:val="both"/>
-        <w:rPr>
-          <w:rFonts w:ascii="Times New Roman" w:hAnsi="Times New Roman" w:cs="Times New Roman"/>
-          <w:b/>
-          <w:bCs/>
-          <w:sz w:val="28"/>
-          <w:szCs w:val="28"/>
-          <w:u w:val="single"/>
-        </w:rPr>
-      </w:pPr>
-      <w:r>
-        <w:rPr>
-          <w:rFonts w:ascii="Times New Roman" w:hAnsi="Times New Roman" w:cs="Times New Roman"/>
-          <w:b/>
-          <w:bCs/>
-          <w:sz w:val="28"/>
-          <w:szCs w:val="28"/>
-          <w:u w:val="single"/>
-        </w:rPr>
-        <w:t>Mixed splitting:</w:t>
-      </w:r>
-    </w:p>
-    <w:p>
-      <w:pPr>
-        <w:jc w:val="both"/>
-        <w:rPr>
-          <w:rFonts w:ascii="Times New Roman" w:hAnsi="Times New Roman" w:cs="Times New Roman"/>
-          <w:sz w:val="28"/>
-          <w:szCs w:val="28"/>
-        </w:rPr>
-      </w:pPr>
-      <w:r>
-        <w:rPr>
-          <w:rFonts w:ascii="Times New Roman" w:hAnsi="Times New Roman" w:cs="Times New Roman"/>
-          <w:sz w:val="28"/>
-          <w:szCs w:val="28"/>
-        </w:rPr>
-        <w:t>Todos os modelos apresentaram valores elevados de acurácia e F1, refletindo a presença de dados dos mesmos participantes nos três conjuntos.</w:t>
-      </w:r>
-    </w:p>
-    <w:p>
-      <w:pPr>
-        <w:jc w:val="both"/>
-        <w:rPr>
-          <w:rFonts w:ascii="Times New Roman" w:hAnsi="Times New Roman" w:cs="Times New Roman"/>
-          <w:sz w:val="28"/>
-          <w:szCs w:val="28"/>
-        </w:rPr>
-      </w:pPr>
-      <w:r>
-        <w:rPr>
-          <w:rFonts w:ascii="Times New Roman" w:hAnsi="Times New Roman" w:cs="Times New Roman"/>
-          <w:sz w:val="28"/>
-          <w:szCs w:val="28"/>
-        </w:rPr>
-        <w:t>→ Estes resultados, embora positivos, sobrevalorizam a performance real do modelo.</w:t>
-      </w:r>
-    </w:p>
-    <w:p>
-      <w:pPr>
-        <w:jc w:val="both"/>
-        <w:rPr>
-          <w:rFonts w:ascii="Times New Roman" w:hAnsi="Times New Roman" w:cs="Times New Roman"/>
-          <w:sz w:val="28"/>
-          <w:szCs w:val="28"/>
-        </w:rPr>
-      </w:pPr>
-    </w:p>
-    <w:p>
-      <w:pPr>
-        <w:jc w:val="both"/>
-        <w:rPr>
-          <w:rFonts w:ascii="Times New Roman" w:hAnsi="Times New Roman" w:cs="Times New Roman"/>
-          <w:b/>
-          <w:bCs/>
-          <w:sz w:val="28"/>
-          <w:szCs w:val="28"/>
-          <w:u w:val="single"/>
-        </w:rPr>
-      </w:pPr>
-      <w:r>
-        <w:rPr>
-          <w:rFonts w:ascii="Times New Roman" w:hAnsi="Times New Roman" w:cs="Times New Roman"/>
-          <w:b/>
-          <w:bCs/>
-          <w:sz w:val="28"/>
-          <w:szCs w:val="28"/>
-          <w:u w:val="single"/>
-        </w:rPr>
-        <w:t>Participant splitting:</w:t>
-      </w:r>
-    </w:p>
-    <w:p>
-      <w:pPr>
-        <w:jc w:val="both"/>
-        <w:rPr>
-          <w:rFonts w:ascii="Times New Roman" w:hAnsi="Times New Roman" w:cs="Times New Roman"/>
-          <w:sz w:val="28"/>
-          <w:szCs w:val="28"/>
-        </w:rPr>
-      </w:pPr>
-      <w:r>
-        <w:rPr>
-          <w:rFonts w:ascii="Times New Roman" w:hAnsi="Times New Roman" w:cs="Times New Roman"/>
-          <w:sz w:val="28"/>
-          <w:szCs w:val="28"/>
-        </w:rPr>
-        <w:t>Observou-se uma diminuição clara da performance em todas as abordagens, tal como esperado, devido à ausência de dados dos participantes de teste durante o treino.</w:t>
-      </w:r>
-    </w:p>
-    <w:p>
-      <w:pPr>
-        <w:jc w:val="both"/>
-        <w:rPr>
-          <w:rFonts w:ascii="Times New Roman" w:hAnsi="Times New Roman" w:cs="Times New Roman"/>
-          <w:sz w:val="28"/>
-          <w:szCs w:val="28"/>
-        </w:rPr>
-      </w:pPr>
-      <w:r>
-        <w:rPr>
-          <w:rFonts w:ascii="Times New Roman" w:hAnsi="Times New Roman" w:cs="Times New Roman"/>
-          <w:sz w:val="28"/>
-          <w:szCs w:val="28"/>
-        </w:rPr>
-        <w:t>Contudo, os embeddings mostraram uma degradação menor, demonstrando melhor capacidade de generalização para novos utilizadores.</w:t>
-      </w:r>
-    </w:p>
-    <w:p>
-      <w:pPr>
-        <w:jc w:val="both"/>
-        <w:rPr>
-          <w:rFonts w:ascii="Times New Roman" w:hAnsi="Times New Roman" w:cs="Times New Roman"/>
-          <w:sz w:val="28"/>
-          <w:szCs w:val="28"/>
-        </w:rPr>
-      </w:pPr>
-    </w:p>
-    <w:p>
-      <w:pPr>
-        <w:jc w:val="both"/>
-        <w:rPr>
-          <w:rFonts w:ascii="Times New Roman" w:hAnsi="Times New Roman" w:cs="Times New Roman"/>
-          <w:b/>
-          <w:bCs/>
-          <w:sz w:val="28"/>
-          <w:szCs w:val="28"/>
-        </w:rPr>
-      </w:pPr>
-      <w:r>
-        <w:rPr>
-          <w:rFonts w:ascii="Times New Roman" w:hAnsi="Times New Roman" w:cs="Times New Roman"/>
-          <w:b/>
-          <w:bCs/>
-          <w:sz w:val="28"/>
-          <w:szCs w:val="28"/>
-        </w:rPr>
-        <w:t>Padrões nas matrizes de confusão</w:t>
-      </w:r>
-    </w:p>
-    <w:p>
-      <w:pPr>
-        <w:jc w:val="both"/>
-        <w:rPr>
-          <w:rFonts w:ascii="Times New Roman" w:hAnsi="Times New Roman" w:cs="Times New Roman"/>
-          <w:sz w:val="28"/>
-          <w:szCs w:val="28"/>
-        </w:rPr>
-      </w:pPr>
-    </w:p>
-    <w:p>
-      <w:pPr>
-        <w:jc w:val="both"/>
-        <w:rPr>
-          <w:rFonts w:ascii="Times New Roman" w:hAnsi="Times New Roman" w:cs="Times New Roman"/>
-          <w:sz w:val="28"/>
-          <w:szCs w:val="28"/>
-        </w:rPr>
-      </w:pPr>
-      <w:r>
-        <w:rPr>
-          <w:rFonts w:ascii="Times New Roman" w:hAnsi="Times New Roman" w:cs="Times New Roman"/>
-          <w:sz w:val="28"/>
-          <w:szCs w:val="28"/>
-        </w:rPr>
-        <w:t>As matrizes de confusão revelaram que:</w:t>
-      </w:r>
-    </w:p>
-    <w:p>
-      <w:pPr>
-        <w:ind w:firstLine="708"/>
-        <w:jc w:val="both"/>
-        <w:rPr>
-          <w:rFonts w:ascii="Times New Roman" w:hAnsi="Times New Roman" w:cs="Times New Roman"/>
-          <w:sz w:val="28"/>
-          <w:szCs w:val="28"/>
-        </w:rPr>
-      </w:pPr>
-      <w:r>
-        <w:rPr>
-          <w:rFonts w:ascii="Times New Roman" w:hAnsi="Times New Roman" w:cs="Times New Roman"/>
-          <w:sz w:val="28"/>
-          <w:szCs w:val="28"/>
-        </w:rPr>
-        <w:t>•</w:t>
-      </w:r>
-      <w:r>
-        <w:rPr>
-          <w:rFonts w:ascii="Times New Roman" w:hAnsi="Times New Roman" w:cs="Times New Roman"/>
-          <w:sz w:val="28"/>
-          <w:szCs w:val="28"/>
-        </w:rPr>
-        <w:t xml:space="preserve"> </w:t>
-      </w:r>
-      <w:r>
-        <w:rPr>
-          <w:rFonts w:ascii="Times New Roman" w:hAnsi="Times New Roman" w:cs="Times New Roman"/>
-          <w:sz w:val="28"/>
-          <w:szCs w:val="28"/>
-        </w:rPr>
-        <w:t>As atividades dinâmicas (Walk e Walk and Talk) tendem a ser mais facilmente confundidas entre si, dada a semelhança dos seus padrões de movimento.</w:t>
-      </w:r>
-    </w:p>
-    <w:p>
-      <w:pPr>
-        <w:ind w:firstLine="708"/>
-        <w:jc w:val="both"/>
-        <w:rPr>
-          <w:rFonts w:ascii="Times New Roman" w:hAnsi="Times New Roman" w:cs="Times New Roman"/>
-          <w:sz w:val="28"/>
-          <w:szCs w:val="28"/>
-        </w:rPr>
-      </w:pPr>
-      <w:r>
-        <w:rPr>
-          <w:rFonts w:ascii="Times New Roman" w:hAnsi="Times New Roman" w:cs="Times New Roman"/>
-          <w:sz w:val="28"/>
-          <w:szCs w:val="28"/>
-        </w:rPr>
-        <w:t>•</w:t>
-      </w:r>
-      <w:r>
-        <w:rPr>
-          <w:rFonts w:ascii="Times New Roman" w:hAnsi="Times New Roman" w:cs="Times New Roman"/>
-          <w:sz w:val="28"/>
-          <w:szCs w:val="28"/>
-        </w:rPr>
-        <w:t xml:space="preserve"> </w:t>
-      </w:r>
-      <w:r>
-        <w:rPr>
-          <w:rFonts w:ascii="Times New Roman" w:hAnsi="Times New Roman" w:cs="Times New Roman"/>
-          <w:sz w:val="28"/>
-          <w:szCs w:val="28"/>
-        </w:rPr>
-        <w:t>Atividades estáticas (Stand, Sit) são bem discriminadas.</w:t>
-      </w:r>
-    </w:p>
-    <w:p>
-      <w:pPr>
-        <w:ind w:firstLine="708"/>
-        <w:jc w:val="both"/>
-        <w:rPr>
-          <w:rFonts w:ascii="Times New Roman" w:hAnsi="Times New Roman" w:cs="Times New Roman"/>
-          <w:sz w:val="28"/>
-          <w:szCs w:val="28"/>
-        </w:rPr>
-      </w:pPr>
-      <w:r>
-        <w:rPr>
-          <w:rFonts w:ascii="Times New Roman" w:hAnsi="Times New Roman" w:cs="Times New Roman"/>
-          <w:sz w:val="28"/>
-          <w:szCs w:val="28"/>
-        </w:rPr>
-        <w:t>•</w:t>
-      </w:r>
-      <w:r>
-        <w:rPr>
-          <w:rFonts w:ascii="Times New Roman" w:hAnsi="Times New Roman" w:cs="Times New Roman"/>
-          <w:sz w:val="28"/>
-          <w:szCs w:val="28"/>
-        </w:rPr>
-        <w:t xml:space="preserve"> </w:t>
-      </w:r>
-      <w:r>
-        <w:rPr>
-          <w:rFonts w:ascii="Times New Roman" w:hAnsi="Times New Roman" w:cs="Times New Roman"/>
-          <w:sz w:val="28"/>
-          <w:szCs w:val="28"/>
-        </w:rPr>
-        <w:t>Transições (e.g., Sit→Stand, Stand→Sit) apresentam os erros mais frequentes, o que está em linha com resultados reportados na literatura (atividades transitórias geralmente exibem padrões menos estáveis e mais variáveis).</w:t>
-      </w:r>
-    </w:p>
-    <w:p>
-      <w:pPr>
-        <w:jc w:val="both"/>
-        <w:rPr>
-          <w:rFonts w:ascii="Times New Roman" w:hAnsi="Times New Roman" w:cs="Times New Roman"/>
-          <w:sz w:val="28"/>
-          <w:szCs w:val="28"/>
-        </w:rPr>
-      </w:pPr>
-    </w:p>
-    <w:p>
-      <w:pPr>
-        <w:jc w:val="both"/>
-        <w:rPr>
-          <w:rFonts w:ascii="Times New Roman" w:hAnsi="Times New Roman" w:cs="Times New Roman"/>
-          <w:b/>
-          <w:bCs/>
-          <w:sz w:val="28"/>
-          <w:szCs w:val="28"/>
-        </w:rPr>
-      </w:pPr>
-      <w:r>
-        <w:rPr>
-          <w:rFonts w:ascii="Times New Roman" w:hAnsi="Times New Roman" w:cs="Times New Roman"/>
-          <w:b/>
-          <w:bCs/>
-          <w:sz w:val="28"/>
-          <w:szCs w:val="28"/>
-        </w:rPr>
-        <w:t>13.3. Testes de Hipóteses</w:t>
-      </w:r>
-    </w:p>
-    <w:p>
-      <w:pPr>
-        <w:jc w:val="both"/>
-        <w:rPr>
-          <w:rFonts w:ascii="Times New Roman" w:hAnsi="Times New Roman" w:cs="Times New Roman"/>
-          <w:sz w:val="28"/>
-          <w:szCs w:val="28"/>
-        </w:rPr>
-      </w:pPr>
-    </w:p>
-    <w:p>
-      <w:pPr>
-        <w:jc w:val="both"/>
-        <w:rPr>
-          <w:rFonts w:ascii="Times New Roman" w:hAnsi="Times New Roman" w:cs="Times New Roman"/>
-          <w:sz w:val="28"/>
-          <w:szCs w:val="28"/>
-        </w:rPr>
-      </w:pPr>
-      <w:r>
-        <w:rPr>
-          <w:rFonts w:ascii="Times New Roman" w:hAnsi="Times New Roman" w:cs="Times New Roman"/>
-          <w:sz w:val="28"/>
-          <w:szCs w:val="28"/>
-        </w:rPr>
-        <w:lastRenderedPageBreak/>
-        <w:t xml:space="preserve">Para avaliar se as diferenças observadas entre modelos são estatisticamente significativas, foram realizados testes estatísticos baseados em repetição das divisões do dataset, conforme indicado no enunciado. </w:t>
-      </w:r>
-    </w:p>
-    <w:p>
-      <w:pPr>
-        <w:jc w:val="both"/>
-        <w:rPr>
-          <w:rFonts w:ascii="Times New Roman" w:hAnsi="Times New Roman" w:cs="Times New Roman"/>
-          <w:sz w:val="28"/>
-          <w:szCs w:val="28"/>
-        </w:rPr>
-      </w:pPr>
-    </w:p>
-    <w:p>
-      <w:pPr>
-        <w:jc w:val="both"/>
-        <w:rPr>
-          <w:rFonts w:ascii="Times New Roman" w:hAnsi="Times New Roman" w:cs="Times New Roman"/>
-          <w:sz w:val="28"/>
-          <w:szCs w:val="28"/>
-        </w:rPr>
-      </w:pPr>
-      <w:r>
-        <w:rPr>
-          <w:rFonts w:ascii="Times New Roman" w:hAnsi="Times New Roman" w:cs="Times New Roman"/>
-          <w:sz w:val="28"/>
-          <w:szCs w:val="28"/>
-        </w:rPr>
-        <w:t>O procedimento seguido foi:</w:t>
-      </w:r>
-    </w:p>
-    <w:p>
-      <w:pPr>
-        <w:pStyle w:val="ListParagraph"/>
-        <w:numPr>
-          <w:ilvl w:val="0"/>
-          <w:numId w:val="17"/>
-        </w:numPr>
-        <w:jc w:val="both"/>
-        <w:rPr>
-          <w:rFonts w:ascii="Times New Roman" w:hAnsi="Times New Roman" w:cs="Times New Roman"/>
-          <w:sz w:val="28"/>
-          <w:szCs w:val="28"/>
-        </w:rPr>
-      </w:pPr>
-      <w:r>
-        <w:rPr>
-          <w:rFonts w:ascii="Times New Roman" w:hAnsi="Times New Roman" w:cs="Times New Roman"/>
-          <w:sz w:val="28"/>
-          <w:szCs w:val="28"/>
-        </w:rPr>
-        <w:t>Repetição do processo de treino/validação/teste múltiplas vezes (valores guardados em ficheiro de log pelo código).</w:t>
-      </w:r>
-    </w:p>
-    <w:p>
-      <w:pPr>
-        <w:pStyle w:val="ListParagraph"/>
-        <w:numPr>
-          <w:ilvl w:val="0"/>
-          <w:numId w:val="17"/>
-        </w:numPr>
-        <w:jc w:val="both"/>
-        <w:rPr>
-          <w:rFonts w:ascii="Times New Roman" w:hAnsi="Times New Roman" w:cs="Times New Roman"/>
-          <w:sz w:val="28"/>
-          <w:szCs w:val="28"/>
-        </w:rPr>
-      </w:pPr>
-      <w:r>
-        <w:rPr>
-          <w:rFonts w:ascii="Times New Roman" w:hAnsi="Times New Roman" w:cs="Times New Roman"/>
-          <w:sz w:val="28"/>
-          <w:szCs w:val="28"/>
-        </w:rPr>
-        <w:t>Comparação das distribuições de F1-score entre modelos.</w:t>
-      </w:r>
-    </w:p>
-    <w:p>
-      <w:pPr>
-        <w:jc w:val="both"/>
-        <w:rPr>
-          <w:rFonts w:ascii="Times New Roman" w:hAnsi="Times New Roman" w:cs="Times New Roman"/>
-          <w:sz w:val="28"/>
-          <w:szCs w:val="28"/>
-        </w:rPr>
-      </w:pPr>
-    </w:p>
-    <w:p>
-      <w:pPr>
-        <w:jc w:val="both"/>
-        <w:rPr>
-          <w:rFonts w:ascii="Times New Roman" w:hAnsi="Times New Roman" w:cs="Times New Roman"/>
-          <w:sz w:val="28"/>
-          <w:szCs w:val="28"/>
-        </w:rPr>
-      </w:pPr>
-      <w:r>
-        <w:rPr>
-          <w:rFonts w:ascii="Times New Roman" w:hAnsi="Times New Roman" w:cs="Times New Roman"/>
-          <w:sz w:val="28"/>
-          <w:szCs w:val="28"/>
-        </w:rPr>
-        <w:t>Dada a ausência de normalidade nas distribuições (em consonância com os resultados da Meta 1, onde todas as variáveis falharam o teste de Kolmogorov–Smirnov), aplicaram-se testes não paramétricos, concretamente:</w:t>
-      </w:r>
-    </w:p>
-    <w:p>
-      <w:pPr>
-        <w:pStyle w:val="ListParagraph"/>
-        <w:numPr>
-          <w:ilvl w:val="0"/>
-          <w:numId w:val="18"/>
-        </w:numPr>
-        <w:jc w:val="both"/>
-        <w:rPr>
-          <w:rFonts w:ascii="Times New Roman" w:hAnsi="Times New Roman" w:cs="Times New Roman"/>
-          <w:sz w:val="28"/>
-          <w:szCs w:val="28"/>
-        </w:rPr>
-      </w:pPr>
-      <w:r>
-        <w:rPr>
-          <w:rFonts w:ascii="Times New Roman" w:hAnsi="Times New Roman" w:cs="Times New Roman"/>
-          <w:sz w:val="28"/>
-          <w:szCs w:val="28"/>
-        </w:rPr>
-        <w:t>Wilcoxon signed-rank test para comparar pares de modelos quando avaliam o mesmo conjunto de teste;</w:t>
-      </w:r>
-    </w:p>
-    <w:p>
-      <w:pPr>
-        <w:pStyle w:val="ListParagraph"/>
-        <w:numPr>
-          <w:ilvl w:val="0"/>
-          <w:numId w:val="18"/>
-        </w:numPr>
-        <w:jc w:val="both"/>
-        <w:rPr>
-          <w:rFonts w:ascii="Times New Roman" w:hAnsi="Times New Roman" w:cs="Times New Roman"/>
-          <w:sz w:val="28"/>
-          <w:szCs w:val="28"/>
-        </w:rPr>
-      </w:pPr>
-      <w:r>
-        <w:rPr>
-          <w:rFonts w:ascii="Times New Roman" w:hAnsi="Times New Roman" w:cs="Times New Roman"/>
-          <w:sz w:val="28"/>
-          <w:szCs w:val="28"/>
-        </w:rPr>
-        <w:t>Mann–Whitney U test quando as distribuições não são pareadas;</w:t>
-      </w:r>
-    </w:p>
-    <w:p>
-      <w:pPr>
-        <w:pStyle w:val="ListParagraph"/>
-        <w:numPr>
-          <w:ilvl w:val="0"/>
-          <w:numId w:val="18"/>
-        </w:numPr>
-        <w:jc w:val="both"/>
-        <w:rPr>
-          <w:rFonts w:ascii="Times New Roman" w:hAnsi="Times New Roman" w:cs="Times New Roman"/>
-          <w:sz w:val="28"/>
-          <w:szCs w:val="28"/>
-        </w:rPr>
-      </w:pPr>
-      <w:r>
-        <w:rPr>
-          <w:rFonts w:ascii="Times New Roman" w:hAnsi="Times New Roman" w:cs="Times New Roman"/>
-          <w:sz w:val="28"/>
-          <w:szCs w:val="28"/>
-        </w:rPr>
-        <w:t>Nível de significância: α = 0.05.</w:t>
-      </w:r>
-    </w:p>
-    <w:p>
-      <w:pPr>
-        <w:pStyle w:val="ListParagraph"/>
-        <w:jc w:val="both"/>
-        <w:rPr>
-          <w:rFonts w:ascii="Times New Roman" w:hAnsi="Times New Roman" w:cs="Times New Roman"/>
-          <w:sz w:val="28"/>
-          <w:szCs w:val="28"/>
-        </w:rPr>
-      </w:pPr>
-    </w:p>
-    <w:p>
-      <w:pPr>
-        <w:jc w:val="both"/>
-        <w:rPr>
-          <w:rFonts w:ascii="Times New Roman" w:hAnsi="Times New Roman" w:cs="Times New Roman"/>
-          <w:b/>
-          <w:bCs/>
-          <w:sz w:val="28"/>
-          <w:szCs w:val="28"/>
-        </w:rPr>
-      </w:pPr>
-      <w:r>
-        <w:rPr>
-          <w:rFonts w:ascii="Times New Roman" w:hAnsi="Times New Roman" w:cs="Times New Roman"/>
-          <w:b/>
-          <w:bCs/>
-          <w:sz w:val="28"/>
-          <w:szCs w:val="28"/>
-        </w:rPr>
-        <w:t>Conclusões dos testes estatísticos</w:t>
-      </w:r>
-    </w:p>
-    <w:p>
-      <w:pPr>
-        <w:jc w:val="both"/>
-        <w:rPr>
-          <w:rFonts w:ascii="Times New Roman" w:hAnsi="Times New Roman" w:cs="Times New Roman"/>
-          <w:sz w:val="28"/>
-          <w:szCs w:val="28"/>
-        </w:rPr>
-      </w:pPr>
-    </w:p>
-    <w:p>
-      <w:pPr>
-        <w:jc w:val="both"/>
-        <w:rPr>
-          <w:rFonts w:ascii="Times New Roman" w:hAnsi="Times New Roman" w:cs="Times New Roman"/>
-          <w:sz w:val="28"/>
-          <w:szCs w:val="28"/>
-        </w:rPr>
-      </w:pPr>
-      <w:r>
-        <w:rPr>
-          <w:rFonts w:ascii="Times New Roman" w:hAnsi="Times New Roman" w:cs="Times New Roman"/>
-          <w:sz w:val="28"/>
-          <w:szCs w:val="28"/>
-        </w:rPr>
-        <w:t>Os resultados mostraram que:</w:t>
-      </w:r>
-    </w:p>
-    <w:p>
-      <w:pPr>
-        <w:pStyle w:val="ListParagraph"/>
-        <w:numPr>
-          <w:ilvl w:val="0"/>
-          <w:numId w:val="19"/>
-        </w:numPr>
-        <w:jc w:val="both"/>
-        <w:rPr>
-          <w:rFonts w:ascii="Times New Roman" w:hAnsi="Times New Roman" w:cs="Times New Roman"/>
-          <w:sz w:val="28"/>
-          <w:szCs w:val="28"/>
-        </w:rPr>
-      </w:pPr>
-      <w:r>
-        <w:rPr>
-          <w:rFonts w:ascii="Times New Roman" w:hAnsi="Times New Roman" w:cs="Times New Roman"/>
-          <w:sz w:val="28"/>
-          <w:szCs w:val="28"/>
-        </w:rPr>
-        <w:t>A diferença entre o melhor modelo (geralmente kNN com embeddings + PCA ou embeddings completos, dependendo da repetição) e os restantes foi estatisticamente significativa (p &lt; 0.05).</w:t>
-      </w:r>
-    </w:p>
-    <w:p>
-      <w:pPr>
-        <w:pStyle w:val="ListParagraph"/>
-        <w:numPr>
-          <w:ilvl w:val="0"/>
-          <w:numId w:val="19"/>
-        </w:numPr>
-        <w:jc w:val="both"/>
-        <w:rPr>
-          <w:rFonts w:ascii="Times New Roman" w:hAnsi="Times New Roman" w:cs="Times New Roman"/>
-          <w:sz w:val="28"/>
-          <w:szCs w:val="28"/>
-        </w:rPr>
-      </w:pPr>
-      <w:r>
-        <w:rPr>
-          <w:rFonts w:ascii="Times New Roman" w:hAnsi="Times New Roman" w:cs="Times New Roman"/>
-          <w:sz w:val="28"/>
-          <w:szCs w:val="28"/>
-        </w:rPr>
-        <w:t>As abordagens baseadas apenas em features (completas, PCA ou ReliefF) apresentaram diferenças estatísticas relevantes entre si, mas todas ficaram consistentemente abaixo da performance dos embeddings, sobretudo no cenário participant-based.</w:t>
-      </w:r>
-    </w:p>
-    <w:p>
-      <w:pPr>
-        <w:pStyle w:val="ListParagraph"/>
-        <w:numPr>
-          <w:ilvl w:val="0"/>
-          <w:numId w:val="19"/>
-        </w:numPr>
-        <w:jc w:val="both"/>
-        <w:rPr>
-          <w:rFonts w:ascii="Times New Roman" w:hAnsi="Times New Roman" w:cs="Times New Roman"/>
-          <w:sz w:val="28"/>
-          <w:szCs w:val="28"/>
-        </w:rPr>
-      </w:pPr>
-      <w:r>
-        <w:rPr>
-          <w:rFonts w:ascii="Times New Roman" w:hAnsi="Times New Roman" w:cs="Times New Roman"/>
-          <w:sz w:val="28"/>
-          <w:szCs w:val="28"/>
-        </w:rPr>
-        <w:t>A combinação embeddings + redução PCA + estratégia participant-based apresentou a melhor robustez e generalização, sendo a mais adequada para uso em contexto real.</w:t>
-      </w:r>
-    </w:p>
-    <w:p>
-      <w:pPr>
-        <w:jc w:val="both"/>
-        <w:rPr>
-          <w:rFonts w:ascii="Times New Roman" w:hAnsi="Times New Roman" w:cs="Times New Roman"/>
-          <w:sz w:val="22"/>
-          <w:szCs w:val="22"/>
-        </w:rPr>
-      </w:pPr>
-    </w:p>
-    <w:p>
-      <w:pPr>
-        <w:jc w:val="both"/>
-        <w:rPr>
-          <w:rFonts w:ascii="Times New Roman" w:hAnsi="Times New Roman" w:cs="Times New Roman"/>
-          <w:sz w:val="22"/>
-          <w:szCs w:val="22"/>
+        </w:rPr>
+        <w:t>Participant Features A (k = 19)</w:t>
+      </w:r>
+      <w:r>
+        <w:rPr>
+          <w:rFonts w:ascii="Times New Roman" w:hAnsi="Times New Roman" w:cs="Times New Roman"/>
+          <w:sz w:val="28"/>
+          <w:szCs w:val="28"/>
+        </w:rPr>
+        <w:t xml:space="preserve"> foi validado como a escolha mais robusta entre os 12 modelos estudados.</w:t>
+      </w:r>
+    </w:p>
+    <w:p>
+      <w:pPr>
+        <w:jc w:val="both"/>
+        <w:rPr>
+          <w:rFonts w:ascii="Times New Roman" w:hAnsi="Times New Roman" w:cs="Times New Roman"/>
+          <w:sz w:val="28"/>
+          <w:szCs w:val="28"/>
+        </w:rPr>
+      </w:pPr>
+    </w:p>
+    <w:p>
+      <w:pPr>
+        <w:jc w:val="both"/>
+        <w:rPr>
+          <w:rFonts w:ascii="Times New Roman" w:hAnsi="Times New Roman" w:cs="Times New Roman"/>
+          <w:sz w:val="28"/>
+          <w:szCs w:val="28"/>
         </w:rPr>
       </w:pPr>
     </w:p>
@@ -8531,7 +8085,7 @@
       <w:lvlText w:val=""/>
       <w:lvlJc w:val="left"/>
       <w:pPr>
-        <w:ind w:left="720" w:hanging="360"/>
+        <w:ind w:left="360" w:hanging="360"/>
       </w:pPr>
       <w:rPr>
         <w:rFonts w:ascii="Symbol" w:hAnsi="Symbol" w:hint="default"/>
@@ -8543,7 +8097,7 @@
       <w:lvlText w:val="o"/>
       <w:lvlJc w:val="left"/>
       <w:pPr>
-        <w:ind w:left="1440" w:hanging="360"/>
+        <w:ind w:left="1080" w:hanging="360"/>
       </w:pPr>
       <w:rPr>
         <w:rFonts w:ascii="Courier New" w:hAnsi="Courier New" w:cs="Courier New" w:hint="default"/>
@@ -8555,7 +8109,7 @@
       <w:lvlText w:val=""/>
       <w:lvlJc w:val="left"/>
       <w:pPr>
-        <w:ind w:left="2160" w:hanging="360"/>
+        <w:ind w:left="1800" w:hanging="360"/>
       </w:pPr>
       <w:rPr>
         <w:rFonts w:ascii="Wingdings" w:hAnsi="Wingdings" w:hint="default"/>
@@ -8567,7 +8121,7 @@
       <w:lvlText w:val=""/>
       <w:lvlJc w:val="left"/>
       <w:pPr>
-        <w:ind w:left="2880" w:hanging="360"/>
+        <w:ind w:left="2520" w:hanging="360"/>
       </w:pPr>
       <w:rPr>
         <w:rFonts w:ascii="Symbol" w:hAnsi="Symbol" w:hint="default"/>
@@ -8579,7 +8133,7 @@
       <w:lvlText w:val="o"/>
       <w:lvlJc w:val="left"/>
       <w:pPr>
-        <w:ind w:left="3600" w:hanging="360"/>
+        <w:ind w:left="3240" w:hanging="360"/>
       </w:pPr>
       <w:rPr>
         <w:rFonts w:ascii="Courier New" w:hAnsi="Courier New" w:cs="Courier New" w:hint="default"/>
@@ -8591,7 +8145,7 @@
       <w:lvlText w:val=""/>
       <w:lvlJc w:val="left"/>
       <w:pPr>
-        <w:ind w:left="4320" w:hanging="360"/>
+        <w:ind w:left="3960" w:hanging="360"/>
       </w:pPr>
       <w:rPr>
         <w:rFonts w:ascii="Wingdings" w:hAnsi="Wingdings" w:hint="default"/>
@@ -8603,7 +8157,7 @@
       <w:lvlText w:val=""/>
       <w:lvlJc w:val="left"/>
       <w:pPr>
-        <w:ind w:left="5040" w:hanging="360"/>
+        <w:ind w:left="4680" w:hanging="360"/>
       </w:pPr>
       <w:rPr>
         <w:rFonts w:ascii="Symbol" w:hAnsi="Symbol" w:hint="default"/>
@@ -8615,7 +8169,7 @@
       <w:lvlText w:val="o"/>
       <w:lvlJc w:val="left"/>
       <w:pPr>
-        <w:ind w:left="5760" w:hanging="360"/>
+        <w:ind w:left="5400" w:hanging="360"/>
       </w:pPr>
       <w:rPr>
         <w:rFonts w:ascii="Courier New" w:hAnsi="Courier New" w:cs="Courier New" w:hint="default"/>
@@ -8627,7 +8181,7 @@
       <w:lvlText w:val=""/>
       <w:lvlJc w:val="left"/>
       <w:pPr>
-        <w:ind w:left="6480" w:hanging="360"/>
+        <w:ind w:left="6120" w:hanging="360"/>
       </w:pPr>
       <w:rPr>
         <w:rFonts w:ascii="Wingdings" w:hAnsi="Wingdings" w:hint="default"/>
@@ -9044,6 +8598,119 @@
     </w:lvl>
   </w:abstractNum>
   <w:abstractNum w:abstractNumId="5" w15:restartNumberingAfterBreak="0">
+    <w:nsid w:val="29F027C9"/>
+    <w:multiLevelType w:val="hybridMultilevel"/>
+    <w:tmpl w:val="07CC5782"/>
+    <w:lvl w:ilvl="0" w:tplc="08160001">
+      <w:start w:val="1"/>
+      <w:numFmt w:val="bullet"/>
+      <w:lvlText w:val=""/>
+      <w:lvlJc w:val="left"/>
+      <w:pPr>
+        <w:ind w:left="720" w:hanging="360"/>
+      </w:pPr>
+      <w:rPr>
+        <w:rFonts w:ascii="Symbol" w:hAnsi="Symbol" w:hint="default"/>
+      </w:rPr>
+    </w:lvl>
+    <w:lvl w:ilvl="1" w:tplc="08160003" w:tentative="1">
+      <w:start w:val="1"/>
+      <w:numFmt w:val="bullet"/>
+      <w:lvlText w:val="o"/>
+      <w:lvlJc w:val="left"/>
+      <w:pPr>
+        <w:ind w:left="1440" w:hanging="360"/>
+      </w:pPr>
+      <w:rPr>
+        <w:rFonts w:ascii="Courier New" w:hAnsi="Courier New" w:cs="Courier New" w:hint="default"/>
+      </w:rPr>
+    </w:lvl>
+    <w:lvl w:ilvl="2" w:tplc="08160005" w:tentative="1">
+      <w:start w:val="1"/>
+      <w:numFmt w:val="bullet"/>
+      <w:lvlText w:val=""/>
+      <w:lvlJc w:val="left"/>
+      <w:pPr>
+        <w:ind w:left="2160" w:hanging="360"/>
+      </w:pPr>
+      <w:rPr>
+        <w:rFonts w:ascii="Wingdings" w:hAnsi="Wingdings" w:hint="default"/>
+      </w:rPr>
+    </w:lvl>
+    <w:lvl w:ilvl="3" w:tplc="08160001" w:tentative="1">
+      <w:start w:val="1"/>
+      <w:numFmt w:val="bullet"/>
+      <w:lvlText w:val=""/>
+      <w:lvlJc w:val="left"/>
+      <w:pPr>
+        <w:ind w:left="2880" w:hanging="360"/>
+      </w:pPr>
+      <w:rPr>
+        <w:rFonts w:ascii="Symbol" w:hAnsi="Symbol" w:hint="default"/>
+      </w:rPr>
+    </w:lvl>
+    <w:lvl w:ilvl="4" w:tplc="08160003" w:tentative="1">
+      <w:start w:val="1"/>
+      <w:numFmt w:val="bullet"/>
+      <w:lvlText w:val="o"/>
+      <w:lvlJc w:val="left"/>
+      <w:pPr>
+        <w:ind w:left="3600" w:hanging="360"/>
+      </w:pPr>
+      <w:rPr>
+        <w:rFonts w:ascii="Courier New" w:hAnsi="Courier New" w:cs="Courier New" w:hint="default"/>
+      </w:rPr>
+    </w:lvl>
+    <w:lvl w:ilvl="5" w:tplc="08160005" w:tentative="1">
+      <w:start w:val="1"/>
+      <w:numFmt w:val="bullet"/>
+      <w:lvlText w:val=""/>
+      <w:lvlJc w:val="left"/>
+      <w:pPr>
+        <w:ind w:left="4320" w:hanging="360"/>
+      </w:pPr>
+      <w:rPr>
+        <w:rFonts w:ascii="Wingdings" w:hAnsi="Wingdings" w:hint="default"/>
+      </w:rPr>
+    </w:lvl>
+    <w:lvl w:ilvl="6" w:tplc="08160001" w:tentative="1">
+      <w:start w:val="1"/>
+      <w:numFmt w:val="bullet"/>
+      <w:lvlText w:val=""/>
+      <w:lvlJc w:val="left"/>
+      <w:pPr>
+        <w:ind w:left="5040" w:hanging="360"/>
+      </w:pPr>
+      <w:rPr>
+        <w:rFonts w:ascii="Symbol" w:hAnsi="Symbol" w:hint="default"/>
+      </w:rPr>
+    </w:lvl>
+    <w:lvl w:ilvl="7" w:tplc="08160003" w:tentative="1">
+      <w:start w:val="1"/>
+      <w:numFmt w:val="bullet"/>
+      <w:lvlText w:val="o"/>
+      <w:lvlJc w:val="left"/>
+      <w:pPr>
+        <w:ind w:left="5760" w:hanging="360"/>
+      </w:pPr>
+      <w:rPr>
+        <w:rFonts w:ascii="Courier New" w:hAnsi="Courier New" w:cs="Courier New" w:hint="default"/>
+      </w:rPr>
+    </w:lvl>
+    <w:lvl w:ilvl="8" w:tplc="08160005" w:tentative="1">
+      <w:start w:val="1"/>
+      <w:numFmt w:val="bullet"/>
+      <w:lvlText w:val=""/>
+      <w:lvlJc w:val="left"/>
+      <w:pPr>
+        <w:ind w:left="6480" w:hanging="360"/>
+      </w:pPr>
+      <w:rPr>
+        <w:rFonts w:ascii="Wingdings" w:hAnsi="Wingdings" w:hint="default"/>
+      </w:rPr>
+    </w:lvl>
+  </w:abstractNum>
+  <w:abstractNum w:abstractNumId="6" w15:restartNumberingAfterBreak="0">
     <w:nsid w:val="2C1B4393"/>
     <w:multiLevelType w:val="hybridMultilevel"/>
     <w:tmpl w:val="E33C0BA4"/>
@@ -9132,7 +8799,7 @@
       </w:pPr>
     </w:lvl>
   </w:abstractNum>
-  <w:abstractNum w:abstractNumId="6" w15:restartNumberingAfterBreak="0">
+  <w:abstractNum w:abstractNumId="7" w15:restartNumberingAfterBreak="0">
     <w:nsid w:val="33810E93"/>
     <w:multiLevelType w:val="hybridMultilevel"/>
     <w:tmpl w:val="91B2CAF4"/>
@@ -9245,7 +8912,7 @@
       </w:rPr>
     </w:lvl>
   </w:abstractNum>
-  <w:abstractNum w:abstractNumId="7" w15:restartNumberingAfterBreak="0">
+  <w:abstractNum w:abstractNumId="8" w15:restartNumberingAfterBreak="0">
     <w:nsid w:val="3478293C"/>
     <w:multiLevelType w:val="hybridMultilevel"/>
     <w:tmpl w:val="5DFE3BE8"/>
@@ -9358,7 +9025,120 @@
       </w:rPr>
     </w:lvl>
   </w:abstractNum>
-  <w:abstractNum w:abstractNumId="8" w15:restartNumberingAfterBreak="0">
+  <w:abstractNum w:abstractNumId="9" w15:restartNumberingAfterBreak="0">
+    <w:nsid w:val="376719D9"/>
+    <w:multiLevelType w:val="hybridMultilevel"/>
+    <w:tmpl w:val="A50EB424"/>
+    <w:lvl w:ilvl="0" w:tplc="08160001">
+      <w:start w:val="1"/>
+      <w:numFmt w:val="bullet"/>
+      <w:lvlText w:val=""/>
+      <w:lvlJc w:val="left"/>
+      <w:pPr>
+        <w:ind w:left="360" w:hanging="360"/>
+      </w:pPr>
+      <w:rPr>
+        <w:rFonts w:ascii="Symbol" w:hAnsi="Symbol" w:hint="default"/>
+      </w:rPr>
+    </w:lvl>
+    <w:lvl w:ilvl="1" w:tplc="08160003" w:tentative="1">
+      <w:start w:val="1"/>
+      <w:numFmt w:val="bullet"/>
+      <w:lvlText w:val="o"/>
+      <w:lvlJc w:val="left"/>
+      <w:pPr>
+        <w:ind w:left="1080" w:hanging="360"/>
+      </w:pPr>
+      <w:rPr>
+        <w:rFonts w:ascii="Courier New" w:hAnsi="Courier New" w:cs="Courier New" w:hint="default"/>
+      </w:rPr>
+    </w:lvl>
+    <w:lvl w:ilvl="2" w:tplc="08160005" w:tentative="1">
+      <w:start w:val="1"/>
+      <w:numFmt w:val="bullet"/>
+      <w:lvlText w:val=""/>
+      <w:lvlJc w:val="left"/>
+      <w:pPr>
+        <w:ind w:left="1800" w:hanging="360"/>
+      </w:pPr>
+      <w:rPr>
+        <w:rFonts w:ascii="Wingdings" w:hAnsi="Wingdings" w:hint="default"/>
+      </w:rPr>
+    </w:lvl>
+    <w:lvl w:ilvl="3" w:tplc="08160001" w:tentative="1">
+      <w:start w:val="1"/>
+      <w:numFmt w:val="bullet"/>
+      <w:lvlText w:val=""/>
+      <w:lvlJc w:val="left"/>
+      <w:pPr>
+        <w:ind w:left="2520" w:hanging="360"/>
+      </w:pPr>
+      <w:rPr>
+        <w:rFonts w:ascii="Symbol" w:hAnsi="Symbol" w:hint="default"/>
+      </w:rPr>
+    </w:lvl>
+    <w:lvl w:ilvl="4" w:tplc="08160003" w:tentative="1">
+      <w:start w:val="1"/>
+      <w:numFmt w:val="bullet"/>
+      <w:lvlText w:val="o"/>
+      <w:lvlJc w:val="left"/>
+      <w:pPr>
+        <w:ind w:left="3240" w:hanging="360"/>
+      </w:pPr>
+      <w:rPr>
+        <w:rFonts w:ascii="Courier New" w:hAnsi="Courier New" w:cs="Courier New" w:hint="default"/>
+      </w:rPr>
+    </w:lvl>
+    <w:lvl w:ilvl="5" w:tplc="08160005" w:tentative="1">
+      <w:start w:val="1"/>
+      <w:numFmt w:val="bullet"/>
+      <w:lvlText w:val=""/>
+      <w:lvlJc w:val="left"/>
+      <w:pPr>
+        <w:ind w:left="3960" w:hanging="360"/>
+      </w:pPr>
+      <w:rPr>
+        <w:rFonts w:ascii="Wingdings" w:hAnsi="Wingdings" w:hint="default"/>
+      </w:rPr>
+    </w:lvl>
+    <w:lvl w:ilvl="6" w:tplc="08160001" w:tentative="1">
+      <w:start w:val="1"/>
+      <w:numFmt w:val="bullet"/>
+      <w:lvlText w:val=""/>
+      <w:lvlJc w:val="left"/>
+      <w:pPr>
+        <w:ind w:left="4680" w:hanging="360"/>
+      </w:pPr>
+      <w:rPr>
+        <w:rFonts w:ascii="Symbol" w:hAnsi="Symbol" w:hint="default"/>
+      </w:rPr>
+    </w:lvl>
+    <w:lvl w:ilvl="7" w:tplc="08160003" w:tentative="1">
+      <w:start w:val="1"/>
+      <w:numFmt w:val="bullet"/>
+      <w:lvlText w:val="o"/>
+      <w:lvlJc w:val="left"/>
+      <w:pPr>
+        <w:ind w:left="5400" w:hanging="360"/>
+      </w:pPr>
+      <w:rPr>
+        <w:rFonts w:ascii="Courier New" w:hAnsi="Courier New" w:cs="Courier New" w:hint="default"/>
+      </w:rPr>
+    </w:lvl>
+    <w:lvl w:ilvl="8" w:tplc="08160005" w:tentative="1">
+      <w:start w:val="1"/>
+      <w:numFmt w:val="bullet"/>
+      <w:lvlText w:val=""/>
+      <w:lvlJc w:val="left"/>
+      <w:pPr>
+        <w:ind w:left="6120" w:hanging="360"/>
+      </w:pPr>
+      <w:rPr>
+        <w:rFonts w:ascii="Wingdings" w:hAnsi="Wingdings" w:hint="default"/>
+      </w:rPr>
+    </w:lvl>
+  </w:abstractNum>
+  <w:abstractNum w:abstractNumId="10" w15:restartNumberingAfterBreak="0">
     <w:nsid w:val="3F6428FC"/>
     <w:multiLevelType w:val="hybridMultilevel"/>
     <w:tmpl w:val="10A61F96"/>
@@ -9368,7 +9148,7 @@
       <w:lvlText w:val=""/>
       <w:lvlJc w:val="left"/>
       <w:pPr>
-        <w:ind w:left="720" w:hanging="360"/>
+        <w:ind w:left="360" w:hanging="360"/>
       </w:pPr>
       <w:rPr>
         <w:rFonts w:ascii="Symbol" w:hAnsi="Symbol" w:hint="default"/>
@@ -9471,7 +9251,7 @@
       </w:rPr>
     </w:lvl>
   </w:abstractNum>
-  <w:abstractNum w:abstractNumId="9" w15:restartNumberingAfterBreak="0">
+  <w:abstractNum w:abstractNumId="11" w15:restartNumberingAfterBreak="0">
     <w:nsid w:val="400F4531"/>
     <w:multiLevelType w:val="hybridMultilevel"/>
     <w:tmpl w:val="198A17FC"/>
@@ -9584,7 +9364,7 @@
       </w:rPr>
     </w:lvl>
   </w:abstractNum>
-  <w:abstractNum w:abstractNumId="10" w15:restartNumberingAfterBreak="0">
+  <w:abstractNum w:abstractNumId="12" w15:restartNumberingAfterBreak="0">
     <w:nsid w:val="427F3D8B"/>
     <w:multiLevelType w:val="hybridMultilevel"/>
     <w:tmpl w:val="65585B98"/>
@@ -9697,7 +9477,7 @@
       </w:rPr>
     </w:lvl>
   </w:abstractNum>
-  <w:abstractNum w:abstractNumId="11" w15:restartNumberingAfterBreak="0">
+  <w:abstractNum w:abstractNumId="13" w15:restartNumberingAfterBreak="0">
     <w:nsid w:val="42AA3487"/>
     <w:multiLevelType w:val="hybridMultilevel"/>
     <w:tmpl w:val="9C3086C8"/>
@@ -9810,7 +9590,157 @@
       </w:rPr>
     </w:lvl>
   </w:abstractNum>
-  <w:abstractNum w:abstractNumId="12" w15:restartNumberingAfterBreak="0">
+  <w:abstractNum w:abstractNumId="14" w15:restartNumberingAfterBreak="0">
+    <w:nsid w:val="43D63852"/>
+    <w:multiLevelType w:val="multilevel"/>
+    <w:tmpl w:val="810E80DE"/>
+    <w:lvl w:ilvl="0">
+      <w:start w:val="1"/>
+      <w:numFmt w:val="bullet"/>
+      <w:lvlText w:val=""/>
+      <w:lvlJc w:val="left"/>
+      <w:pPr>
+        <w:tabs>
+          <w:tab w:val="num" w:pos="360"/>
+        </w:tabs>
+        <w:ind w:left="360" w:hanging="360"/>
+      </w:pPr>
+      <w:rPr>
+        <w:rFonts w:ascii="Symbol" w:hAnsi="Symbol" w:hint="default"/>
+        <w:sz w:val="28"/>
+        <w:szCs w:val="40"/>
+      </w:rPr>
+    </w:lvl>
+    <w:lvl w:ilvl="1" w:tentative="1">
+      <w:start w:val="1"/>
+      <w:numFmt w:val="bullet"/>
+      <w:lvlText w:val="o"/>
+      <w:lvlJc w:val="left"/>
+      <w:pPr>
+        <w:tabs>
+          <w:tab w:val="num" w:pos="1080"/>
+        </w:tabs>
+        <w:ind w:left="1080" w:hanging="360"/>
+      </w:pPr>
+      <w:rPr>
+        <w:rFonts w:ascii="Courier New" w:hAnsi="Courier New" w:hint="default"/>
+        <w:sz w:val="20"/>
+      </w:rPr>
+    </w:lvl>
+    <w:lvl w:ilvl="2" w:tentative="1">
+      <w:start w:val="1"/>
+      <w:numFmt w:val="bullet"/>
+      <w:lvlText w:val=""/>
+      <w:lvlJc w:val="left"/>
+      <w:pPr>
+        <w:tabs>
+          <w:tab w:val="num" w:pos="1800"/>
+        </w:tabs>
+        <w:ind w:left="1800" w:hanging="360"/>
+      </w:pPr>
+      <w:rPr>
+        <w:rFonts w:ascii="Wingdings" w:hAnsi="Wingdings" w:hint="default"/>
+        <w:sz w:val="20"/>
+      </w:rPr>
+    </w:lvl>
+    <w:lvl w:ilvl="3" w:tentative="1">
+      <w:start w:val="1"/>
+      <w:numFmt w:val="bullet"/>
+      <w:lvlText w:val=""/>
+      <w:lvlJc w:val="left"/>
+      <w:pPr>
+        <w:tabs>
+          <w:tab w:val="num" w:pos="2520"/>
+        </w:tabs>
+        <w:ind w:left="2520" w:hanging="360"/>
+      </w:pPr>
+      <w:rPr>
+        <w:rFonts w:ascii="Wingdings" w:hAnsi="Wingdings" w:hint="default"/>
+        <w:sz w:val="20"/>
+      </w:rPr>
+    </w:lvl>
+    <w:lvl w:ilvl="4" w:tentative="1">
+      <w:start w:val="1"/>
+      <w:numFmt w:val="bullet"/>
+      <w:lvlText w:val=""/>
+      <w:lvlJc w:val="left"/>
+      <w:pPr>
+        <w:tabs>
+          <w:tab w:val="num" w:pos="3240"/>
+        </w:tabs>
+        <w:ind w:left="3240" w:hanging="360"/>
+      </w:pPr>
+      <w:rPr>
+        <w:rFonts w:ascii="Wingdings" w:hAnsi="Wingdings" w:hint="default"/>
+        <w:sz w:val="20"/>
+      </w:rPr>
+    </w:lvl>
+    <w:lvl w:ilvl="5" w:tentative="1">
+      <w:start w:val="1"/>
+      <w:numFmt w:val="bullet"/>
+      <w:lvlText w:val=""/>
+      <w:lvlJc w:val="left"/>
+      <w:pPr>
+        <w:tabs>
+          <w:tab w:val="num" w:pos="3960"/>
+        </w:tabs>
+        <w:ind w:left="3960" w:hanging="360"/>
+      </w:pPr>
+      <w:rPr>
+        <w:rFonts w:ascii="Wingdings" w:hAnsi="Wingdings" w:hint="default"/>
+        <w:sz w:val="20"/>
+      </w:rPr>
+    </w:lvl>
+    <w:lvl w:ilvl="6" w:tentative="1">
+      <w:start w:val="1"/>
+      <w:numFmt w:val="bullet"/>
+      <w:lvlText w:val=""/>
+      <w:lvlJc w:val="left"/>
+      <w:pPr>
+        <w:tabs>
+          <w:tab w:val="num" w:pos="4680"/>
+        </w:tabs>
+        <w:ind w:left="4680" w:hanging="360"/>
+      </w:pPr>
+      <w:rPr>
+        <w:rFonts w:ascii="Wingdings" w:hAnsi="Wingdings" w:hint="default"/>
+        <w:sz w:val="20"/>
+      </w:rPr>
+    </w:lvl>
+    <w:lvl w:ilvl="7" w:tentative="1">
+      <w:start w:val="1"/>
+      <w:numFmt w:val="bullet"/>
+      <w:lvlText w:val=""/>
+      <w:lvlJc w:val="left"/>
+      <w:pPr>
+        <w:tabs>
+          <w:tab w:val="num" w:pos="5400"/>
+        </w:tabs>
+        <w:ind w:left="5400" w:hanging="360"/>
+      </w:pPr>
+      <w:rPr>
+        <w:rFonts w:ascii="Wingdings" w:hAnsi="Wingdings" w:hint="default"/>
+        <w:sz w:val="20"/>
+      </w:rPr>
+    </w:lvl>
+    <w:lvl w:ilvl="8" w:tentative="1">
+      <w:start w:val="1"/>
+      <w:numFmt w:val="bullet"/>
+      <w:lvlText w:val=""/>
+      <w:lvlJc w:val="left"/>
+      <w:pPr>
+        <w:tabs>
+          <w:tab w:val="num" w:pos="6120"/>
+        </w:tabs>
+        <w:ind w:left="6120" w:hanging="360"/>
+      </w:pPr>
+      <w:rPr>
+        <w:rFonts w:ascii="Wingdings" w:hAnsi="Wingdings" w:hint="default"/>
+        <w:sz w:val="20"/>
+      </w:rPr>
+    </w:lvl>
+  </w:abstractNum>
+  <w:abstractNum w:abstractNumId="15" w15:restartNumberingAfterBreak="0">
     <w:nsid w:val="46894AF7"/>
     <w:multiLevelType w:val="hybridMultilevel"/>
     <w:tmpl w:val="651EB728"/>
@@ -9896,7 +9826,7 @@
       </w:pPr>
     </w:lvl>
   </w:abstractNum>
-  <w:abstractNum w:abstractNumId="13" w15:restartNumberingAfterBreak="0">
+  <w:abstractNum w:abstractNumId="16" w15:restartNumberingAfterBreak="0">
     <w:nsid w:val="4B2E7B56"/>
     <w:multiLevelType w:val="hybridMultilevel"/>
     <w:tmpl w:val="8362C5E2"/>
@@ -10009,7 +9939,7 @@
       </w:rPr>
     </w:lvl>
   </w:abstractNum>
-  <w:abstractNum w:abstractNumId="14" w15:restartNumberingAfterBreak="0">
+  <w:abstractNum w:abstractNumId="17" w15:restartNumberingAfterBreak="0">
     <w:nsid w:val="52B10757"/>
     <w:multiLevelType w:val="hybridMultilevel"/>
     <w:tmpl w:val="91A8646E"/>
@@ -10095,7 +10025,7 @@
       </w:pPr>
     </w:lvl>
   </w:abstractNum>
-  <w:abstractNum w:abstractNumId="15" w15:restartNumberingAfterBreak="0">
+  <w:abstractNum w:abstractNumId="18" w15:restartNumberingAfterBreak="0">
     <w:nsid w:val="57DA04DE"/>
     <w:multiLevelType w:val="hybridMultilevel"/>
     <w:tmpl w:val="B1465044"/>
@@ -10105,7 +10035,7 @@
       <w:lvlText w:val=""/>
       <w:lvlJc w:val="left"/>
       <w:pPr>
-        <w:ind w:left="720" w:hanging="360"/>
+        <w:ind w:left="360" w:hanging="360"/>
       </w:pPr>
       <w:rPr>
         <w:rFonts w:ascii="Symbol" w:hAnsi="Symbol" w:hint="default"/>
@@ -10117,7 +10047,7 @@
       <w:lvlText w:val="o"/>
       <w:lvlJc w:val="left"/>
       <w:pPr>
-        <w:ind w:left="1440" w:hanging="360"/>
+        <w:ind w:left="1080" w:hanging="360"/>
       </w:pPr>
       <w:rPr>
         <w:rFonts w:ascii="Courier New" w:hAnsi="Courier New" w:cs="Courier New" w:hint="default"/>
@@ -10129,7 +10059,7 @@
       <w:lvlText w:val=""/>
       <w:lvlJc w:val="left"/>
       <w:pPr>
-        <w:ind w:left="2160" w:hanging="360"/>
+        <w:ind w:left="1800" w:hanging="360"/>
       </w:pPr>
       <w:rPr>
         <w:rFonts w:ascii="Wingdings" w:hAnsi="Wingdings" w:hint="default"/>
@@ -10141,7 +10071,7 @@
       <w:lvlText w:val=""/>
       <w:lvlJc w:val="left"/>
       <w:pPr>
-        <w:ind w:left="2880" w:hanging="360"/>
+        <w:ind w:left="2520" w:hanging="360"/>
       </w:pPr>
       <w:rPr>
         <w:rFonts w:ascii="Symbol" w:hAnsi="Symbol" w:hint="default"/>
@@ -10153,7 +10083,7 @@
       <w:lvlText w:val="o"/>
       <w:lvlJc w:val="left"/>
       <w:pPr>
-        <w:ind w:left="3600" w:hanging="360"/>
+        <w:ind w:left="3240" w:hanging="360"/>
       </w:pPr>
       <w:rPr>
         <w:rFonts w:ascii="Courier New" w:hAnsi="Courier New" w:cs="Courier New" w:hint="default"/>
@@ -10165,7 +10095,7 @@
       <w:lvlText w:val=""/>
       <w:lvlJc w:val="left"/>
       <w:pPr>
-        <w:ind w:left="4320" w:hanging="360"/>
+        <w:ind w:left="3960" w:hanging="360"/>
       </w:pPr>
       <w:rPr>
         <w:rFonts w:ascii="Wingdings" w:hAnsi="Wingdings" w:hint="default"/>
@@ -10177,7 +10107,7 @@
       <w:lvlText w:val=""/>
       <w:lvlJc w:val="left"/>
       <w:pPr>
-        <w:ind w:left="5040" w:hanging="360"/>
+        <w:ind w:left="4680" w:hanging="360"/>
       </w:pPr>
       <w:rPr>
         <w:rFonts w:ascii="Symbol" w:hAnsi="Symbol" w:hint="default"/>
@@ -10189,7 +10119,7 @@
       <w:lvlText w:val="o"/>
       <w:lvlJc w:val="left"/>
       <w:pPr>
-        <w:ind w:left="5760" w:hanging="360"/>
+        <w:ind w:left="5400" w:hanging="360"/>
       </w:pPr>
       <w:rPr>
         <w:rFonts w:ascii="Courier New" w:hAnsi="Courier New" w:cs="Courier New" w:hint="default"/>
@@ -10201,14 +10131,14 @@
       <w:lvlText w:val=""/>
       <w:lvlJc w:val="left"/>
       <w:pPr>
-        <w:ind w:left="6480" w:hanging="360"/>
+        <w:ind w:left="6120" w:hanging="360"/>
       </w:pPr>
       <w:rPr>
         <w:rFonts w:ascii="Wingdings" w:hAnsi="Wingdings" w:hint="default"/>
       </w:rPr>
     </w:lvl>
   </w:abstractNum>
-  <w:abstractNum w:abstractNumId="16" w15:restartNumberingAfterBreak="0">
+  <w:abstractNum w:abstractNumId="19" w15:restartNumberingAfterBreak="0">
     <w:nsid w:val="584A594F"/>
     <w:multiLevelType w:val="hybridMultilevel"/>
     <w:tmpl w:val="FAFC2176"/>
@@ -10321,7 +10251,7 @@
       </w:rPr>
     </w:lvl>
   </w:abstractNum>
-  <w:abstractNum w:abstractNumId="17" w15:restartNumberingAfterBreak="0">
+  <w:abstractNum w:abstractNumId="20" w15:restartNumberingAfterBreak="0">
     <w:nsid w:val="5930402C"/>
     <w:multiLevelType w:val="hybridMultilevel"/>
     <w:tmpl w:val="AA24C002"/>
@@ -10434,7 +10364,7 @@
       </w:rPr>
     </w:lvl>
   </w:abstractNum>
-  <w:abstractNum w:abstractNumId="18" w15:restartNumberingAfterBreak="0">
+  <w:abstractNum w:abstractNumId="21" w15:restartNumberingAfterBreak="0">
     <w:nsid w:val="5A4B2F2A"/>
     <w:multiLevelType w:val="hybridMultilevel"/>
     <w:tmpl w:val="1FF2DBA6"/>
@@ -10547,7 +10477,7 @@
       </w:rPr>
     </w:lvl>
   </w:abstractNum>
-  <w:abstractNum w:abstractNumId="19" w15:restartNumberingAfterBreak="0">
+  <w:abstractNum w:abstractNumId="22" w15:restartNumberingAfterBreak="0">
     <w:nsid w:val="681F337D"/>
     <w:multiLevelType w:val="hybridMultilevel"/>
     <w:tmpl w:val="F222A744"/>
@@ -10660,7 +10590,7 @@
       </w:rPr>
     </w:lvl>
   </w:abstractNum>
-  <w:abstractNum w:abstractNumId="20" w15:restartNumberingAfterBreak="0">
+  <w:abstractNum w:abstractNumId="23" w15:restartNumberingAfterBreak="0">
     <w:nsid w:val="6A173FAA"/>
     <w:multiLevelType w:val="hybridMultilevel"/>
     <w:tmpl w:val="2E74A378"/>
@@ -10670,7 +10600,7 @@
       <w:lvlText w:val=""/>
       <w:lvlJc w:val="left"/>
       <w:pPr>
-        <w:ind w:left="720" w:hanging="360"/>
+        <w:ind w:left="360" w:hanging="360"/>
       </w:pPr>
       <w:rPr>
         <w:rFonts w:ascii="Symbol" w:hAnsi="Symbol" w:hint="default"/>
@@ -10682,7 +10612,7 @@
       <w:lvlText w:val="%2."/>
       <w:lvlJc w:val="left"/>
       <w:pPr>
-        <w:ind w:left="1440" w:hanging="360"/>
+        <w:ind w:left="1080" w:hanging="360"/>
       </w:pPr>
     </w:lvl>
     <w:lvl w:ilvl="2" w:tplc="0816001B" w:tentative="1">
@@ -10691,7 +10621,7 @@
       <w:lvlText w:val="%3."/>
       <w:lvlJc w:val="right"/>
       <w:pPr>
-        <w:ind w:left="2160" w:hanging="180"/>
+        <w:ind w:left="1800" w:hanging="180"/>
       </w:pPr>
     </w:lvl>
     <w:lvl w:ilvl="3" w:tplc="0816000F" w:tentative="1">
@@ -10700,7 +10630,7 @@
       <w:lvlText w:val="%4."/>
       <w:lvlJc w:val="left"/>
       <w:pPr>
-        <w:ind w:left="2880" w:hanging="360"/>
+        <w:ind w:left="2520" w:hanging="360"/>
       </w:pPr>
     </w:lvl>
     <w:lvl w:ilvl="4" w:tplc="08160019" w:tentative="1">
@@ -10709,7 +10639,7 @@
       <w:lvlText w:val="%5."/>
       <w:lvlJc w:val="left"/>
       <w:pPr>
-        <w:ind w:left="3600" w:hanging="360"/>
+        <w:ind w:left="3240" w:hanging="360"/>
       </w:pPr>
     </w:lvl>
     <w:lvl w:ilvl="5" w:tplc="0816001B" w:tentative="1">
@@ -10718,7 +10648,7 @@
       <w:lvlText w:val="%6."/>
       <w:lvlJc w:val="right"/>
       <w:pPr>
-        <w:ind w:left="4320" w:hanging="180"/>
+        <w:ind w:left="3960" w:hanging="180"/>
       </w:pPr>
     </w:lvl>
     <w:lvl w:ilvl="6" w:tplc="0816000F" w:tentative="1">
@@ -10727,7 +10657,7 @@
       <w:lvlText w:val="%7."/>
       <w:lvlJc w:val="left"/>
       <w:pPr>
-        <w:ind w:left="5040" w:hanging="360"/>
+        <w:ind w:left="4680" w:hanging="360"/>
       </w:pPr>
     </w:lvl>
     <w:lvl w:ilvl="7" w:tplc="08160019" w:tentative="1">
@@ -10736,7 +10666,7 @@
       <w:lvlText w:val="%8."/>
       <w:lvlJc w:val="left"/>
       <w:pPr>
-        <w:ind w:left="5760" w:hanging="360"/>
+        <w:ind w:left="5400" w:hanging="360"/>
       </w:pPr>
     </w:lvl>
     <w:lvl w:ilvl="8" w:tplc="0816001B" w:tentative="1">
@@ -10745,11 +10675,309 @@
       <w:lvlText w:val="%9."/>
       <w:lvlJc w:val="right"/>
       <w:pPr>
-        <w:ind w:left="6480" w:hanging="180"/>
+        <w:ind w:left="6120" w:hanging="180"/>
       </w:pPr>
     </w:lvl>
   </w:abstractNum>
-  <w:abstractNum w:abstractNumId="21" w15:restartNumberingAfterBreak="0">
+  <w:abstractNum w:abstractNumId="24" w15:restartNumberingAfterBreak="0">
+    <w:nsid w:val="72987BD2"/>
+    <w:multiLevelType w:val="multilevel"/>
+    <w:tmpl w:val="0616E2CE"/>
+    <w:lvl w:ilvl="0">
+      <w:start w:val="1"/>
+      <w:numFmt w:val="bullet"/>
+      <w:lvlText w:val=""/>
+      <w:lvlJc w:val="left"/>
+      <w:pPr>
+        <w:tabs>
+          <w:tab w:val="num" w:pos="720"/>
+        </w:tabs>
+        <w:ind w:left="720" w:hanging="360"/>
+      </w:pPr>
+      <w:rPr>
+        <w:rFonts w:ascii="Symbol" w:hAnsi="Symbol" w:hint="default"/>
+        <w:sz w:val="20"/>
+      </w:rPr>
+    </w:lvl>
+    <w:lvl w:ilvl="1" w:tentative="1">
+      <w:start w:val="1"/>
+      <w:numFmt w:val="bullet"/>
+      <w:lvlText w:val="o"/>
+      <w:lvlJc w:val="left"/>
+      <w:pPr>
+        <w:tabs>
+          <w:tab w:val="num" w:pos="1440"/>
+        </w:tabs>
+        <w:ind w:left="1440" w:hanging="360"/>
+      </w:pPr>
+      <w:rPr>
+        <w:rFonts w:ascii="Courier New" w:hAnsi="Courier New" w:hint="default"/>
+        <w:sz w:val="20"/>
+      </w:rPr>
+    </w:lvl>
+    <w:lvl w:ilvl="2" w:tentative="1">
+      <w:start w:val="1"/>
+      <w:numFmt w:val="bullet"/>
+      <w:lvlText w:val=""/>
+      <w:lvlJc w:val="left"/>
+      <w:pPr>
+        <w:tabs>
+          <w:tab w:val="num" w:pos="2160"/>
+        </w:tabs>
+        <w:ind w:left="2160" w:hanging="360"/>
+      </w:pPr>
+      <w:rPr>
+        <w:rFonts w:ascii="Wingdings" w:hAnsi="Wingdings" w:hint="default"/>
+        <w:sz w:val="20"/>
+      </w:rPr>
+    </w:lvl>
+    <w:lvl w:ilvl="3" w:tentative="1">
+      <w:start w:val="1"/>
+      <w:numFmt w:val="bullet"/>
+      <w:lvlText w:val=""/>
+      <w:lvlJc w:val="left"/>
+      <w:pPr>
+        <w:tabs>
+          <w:tab w:val="num" w:pos="2880"/>
+        </w:tabs>
+        <w:ind w:left="2880" w:hanging="360"/>
+      </w:pPr>
+      <w:rPr>
+        <w:rFonts w:ascii="Wingdings" w:hAnsi="Wingdings" w:hint="default"/>
+        <w:sz w:val="20"/>
+      </w:rPr>
+    </w:lvl>
+    <w:lvl w:ilvl="4" w:tentative="1">
+      <w:start w:val="1"/>
+      <w:numFmt w:val="bullet"/>
+      <w:lvlText w:val=""/>
+      <w:lvlJc w:val="left"/>
+      <w:pPr>
+        <w:tabs>
+          <w:tab w:val="num" w:pos="3600"/>
+        </w:tabs>
+        <w:ind w:left="3600" w:hanging="360"/>
+      </w:pPr>
+      <w:rPr>
+        <w:rFonts w:ascii="Wingdings" w:hAnsi="Wingdings" w:hint="default"/>
+        <w:sz w:val="20"/>
+      </w:rPr>
+    </w:lvl>
+    <w:lvl w:ilvl="5" w:tentative="1">
+      <w:start w:val="1"/>
+      <w:numFmt w:val="bullet"/>
+      <w:lvlText w:val=""/>
+      <w:lvlJc w:val="left"/>
+      <w:pPr>
+        <w:tabs>
+          <w:tab w:val="num" w:pos="4320"/>
+        </w:tabs>
+        <w:ind w:left="4320" w:hanging="360"/>
+      </w:pPr>
+      <w:rPr>
+        <w:rFonts w:ascii="Wingdings" w:hAnsi="Wingdings" w:hint="default"/>
+        <w:sz w:val="20"/>
+      </w:rPr>
+    </w:lvl>
+    <w:lvl w:ilvl="6" w:tentative="1">
+      <w:start w:val="1"/>
+      <w:numFmt w:val="bullet"/>
+      <w:lvlText w:val=""/>
+      <w:lvlJc w:val="left"/>
+      <w:pPr>
+        <w:tabs>
+          <w:tab w:val="num" w:pos="5040"/>
+        </w:tabs>
+        <w:ind w:left="5040" w:hanging="360"/>
+      </w:pPr>
+      <w:rPr>
+        <w:rFonts w:ascii="Wingdings" w:hAnsi="Wingdings" w:hint="default"/>
+        <w:sz w:val="20"/>
+      </w:rPr>
+    </w:lvl>
+    <w:lvl w:ilvl="7" w:tentative="1">
+      <w:start w:val="1"/>
+      <w:numFmt w:val="bullet"/>
+      <w:lvlText w:val=""/>
+      <w:lvlJc w:val="left"/>
+      <w:pPr>
+        <w:tabs>
+          <w:tab w:val="num" w:pos="5760"/>
+        </w:tabs>
+        <w:ind w:left="5760" w:hanging="360"/>
+      </w:pPr>
+      <w:rPr>
+        <w:rFonts w:ascii="Wingdings" w:hAnsi="Wingdings" w:hint="default"/>
+        <w:sz w:val="20"/>
+      </w:rPr>
+    </w:lvl>
+    <w:lvl w:ilvl="8" w:tentative="1">
+      <w:start w:val="1"/>
+      <w:numFmt w:val="bullet"/>
+      <w:lvlText w:val=""/>
+      <w:lvlJc w:val="left"/>
+      <w:pPr>
+        <w:tabs>
+          <w:tab w:val="num" w:pos="6480"/>
+        </w:tabs>
+        <w:ind w:left="6480" w:hanging="360"/>
+      </w:pPr>
+      <w:rPr>
+        <w:rFonts w:ascii="Wingdings" w:hAnsi="Wingdings" w:hint="default"/>
+        <w:sz w:val="20"/>
+      </w:rPr>
+    </w:lvl>
+  </w:abstractNum>
+  <w:abstractNum w:abstractNumId="25" w15:restartNumberingAfterBreak="0">
+    <w:nsid w:val="78912538"/>
+    <w:multiLevelType w:val="multilevel"/>
+    <w:tmpl w:val="15BE714C"/>
+    <w:lvl w:ilvl="0">
+      <w:start w:val="1"/>
+      <w:numFmt w:val="bullet"/>
+      <w:lvlText w:val=""/>
+      <w:lvlJc w:val="left"/>
+      <w:pPr>
+        <w:tabs>
+          <w:tab w:val="num" w:pos="720"/>
+        </w:tabs>
+        <w:ind w:left="720" w:hanging="360"/>
+      </w:pPr>
+      <w:rPr>
+        <w:rFonts w:ascii="Symbol" w:hAnsi="Symbol" w:hint="default"/>
+        <w:sz w:val="20"/>
+      </w:rPr>
+    </w:lvl>
+    <w:lvl w:ilvl="1" w:tentative="1">
+      <w:start w:val="1"/>
+      <w:numFmt w:val="bullet"/>
+      <w:lvlText w:val="o"/>
+      <w:lvlJc w:val="left"/>
+      <w:pPr>
+        <w:tabs>
+          <w:tab w:val="num" w:pos="1440"/>
+        </w:tabs>
+        <w:ind w:left="1440" w:hanging="360"/>
+      </w:pPr>
+      <w:rPr>
+        <w:rFonts w:ascii="Courier New" w:hAnsi="Courier New" w:hint="default"/>
+        <w:sz w:val="20"/>
+      </w:rPr>
+    </w:lvl>
+    <w:lvl w:ilvl="2" w:tentative="1">
+      <w:start w:val="1"/>
+      <w:numFmt w:val="bullet"/>
+      <w:lvlText w:val=""/>
+      <w:lvlJc w:val="left"/>
+      <w:pPr>
+        <w:tabs>
+          <w:tab w:val="num" w:pos="2160"/>
+        </w:tabs>
+        <w:ind w:left="2160" w:hanging="360"/>
+      </w:pPr>
+      <w:rPr>
+        <w:rFonts w:ascii="Wingdings" w:hAnsi="Wingdings" w:hint="default"/>
+        <w:sz w:val="20"/>
+      </w:rPr>
+    </w:lvl>
+    <w:lvl w:ilvl="3" w:tentative="1">
+      <w:start w:val="1"/>
+      <w:numFmt w:val="bullet"/>
+      <w:lvlText w:val=""/>
+      <w:lvlJc w:val="left"/>
+      <w:pPr>
+        <w:tabs>
+          <w:tab w:val="num" w:pos="2880"/>
+        </w:tabs>
+        <w:ind w:left="2880" w:hanging="360"/>
+      </w:pPr>
+      <w:rPr>
+        <w:rFonts w:ascii="Wingdings" w:hAnsi="Wingdings" w:hint="default"/>
+        <w:sz w:val="20"/>
+      </w:rPr>
+    </w:lvl>
+    <w:lvl w:ilvl="4" w:tentative="1">
+      <w:start w:val="1"/>
+      <w:numFmt w:val="bullet"/>
+      <w:lvlText w:val=""/>
+      <w:lvlJc w:val="left"/>
+      <w:pPr>
+        <w:tabs>
+          <w:tab w:val="num" w:pos="3600"/>
+        </w:tabs>
+        <w:ind w:left="3600" w:hanging="360"/>
+      </w:pPr>
+      <w:rPr>
+        <w:rFonts w:ascii="Wingdings" w:hAnsi="Wingdings" w:hint="default"/>
+        <w:sz w:val="20"/>
+      </w:rPr>
+    </w:lvl>
+    <w:lvl w:ilvl="5" w:tentative="1">
+      <w:start w:val="1"/>
+      <w:numFmt w:val="bullet"/>
+      <w:lvlText w:val=""/>
+      <w:lvlJc w:val="left"/>
+      <w:pPr>
+        <w:tabs>
+          <w:tab w:val="num" w:pos="4320"/>
+        </w:tabs>
+        <w:ind w:left="4320" w:hanging="360"/>
+      </w:pPr>
+      <w:rPr>
+        <w:rFonts w:ascii="Wingdings" w:hAnsi="Wingdings" w:hint="default"/>
+        <w:sz w:val="20"/>
+      </w:rPr>
+    </w:lvl>
+    <w:lvl w:ilvl="6" w:tentative="1">
+      <w:start w:val="1"/>
+      <w:numFmt w:val="bullet"/>
+      <w:lvlText w:val=""/>
+      <w:lvlJc w:val="left"/>
+      <w:pPr>
+        <w:tabs>
+          <w:tab w:val="num" w:pos="5040"/>
+        </w:tabs>
+        <w:ind w:left="5040" w:hanging="360"/>
+      </w:pPr>
+      <w:rPr>
+        <w:rFonts w:ascii="Wingdings" w:hAnsi="Wingdings" w:hint="default"/>
+        <w:sz w:val="20"/>
+      </w:rPr>
+    </w:lvl>
+    <w:lvl w:ilvl="7" w:tentative="1">
+      <w:start w:val="1"/>
+      <w:numFmt w:val="bullet"/>
+      <w:lvlText w:val=""/>
+      <w:lvlJc w:val="left"/>
+      <w:pPr>
+        <w:tabs>
+          <w:tab w:val="num" w:pos="5760"/>
+        </w:tabs>
+        <w:ind w:left="5760" w:hanging="360"/>
+      </w:pPr>
+      <w:rPr>
+        <w:rFonts w:ascii="Wingdings" w:hAnsi="Wingdings" w:hint="default"/>
+        <w:sz w:val="20"/>
+      </w:rPr>
+    </w:lvl>
+    <w:lvl w:ilvl="8" w:tentative="1">
+      <w:start w:val="1"/>
+      <w:numFmt w:val="bullet"/>
+      <w:lvlText w:val=""/>
+      <w:lvlJc w:val="left"/>
+      <w:pPr>
+        <w:tabs>
+          <w:tab w:val="num" w:pos="6480"/>
+        </w:tabs>
+        <w:ind w:left="6480" w:hanging="360"/>
+      </w:pPr>
+      <w:rPr>
+        <w:rFonts w:ascii="Wingdings" w:hAnsi="Wingdings" w:hint="default"/>
+        <w:sz w:val="20"/>
+      </w:rPr>
+    </w:lvl>
+  </w:abstractNum>
+  <w:abstractNum w:abstractNumId="26" w15:restartNumberingAfterBreak="0">
     <w:nsid w:val="7F385848"/>
     <w:multiLevelType w:val="hybridMultilevel"/>
     <w:tmpl w:val="202EFB88"/>
@@ -10869,64 +11097,79 @@
     <w:abstractNumId w:val="1"/>
   </w:num>
   <w:num w:numId="3" w16cid:durableId="1038775398">
-    <w:abstractNumId w:val="8"/>
+    <w:abstractNumId w:val="10"/>
   </w:num>
   <w:num w:numId="4" w16cid:durableId="1306157261">
-    <w:abstractNumId w:val="15"/>
+    <w:abstractNumId w:val="18"/>
   </w:num>
   <w:num w:numId="5" w16cid:durableId="204876954">
-    <w:abstractNumId w:val="9"/>
+    <w:abstractNumId w:val="11"/>
   </w:num>
   <w:num w:numId="6" w16cid:durableId="1387609337">
-    <w:abstractNumId w:val="18"/>
+    <w:abstractNumId w:val="21"/>
   </w:num>
   <w:num w:numId="7" w16cid:durableId="1520662450">
-    <w:abstractNumId w:val="11"/>
+    <w:abstractNumId w:val="13"/>
   </w:num>
   <w:num w:numId="8" w16cid:durableId="2030787739">
-    <w:abstractNumId w:val="21"/>
+    <w:abstractNumId w:val="26"/>
   </w:num>
   <w:num w:numId="9" w16cid:durableId="1608923020">
-    <w:abstractNumId w:val="7"/>
+    <w:abstractNumId w:val="8"/>
   </w:num>
   <w:num w:numId="10" w16cid:durableId="716243087">
     <w:abstractNumId w:val="2"/>
   </w:num>
   <w:num w:numId="11" w16cid:durableId="1950744818">
-    <w:abstractNumId w:val="13"/>
+    <w:abstractNumId w:val="16"/>
   </w:num>
   <w:num w:numId="12" w16cid:durableId="118761796">
-    <w:abstractNumId w:val="14"/>
+    <w:abstractNumId w:val="17"/>
   </w:num>
   <w:num w:numId="13" w16cid:durableId="221870540">
+    <w:abstractNumId w:val="22"/>
+  </w:num>
+  <w:num w:numId="14" w16cid:durableId="1808358934">
+    <w:abstractNumId w:val="15"/>
+  </w:num>
+  <w:num w:numId="15" w16cid:durableId="540869126">
     <w:abstractNumId w:val="19"/>
   </w:num>
-  <w:num w:numId="14" w16cid:durableId="1808358934">
-    <w:abstractNumId w:val="12"/>
-  </w:num>
-  <w:num w:numId="15" w16cid:durableId="540869126">
-    <w:abstractNumId w:val="16"/>
-  </w:num>
   <w:num w:numId="16" w16cid:durableId="2099911266">
-    <w:abstractNumId w:val="17"/>
+    <w:abstractNumId w:val="20"/>
   </w:num>
   <w:num w:numId="17" w16cid:durableId="435254902">
-    <w:abstractNumId w:val="5"/>
+    <w:abstractNumId w:val="6"/>
   </w:num>
   <w:num w:numId="18" w16cid:durableId="774324135">
-    <w:abstractNumId w:val="6"/>
+    <w:abstractNumId w:val="7"/>
   </w:num>
   <w:num w:numId="19" w16cid:durableId="839082599">
-    <w:abstractNumId w:val="10"/>
+    <w:abstractNumId w:val="12"/>
   </w:num>
   <w:num w:numId="20" w16cid:durableId="1439135841">
     <w:abstractNumId w:val="0"/>
   </w:num>
   <w:num w:numId="21" w16cid:durableId="871964029">
-    <w:abstractNumId w:val="20"/>
+    <w:abstractNumId w:val="23"/>
   </w:num>
   <w:num w:numId="22" w16cid:durableId="621494039">
     <w:abstractNumId w:val="4"/>
+  </w:num>
+  <w:num w:numId="23" w16cid:durableId="548685746">
+    <w:abstractNumId w:val="9"/>
+  </w:num>
+  <w:num w:numId="24" w16cid:durableId="1374041071">
+    <w:abstractNumId w:val="14"/>
+  </w:num>
+  <w:num w:numId="25" w16cid:durableId="852840977">
+    <w:abstractNumId w:val="5"/>
+  </w:num>
+  <w:num w:numId="26" w16cid:durableId="1092582431">
+    <w:abstractNumId w:val="24"/>
+  </w:num>
+  <w:num w:numId="27" w16cid:durableId="2087191153">
+    <w:abstractNumId w:val="25"/>
   </w:num>
   <w:numIdMacAtCleanup w:val="19"/>
 </w:numbering>
@@ -11536,7 +11779,6 @@
   <w:style w:type="character" w:default="1" w:styleId="DefaultParagraphFont">
     <w:name w:val="Default Paragraph Font"/>
     <w:uiPriority w:val="1"/>
-    <w:semiHidden/>
     <w:unhideWhenUsed/>
   </w:style>
   <w:style w:type="table" w:default="1" w:styleId="TableNormal">

</xml_diff>

<commit_message>
Refactor evaluation report: remove outdated comments on model performance and dataset comparison for clarity and focus on hypothesis testing.
</commit_message>
<xml_diff>
--- a/docs/Relatório.docx
+++ b/docs/Relatório.docx
@@ -1071,7 +1071,196 @@
           <w:sz w:val="40"/>
           <w:szCs w:val="40"/>
         </w:rPr>
-        <w:t>Seleção de Features: Fisher Score e Relief</w:t>
+        <w:t>Seleção de Features</w:t>
+      </w:r>
+    </w:p>
+    <w:p>
+      <w:pPr>
+        <w:pStyle w:val="ListParagraph"/>
+        <w:numPr>
+          <w:ilvl w:val="0"/>
+          <w:numId w:val="1"/>
+        </w:numPr>
+        <w:jc w:val="both"/>
+        <w:rPr>
+          <w:rFonts w:ascii="Times New Roman" w:hAnsi="Times New Roman" w:cs="Times New Roman"/>
+          <w:b/>
+          <w:bCs/>
+          <w:sz w:val="40"/>
+          <w:szCs w:val="40"/>
+        </w:rPr>
+      </w:pPr>
+      <w:r>
+        <w:rPr>
+          <w:rFonts w:ascii="Times New Roman" w:hAnsi="Times New Roman" w:cs="Times New Roman"/>
+          <w:b/>
+          <w:bCs/>
+          <w:sz w:val="40"/>
+          <w:szCs w:val="40"/>
+        </w:rPr>
+        <w:t>Aumentação dos Dados</w:t>
+      </w:r>
+    </w:p>
+    <w:p>
+      <w:pPr>
+        <w:pStyle w:val="ListParagraph"/>
+        <w:numPr>
+          <w:ilvl w:val="0"/>
+          <w:numId w:val="1"/>
+        </w:numPr>
+        <w:jc w:val="both"/>
+        <w:rPr>
+          <w:rFonts w:ascii="Times New Roman" w:hAnsi="Times New Roman" w:cs="Times New Roman"/>
+          <w:b/>
+          <w:bCs/>
+          <w:sz w:val="40"/>
+          <w:szCs w:val="40"/>
+        </w:rPr>
+      </w:pPr>
+      <w:r>
+        <w:rPr>
+          <w:rFonts w:ascii="Times New Roman" w:hAnsi="Times New Roman" w:cs="Times New Roman"/>
+          <w:b/>
+          <w:bCs/>
+          <w:sz w:val="40"/>
+          <w:szCs w:val="40"/>
+        </w:rPr>
+        <w:t>Embeddings</w:t>
+      </w:r>
+    </w:p>
+    <w:p>
+      <w:pPr>
+        <w:pStyle w:val="ListParagraph"/>
+        <w:numPr>
+          <w:ilvl w:val="0"/>
+          <w:numId w:val="1"/>
+        </w:numPr>
+        <w:jc w:val="both"/>
+        <w:rPr>
+          <w:rFonts w:ascii="Times New Roman" w:hAnsi="Times New Roman" w:cs="Times New Roman"/>
+          <w:b/>
+          <w:bCs/>
+          <w:sz w:val="40"/>
+          <w:szCs w:val="40"/>
+        </w:rPr>
+      </w:pPr>
+      <w:r>
+        <w:rPr>
+          <w:rFonts w:ascii="Times New Roman" w:hAnsi="Times New Roman" w:cs="Times New Roman"/>
+          <w:b/>
+          <w:bCs/>
+          <w:sz w:val="40"/>
+          <w:szCs w:val="40"/>
+        </w:rPr>
+        <w:t>Estratégias de Divisão de Dados</w:t>
+      </w:r>
+    </w:p>
+    <w:p>
+      <w:pPr>
+        <w:pStyle w:val="ListParagraph"/>
+        <w:numPr>
+          <w:ilvl w:val="0"/>
+          <w:numId w:val="1"/>
+        </w:numPr>
+        <w:jc w:val="both"/>
+        <w:rPr>
+          <w:rFonts w:ascii="Times New Roman" w:hAnsi="Times New Roman" w:cs="Times New Roman"/>
+          <w:b/>
+          <w:bCs/>
+          <w:sz w:val="40"/>
+          <w:szCs w:val="40"/>
+        </w:rPr>
+      </w:pPr>
+      <w:r>
+        <w:rPr>
+          <w:rFonts w:ascii="Times New Roman" w:hAnsi="Times New Roman" w:cs="Times New Roman"/>
+          <w:b/>
+          <w:bCs/>
+          <w:sz w:val="40"/>
+          <w:szCs w:val="40"/>
+        </w:rPr>
+        <w:t>Classificador k-Nearest Neighbors</w:t>
+      </w:r>
+    </w:p>
+    <w:p>
+      <w:pPr>
+        <w:pStyle w:val="ListParagraph"/>
+        <w:numPr>
+          <w:ilvl w:val="0"/>
+          <w:numId w:val="1"/>
+        </w:numPr>
+        <w:jc w:val="both"/>
+        <w:rPr>
+          <w:rFonts w:ascii="Times New Roman" w:hAnsi="Times New Roman" w:cs="Times New Roman"/>
+          <w:b/>
+          <w:bCs/>
+          <w:sz w:val="40"/>
+          <w:szCs w:val="40"/>
+        </w:rPr>
+      </w:pPr>
+      <w:r>
+        <w:rPr>
+          <w:rFonts w:ascii="Times New Roman" w:hAnsi="Times New Roman" w:cs="Times New Roman"/>
+          <w:b/>
+          <w:bCs/>
+          <w:sz w:val="40"/>
+          <w:szCs w:val="40"/>
+        </w:rPr>
+        <w:t>Avaliação dos Modelos</w:t>
+      </w:r>
+    </w:p>
+    <w:p>
+      <w:pPr>
+        <w:pStyle w:val="ListParagraph"/>
+        <w:numPr>
+          <w:ilvl w:val="0"/>
+          <w:numId w:val="1"/>
+        </w:numPr>
+        <w:jc w:val="both"/>
+        <w:rPr>
+          <w:rFonts w:ascii="Times New Roman" w:hAnsi="Times New Roman" w:cs="Times New Roman"/>
+          <w:b/>
+          <w:bCs/>
+          <w:sz w:val="40"/>
+          <w:szCs w:val="40"/>
+        </w:rPr>
+      </w:pPr>
+      <w:r>
+        <w:rPr>
+          <w:rFonts w:ascii="Times New Roman" w:hAnsi="Times New Roman" w:cs="Times New Roman"/>
+          <w:b/>
+          <w:bCs/>
+          <w:sz w:val="40"/>
+          <w:szCs w:val="40"/>
+        </w:rPr>
+        <w:t>Testes de Hipótese</w:t>
+      </w:r>
+    </w:p>
+    <w:p>
+      <w:pPr>
+        <w:pStyle w:val="ListParagraph"/>
+        <w:numPr>
+          <w:ilvl w:val="0"/>
+          <w:numId w:val="1"/>
+        </w:numPr>
+        <w:jc w:val="both"/>
+        <w:rPr>
+          <w:rFonts w:ascii="Times New Roman" w:hAnsi="Times New Roman" w:cs="Times New Roman"/>
+          <w:b/>
+          <w:bCs/>
+          <w:sz w:val="40"/>
+          <w:szCs w:val="40"/>
+        </w:rPr>
+      </w:pPr>
+      <w:r>
+        <w:rPr>
+          <w:rFonts w:ascii="Times New Roman" w:hAnsi="Times New Roman" w:cs="Times New Roman"/>
+          <w:b/>
+          <w:bCs/>
+          <w:sz w:val="40"/>
+          <w:szCs w:val="40"/>
+        </w:rPr>
+        <w:t>Modelo de Implantação</w:t>
       </w:r>
     </w:p>
     <w:p>
@@ -1083,56 +1272,6 @@
           <w:rFonts w:ascii="Times New Roman" w:hAnsi="Times New Roman" w:cs="Times New Roman"/>
           <w:sz w:val="36"/>
           <w:szCs w:val="36"/>
-        </w:rPr>
-      </w:pPr>
-    </w:p>
-    <w:p>
-      <w:pPr>
-        <w:jc w:val="both"/>
-        <w:rPr>
-          <w:rFonts w:ascii="Times New Roman" w:hAnsi="Times New Roman" w:cs="Times New Roman"/>
-          <w:sz w:val="44"/>
-          <w:szCs w:val="44"/>
-        </w:rPr>
-      </w:pPr>
-    </w:p>
-    <w:p>
-      <w:pPr>
-        <w:jc w:val="both"/>
-        <w:rPr>
-          <w:rFonts w:ascii="Times New Roman" w:hAnsi="Times New Roman" w:cs="Times New Roman"/>
-          <w:sz w:val="44"/>
-          <w:szCs w:val="44"/>
-        </w:rPr>
-      </w:pPr>
-    </w:p>
-    <w:p>
-      <w:pPr>
-        <w:jc w:val="both"/>
-        <w:rPr>
-          <w:rFonts w:ascii="Times New Roman" w:hAnsi="Times New Roman" w:cs="Times New Roman"/>
-          <w:sz w:val="44"/>
-          <w:szCs w:val="44"/>
-        </w:rPr>
-      </w:pPr>
-    </w:p>
-    <w:p>
-      <w:pPr>
-        <w:jc w:val="both"/>
-        <w:rPr>
-          <w:rFonts w:ascii="Times New Roman" w:hAnsi="Times New Roman" w:cs="Times New Roman"/>
-          <w:sz w:val="44"/>
-          <w:szCs w:val="44"/>
-        </w:rPr>
-      </w:pPr>
-    </w:p>
-    <w:p>
-      <w:pPr>
-        <w:jc w:val="both"/>
-        <w:rPr>
-          <w:rFonts w:ascii="Times New Roman" w:hAnsi="Times New Roman" w:cs="Times New Roman"/>
-          <w:sz w:val="44"/>
-          <w:szCs w:val="44"/>
         </w:rPr>
       </w:pPr>
     </w:p>
@@ -1251,6 +1390,16 @@
         </w:rPr>
         <w:t>O reconhecimento de atividades humanas é relevante em áreas como monitorização clínica, desporto, reabilitação e interação humano-máquina. A eficácia da classificação depende fortemente das etapas de pré-processamento e engenharia de características. Assim, o foco desta meta é a preparação dos dados e a análise aprofundada da estrutura dos sinais, antes da fase de classificação.</w:t>
       </w:r>
+    </w:p>
+    <w:p>
+      <w:pPr>
+        <w:jc w:val="both"/>
+        <w:rPr>
+          <w:rFonts w:ascii="Times New Roman" w:hAnsi="Times New Roman" w:cs="Times New Roman"/>
+          <w:sz w:val="28"/>
+          <w:szCs w:val="28"/>
+        </w:rPr>
+      </w:pPr>
     </w:p>
     <w:p>
       <w:pPr>
@@ -1891,21 +2040,13 @@
     </w:p>
     <w:p>
       <w:pPr>
-        <w:jc w:val="center"/>
-        <w:rPr>
-          <w:rFonts w:ascii="Times New Roman" w:hAnsi="Times New Roman" w:cs="Times New Roman"/>
-          <w:sz w:val="28"/>
-          <w:szCs w:val="28"/>
-        </w:rPr>
-      </w:pPr>
-      <w:r>
-        <w:rPr>
-          <w:rFonts w:ascii="Times New Roman" w:hAnsi="Times New Roman" w:cs="Times New Roman"/>
-          <w:sz w:val="28"/>
-          <w:szCs w:val="28"/>
-        </w:rPr>
-        <w:t>partX/partXdevY.csv</w:t>
-      </w:r>
+        <w:jc w:val="both"/>
+        <w:rPr>
+          <w:rFonts w:ascii="Times New Roman" w:hAnsi="Times New Roman" w:cs="Times New Roman"/>
+          <w:sz w:val="28"/>
+          <w:szCs w:val="28"/>
+        </w:rPr>
+      </w:pPr>
     </w:p>
     <w:p>
       <w:pPr>
@@ -1924,14 +2065,6 @@
       <w:r>
         <w:rPr>
           <w:rFonts w:ascii="Times New Roman" w:hAnsi="Times New Roman" w:cs="Times New Roman"/>
-          <w:sz w:val="28"/>
-          <w:szCs w:val="28"/>
-        </w:rPr>
-        <w:t xml:space="preserve"> </w:t>
-      </w:r>
-      <w:r>
-        <w:rPr>
-          <w:rFonts w:ascii="Times New Roman" w:hAnsi="Times New Roman" w:cs="Times New Roman"/>
           <w:b/>
           <w:bCs/>
           <w:sz w:val="48"/>
@@ -2021,6 +2154,36 @@
         </w:rPr>
         <w:t>.</w:t>
       </w:r>
+    </w:p>
+    <w:p>
+      <w:pPr>
+        <w:jc w:val="both"/>
+        <w:rPr>
+          <w:rFonts w:ascii="Times New Roman" w:hAnsi="Times New Roman" w:cs="Times New Roman"/>
+          <w:sz w:val="28"/>
+          <w:szCs w:val="28"/>
+        </w:rPr>
+      </w:pPr>
+    </w:p>
+    <w:p>
+      <w:pPr>
+        <w:jc w:val="both"/>
+        <w:rPr>
+          <w:rFonts w:ascii="Times New Roman" w:hAnsi="Times New Roman" w:cs="Times New Roman"/>
+          <w:sz w:val="28"/>
+          <w:szCs w:val="28"/>
+        </w:rPr>
+      </w:pPr>
+    </w:p>
+    <w:p>
+      <w:pPr>
+        <w:jc w:val="both"/>
+        <w:rPr>
+          <w:rFonts w:ascii="Times New Roman" w:hAnsi="Times New Roman" w:cs="Times New Roman"/>
+          <w:sz w:val="28"/>
+          <w:szCs w:val="28"/>
+        </w:rPr>
+      </w:pPr>
     </w:p>
     <w:p>
       <w:pPr>
@@ -2044,6 +2207,7 @@
           <w:sz w:val="48"/>
           <w:szCs w:val="48"/>
         </w:rPr>
+        <w:lastRenderedPageBreak/>
         <w:t xml:space="preserve"> Deteç</w:t>
       </w:r>
       <w:r>
@@ -2121,7 +2285,6 @@
           <w:sz w:val="28"/>
           <w:szCs w:val="28"/>
         </w:rPr>
-        <w:lastRenderedPageBreak/>
         <w:t>IQR</w:t>
       </w:r>
       <w:r>
@@ -2472,144 +2635,6 @@
       <w:r>
         <w:rPr>
           <w:rFonts w:ascii="Times New Roman" w:hAnsi="Times New Roman" w:cs="Times New Roman"/>
-          <w:sz w:val="28"/>
-          <w:szCs w:val="28"/>
-        </w:rPr>
-        <w:t>O</w:t>
-      </w:r>
-      <w:r>
-        <w:rPr>
-          <w:rFonts w:ascii="Times New Roman" w:hAnsi="Times New Roman" w:cs="Times New Roman"/>
-          <w:sz w:val="28"/>
-          <w:szCs w:val="28"/>
-        </w:rPr>
-        <w:t xml:space="preserve"> método IQR, representado através dos boxplots, permitiu observar a dispersão dos dados e identificar outliers de forma robusta. Mostrou distribuições concentradas em atividades estáticas e maior variabilidade nas dinâmicas e de transição.</w:t>
-      </w:r>
-      <w:r>
-        <w:rPr>
-          <w:rFonts w:ascii="Times New Roman" w:hAnsi="Times New Roman" w:cs="Times New Roman"/>
-          <w:sz w:val="28"/>
-          <w:szCs w:val="28"/>
-        </w:rPr>
-        <w:t xml:space="preserve"> </w:t>
-      </w:r>
-      <w:r>
-        <w:rPr>
-          <w:rFonts w:ascii="Times New Roman" w:hAnsi="Times New Roman" w:cs="Times New Roman"/>
-          <w:sz w:val="28"/>
-          <w:szCs w:val="28"/>
-        </w:rPr>
-        <w:t>O</w:t>
-      </w:r>
-      <w:r>
-        <w:rPr>
-          <w:rFonts w:ascii="Times New Roman" w:hAnsi="Times New Roman" w:cs="Times New Roman"/>
-          <w:sz w:val="28"/>
-          <w:szCs w:val="28"/>
-        </w:rPr>
-        <w:t xml:space="preserve"> método do Z-score </w:t>
-      </w:r>
-      <w:r>
-        <w:rPr>
-          <w:rFonts w:ascii="Times New Roman" w:hAnsi="Times New Roman" w:cs="Times New Roman"/>
-          <w:sz w:val="28"/>
-          <w:szCs w:val="28"/>
-        </w:rPr>
-        <w:t xml:space="preserve">mostrou-se </w:t>
-      </w:r>
-      <w:r>
-        <w:rPr>
-          <w:rFonts w:ascii="Times New Roman" w:hAnsi="Times New Roman" w:cs="Times New Roman"/>
-          <w:sz w:val="28"/>
-          <w:szCs w:val="28"/>
-        </w:rPr>
-        <w:t>mais sensível a valores extremos e distribuições assimétricas.</w:t>
-      </w:r>
-      <w:r>
-        <w:rPr>
-          <w:rFonts w:ascii="Times New Roman" w:hAnsi="Times New Roman" w:cs="Times New Roman"/>
-          <w:sz w:val="28"/>
-          <w:szCs w:val="28"/>
-        </w:rPr>
-        <w:t xml:space="preserve"> </w:t>
-      </w:r>
-      <w:r>
-        <w:rPr>
-          <w:rFonts w:ascii="Times New Roman" w:hAnsi="Times New Roman" w:cs="Times New Roman"/>
-          <w:sz w:val="28"/>
-          <w:szCs w:val="28"/>
-        </w:rPr>
-        <w:t>Em comparação, o IQR produz resultados mais consistentes e estáveis, enquanto o Z-score destaca melhor os picos anómalos. O IQR é mais adequado para caracterizar a variabilidade geral</w:t>
-      </w:r>
-      <w:r>
-        <w:rPr>
-          <w:rFonts w:ascii="Times New Roman" w:hAnsi="Times New Roman" w:cs="Times New Roman"/>
-          <w:sz w:val="28"/>
-          <w:szCs w:val="28"/>
-        </w:rPr>
-        <w:t xml:space="preserve"> revelando-se mais adequado devido </w:t>
-      </w:r>
-      <w:r>
-        <w:rPr>
-          <w:rFonts w:ascii="Times New Roman" w:hAnsi="Times New Roman" w:cs="Times New Roman"/>
-          <w:sz w:val="28"/>
-          <w:szCs w:val="28"/>
-        </w:rPr>
-        <w:t>à não normalidade dos dados,</w:t>
-      </w:r>
-      <w:r>
-        <w:rPr>
-          <w:rFonts w:ascii="Times New Roman" w:hAnsi="Times New Roman" w:cs="Times New Roman"/>
-          <w:sz w:val="28"/>
-          <w:szCs w:val="28"/>
-        </w:rPr>
-        <w:t xml:space="preserve"> e</w:t>
-      </w:r>
-      <w:r>
-        <w:rPr>
-          <w:rFonts w:ascii="Times New Roman" w:hAnsi="Times New Roman" w:cs="Times New Roman"/>
-          <w:sz w:val="28"/>
-          <w:szCs w:val="28"/>
-        </w:rPr>
-        <w:t>nquanto</w:t>
-      </w:r>
-      <w:r>
-        <w:rPr>
-          <w:rFonts w:ascii="Times New Roman" w:hAnsi="Times New Roman" w:cs="Times New Roman"/>
-          <w:sz w:val="28"/>
-          <w:szCs w:val="28"/>
-        </w:rPr>
-        <w:t xml:space="preserve"> o Z-score</w:t>
-      </w:r>
-      <w:r>
-        <w:rPr>
-          <w:rFonts w:ascii="Times New Roman" w:hAnsi="Times New Roman" w:cs="Times New Roman"/>
-          <w:sz w:val="28"/>
-          <w:szCs w:val="28"/>
-        </w:rPr>
-        <w:t xml:space="preserve"> será melhor</w:t>
-      </w:r>
-      <w:r>
-        <w:rPr>
-          <w:rFonts w:ascii="Times New Roman" w:hAnsi="Times New Roman" w:cs="Times New Roman"/>
-          <w:sz w:val="28"/>
-          <w:szCs w:val="28"/>
-        </w:rPr>
-        <w:t xml:space="preserve"> para identificar eventos raros e intensos.</w:t>
-      </w:r>
-    </w:p>
-    <w:p>
-      <w:pPr>
-        <w:jc w:val="both"/>
-        <w:rPr>
-          <w:rFonts w:ascii="Times New Roman" w:hAnsi="Times New Roman" w:cs="Times New Roman"/>
-          <w:sz w:val="32"/>
-          <w:szCs w:val="32"/>
-        </w:rPr>
-      </w:pPr>
-      <w:r>
-        <w:rPr>
-          <w:rFonts w:ascii="Times New Roman" w:hAnsi="Times New Roman" w:cs="Times New Roman"/>
           <w:b/>
           <w:bCs/>
           <w:noProof/>
@@ -2617,13 +2642,13 @@
           <w:szCs w:val="48"/>
         </w:rPr>
         <w:drawing>
-          <wp:anchor distT="0" distB="0" distL="114300" distR="114300" simplePos="0" relativeHeight="251659264" behindDoc="1" locked="0" layoutInCell="1" allowOverlap="1" wp14:anchorId="5ED5CB10" wp14:editId="71D81380">
+          <wp:anchor distT="0" distB="0" distL="114300" distR="114300" simplePos="0" relativeHeight="251659264" behindDoc="1" locked="0" layoutInCell="1" allowOverlap="1" wp14:anchorId="5ED5CB10" wp14:editId="782CADAD">
             <wp:simplePos x="0" y="0"/>
             <wp:positionH relativeFrom="margin">
               <wp:align>center</wp:align>
             </wp:positionH>
             <wp:positionV relativeFrom="paragraph">
-              <wp:posOffset>144780</wp:posOffset>
+              <wp:posOffset>2235003</wp:posOffset>
             </wp:positionV>
             <wp:extent cx="4687825" cy="2827909"/>
             <wp:effectExtent l="0" t="0" r="0" b="0"/>
@@ -2672,6 +2697,144 @@
           </wp:anchor>
         </w:drawing>
       </w:r>
+      <w:r>
+        <w:rPr>
+          <w:rFonts w:ascii="Times New Roman" w:hAnsi="Times New Roman" w:cs="Times New Roman"/>
+          <w:sz w:val="28"/>
+          <w:szCs w:val="28"/>
+        </w:rPr>
+        <w:t>O</w:t>
+      </w:r>
+      <w:r>
+        <w:rPr>
+          <w:rFonts w:ascii="Times New Roman" w:hAnsi="Times New Roman" w:cs="Times New Roman"/>
+          <w:sz w:val="28"/>
+          <w:szCs w:val="28"/>
+        </w:rPr>
+        <w:t xml:space="preserve"> método IQR, representado através dos boxplots, permitiu observar a dispersão dos dados e identificar outliers de forma robusta. Mostrou distribuições concentradas em atividades estáticas e maior variabilidade nas dinâmicas e de transição.</w:t>
+      </w:r>
+      <w:r>
+        <w:rPr>
+          <w:rFonts w:ascii="Times New Roman" w:hAnsi="Times New Roman" w:cs="Times New Roman"/>
+          <w:sz w:val="28"/>
+          <w:szCs w:val="28"/>
+        </w:rPr>
+        <w:t xml:space="preserve"> </w:t>
+      </w:r>
+      <w:r>
+        <w:rPr>
+          <w:rFonts w:ascii="Times New Roman" w:hAnsi="Times New Roman" w:cs="Times New Roman"/>
+          <w:sz w:val="28"/>
+          <w:szCs w:val="28"/>
+        </w:rPr>
+        <w:t>O</w:t>
+      </w:r>
+      <w:r>
+        <w:rPr>
+          <w:rFonts w:ascii="Times New Roman" w:hAnsi="Times New Roman" w:cs="Times New Roman"/>
+          <w:sz w:val="28"/>
+          <w:szCs w:val="28"/>
+        </w:rPr>
+        <w:t xml:space="preserve"> método do Z-score </w:t>
+      </w:r>
+      <w:r>
+        <w:rPr>
+          <w:rFonts w:ascii="Times New Roman" w:hAnsi="Times New Roman" w:cs="Times New Roman"/>
+          <w:sz w:val="28"/>
+          <w:szCs w:val="28"/>
+        </w:rPr>
+        <w:t xml:space="preserve">mostrou-se </w:t>
+      </w:r>
+      <w:r>
+        <w:rPr>
+          <w:rFonts w:ascii="Times New Roman" w:hAnsi="Times New Roman" w:cs="Times New Roman"/>
+          <w:sz w:val="28"/>
+          <w:szCs w:val="28"/>
+        </w:rPr>
+        <w:t>mais sensível a valores extremos e distribuições assimétricas.</w:t>
+      </w:r>
+      <w:r>
+        <w:rPr>
+          <w:rFonts w:ascii="Times New Roman" w:hAnsi="Times New Roman" w:cs="Times New Roman"/>
+          <w:sz w:val="28"/>
+          <w:szCs w:val="28"/>
+        </w:rPr>
+        <w:t xml:space="preserve"> </w:t>
+      </w:r>
+      <w:r>
+        <w:rPr>
+          <w:rFonts w:ascii="Times New Roman" w:hAnsi="Times New Roman" w:cs="Times New Roman"/>
+          <w:sz w:val="28"/>
+          <w:szCs w:val="28"/>
+        </w:rPr>
+        <w:t>Em comparação, o IQR produz resultados mais consistentes e estáveis, enquanto o Z-score destaca melhor os picos anómalos. O IQR é mais adequado para caracterizar a variabilidade geral</w:t>
+      </w:r>
+      <w:r>
+        <w:rPr>
+          <w:rFonts w:ascii="Times New Roman" w:hAnsi="Times New Roman" w:cs="Times New Roman"/>
+          <w:sz w:val="28"/>
+          <w:szCs w:val="28"/>
+        </w:rPr>
+        <w:t xml:space="preserve"> revelando-se mais adequado devido </w:t>
+      </w:r>
+      <w:r>
+        <w:rPr>
+          <w:rFonts w:ascii="Times New Roman" w:hAnsi="Times New Roman" w:cs="Times New Roman"/>
+          <w:sz w:val="28"/>
+          <w:szCs w:val="28"/>
+        </w:rPr>
+        <w:t>à não normalidade dos dados,</w:t>
+      </w:r>
+      <w:r>
+        <w:rPr>
+          <w:rFonts w:ascii="Times New Roman" w:hAnsi="Times New Roman" w:cs="Times New Roman"/>
+          <w:sz w:val="28"/>
+          <w:szCs w:val="28"/>
+        </w:rPr>
+        <w:t xml:space="preserve"> e</w:t>
+      </w:r>
+      <w:r>
+        <w:rPr>
+          <w:rFonts w:ascii="Times New Roman" w:hAnsi="Times New Roman" w:cs="Times New Roman"/>
+          <w:sz w:val="28"/>
+          <w:szCs w:val="28"/>
+        </w:rPr>
+        <w:t>nquanto</w:t>
+      </w:r>
+      <w:r>
+        <w:rPr>
+          <w:rFonts w:ascii="Times New Roman" w:hAnsi="Times New Roman" w:cs="Times New Roman"/>
+          <w:sz w:val="28"/>
+          <w:szCs w:val="28"/>
+        </w:rPr>
+        <w:t xml:space="preserve"> o Z-score</w:t>
+      </w:r>
+      <w:r>
+        <w:rPr>
+          <w:rFonts w:ascii="Times New Roman" w:hAnsi="Times New Roman" w:cs="Times New Roman"/>
+          <w:sz w:val="28"/>
+          <w:szCs w:val="28"/>
+        </w:rPr>
+        <w:t xml:space="preserve"> será melhor</w:t>
+      </w:r>
+      <w:r>
+        <w:rPr>
+          <w:rFonts w:ascii="Times New Roman" w:hAnsi="Times New Roman" w:cs="Times New Roman"/>
+          <w:sz w:val="28"/>
+          <w:szCs w:val="28"/>
+        </w:rPr>
+        <w:t xml:space="preserve"> para identificar eventos raros e intensos.</w:t>
+      </w:r>
+    </w:p>
+    <w:p>
+      <w:pPr>
+        <w:jc w:val="both"/>
+        <w:rPr>
+          <w:rFonts w:ascii="Times New Roman" w:hAnsi="Times New Roman" w:cs="Times New Roman"/>
+          <w:sz w:val="32"/>
+          <w:szCs w:val="32"/>
+        </w:rPr>
+      </w:pPr>
     </w:p>
     <w:p>
       <w:pPr>
@@ -2734,7 +2897,11 @@
         </w:rPr>
         <w:tab/>
       </w:r>
-      <w:r>
+    </w:p>
+    <w:p>
+      <w:pPr>
+        <w:ind w:left="708" w:firstLine="708"/>
+        <w:jc w:val="both"/>
         <w:rPr>
           <w:rFonts w:ascii="Times New Roman" w:hAnsi="Times New Roman" w:cs="Times New Roman"/>
           <w:b/>
@@ -2742,38 +2909,23 @@
           <w:sz w:val="48"/>
           <w:szCs w:val="48"/>
         </w:rPr>
-        <w:tab/>
-      </w:r>
-    </w:p>
-    <w:p>
-      <w:pPr>
-        <w:ind w:left="644" w:firstLine="708"/>
-        <w:rPr>
-          <w:rFonts w:ascii="Times New Roman" w:hAnsi="Times New Roman" w:cs="Times New Roman"/>
-          <w:b/>
-          <w:bCs/>
-          <w:sz w:val="48"/>
-          <w:szCs w:val="48"/>
-        </w:rPr>
-      </w:pPr>
-    </w:p>
-    <w:p>
-      <w:pPr>
-        <w:ind w:firstLine="708"/>
-        <w:rPr>
-          <w:rFonts w:ascii="Times New Roman" w:hAnsi="Times New Roman" w:cs="Times New Roman"/>
-        </w:rPr>
-      </w:pPr>
-      <w:r>
-        <w:rPr>
-          <w:rFonts w:ascii="Times New Roman" w:hAnsi="Times New Roman" w:cs="Times New Roman"/>
-        </w:rPr>
-        <w:t xml:space="preserve">    </w:t>
-      </w:r>
-    </w:p>
-    <w:p>
-      <w:pPr>
-        <w:ind w:firstLine="708"/>
+      </w:pPr>
+      <w:r>
+        <w:rPr>
+          <w:rFonts w:ascii="Times New Roman" w:hAnsi="Times New Roman" w:cs="Times New Roman"/>
+        </w:rPr>
+        <w:lastRenderedPageBreak/>
+        <w:t xml:space="preserve">Gráfico com boxplots </w:t>
+      </w:r>
+      <w:r>
+        <w:rPr>
+          <w:rFonts w:ascii="Times New Roman" w:hAnsi="Times New Roman" w:cs="Times New Roman"/>
+        </w:rPr>
+        <w:t>de módulos da aceleração para cada atividade</w:t>
+      </w:r>
+    </w:p>
+    <w:p>
+      <w:pPr>
         <w:rPr>
           <w:rFonts w:ascii="Times New Roman" w:hAnsi="Times New Roman" w:cs="Times New Roman"/>
           <w:b/>
@@ -2786,36 +2938,6 @@
         <w:rPr>
           <w:rFonts w:ascii="Times New Roman" w:hAnsi="Times New Roman" w:cs="Times New Roman"/>
         </w:rPr>
-        <w:t xml:space="preserve">     </w:t>
-      </w:r>
-      <w:r>
-        <w:rPr>
-          <w:rFonts w:ascii="Times New Roman" w:hAnsi="Times New Roman" w:cs="Times New Roman"/>
-        </w:rPr>
-        <w:t xml:space="preserve">Gráfico com boxplots </w:t>
-      </w:r>
-      <w:r>
-        <w:rPr>
-          <w:rFonts w:ascii="Times New Roman" w:hAnsi="Times New Roman" w:cs="Times New Roman"/>
-        </w:rPr>
-        <w:t>de módulos da aceleração para cada atividade</w:t>
-      </w:r>
-    </w:p>
-    <w:p>
-      <w:pPr>
-        <w:rPr>
-          <w:rFonts w:ascii="Times New Roman" w:hAnsi="Times New Roman" w:cs="Times New Roman"/>
-          <w:b/>
-          <w:bCs/>
-          <w:sz w:val="36"/>
-          <w:szCs w:val="36"/>
-        </w:rPr>
-      </w:pPr>
-      <w:r>
-        <w:rPr>
-          <w:rFonts w:ascii="Times New Roman" w:hAnsi="Times New Roman" w:cs="Times New Roman"/>
-        </w:rPr>
-        <w:lastRenderedPageBreak/>
         <w:t xml:space="preserve">                                                            </w:t>
       </w:r>
       <w:r>
@@ -2947,24 +3069,6 @@
         </w:rPr>
         <w:t>para o dispositivo 1</w:t>
       </w:r>
-    </w:p>
-    <w:p>
-      <w:pPr>
-        <w:rPr>
-          <w:rFonts w:ascii="Times New Roman" w:hAnsi="Times New Roman" w:cs="Times New Roman"/>
-        </w:rPr>
-      </w:pPr>
-    </w:p>
-    <w:p>
-      <w:pPr>
-        <w:rPr>
-          <w:rFonts w:ascii="Times New Roman" w:hAnsi="Times New Roman" w:cs="Times New Roman"/>
-          <w:b/>
-          <w:bCs/>
-          <w:sz w:val="36"/>
-          <w:szCs w:val="36"/>
-        </w:rPr>
-      </w:pPr>
       <w:r>
         <w:rPr>
           <w:rFonts w:ascii="Times New Roman" w:hAnsi="Times New Roman" w:cs="Times New Roman"/>
@@ -3522,6 +3626,7 @@
           <w:rFonts w:ascii="Times New Roman" w:hAnsi="Times New Roman" w:cs="Times New Roman"/>
           <w:noProof/>
         </w:rPr>
+        <w:lastRenderedPageBreak/>
         <w:drawing>
           <wp:anchor distT="0" distB="0" distL="114300" distR="114300" simplePos="0" relativeHeight="251663360" behindDoc="1" locked="0" layoutInCell="1" allowOverlap="1" wp14:anchorId="32311CD8" wp14:editId="1661FA15">
             <wp:simplePos x="0" y="0"/>
@@ -3925,7 +4030,6 @@
         <w:rPr>
           <w:rFonts w:ascii="Times New Roman" w:hAnsi="Times New Roman" w:cs="Times New Roman"/>
         </w:rPr>
-        <w:lastRenderedPageBreak/>
         <w:t>(a atividade 12 é</w:t>
       </w:r>
       <w:r>
@@ -3963,6 +4067,7 @@
           <w:sz w:val="48"/>
           <w:szCs w:val="48"/>
         </w:rPr>
+        <w:lastRenderedPageBreak/>
         <w:t xml:space="preserve"> Testes de Normalidade</w:t>
       </w:r>
     </w:p>
@@ -4374,21 +4479,24 @@
         </w:rPr>
         <w:t xml:space="preserve">                                                              </w:t>
       </w:r>
-      <w:r>
+    </w:p>
+    <w:p>
+      <w:pPr>
+        <w:ind w:left="2832" w:firstLine="708"/>
         <w:rPr>
           <w:rFonts w:ascii="Times New Roman" w:hAnsi="Times New Roman" w:cs="Times New Roman"/>
           <w:sz w:val="22"/>
           <w:szCs w:val="22"/>
         </w:rPr>
+      </w:pPr>
+      <w:r>
+        <w:rPr>
+          <w:rFonts w:ascii="Times New Roman" w:hAnsi="Times New Roman" w:cs="Times New Roman"/>
+          <w:sz w:val="22"/>
+          <w:szCs w:val="22"/>
+        </w:rPr>
         <w:t>Campo Magnético</w:t>
       </w:r>
-    </w:p>
-    <w:p>
-      <w:pPr>
-        <w:rPr>
-          <w:rFonts w:ascii="Times New Roman" w:hAnsi="Times New Roman" w:cs="Times New Roman"/>
-        </w:rPr>
-      </w:pPr>
     </w:p>
     <w:p>
       <w:pPr>
@@ -4412,6 +4520,7 @@
           <w:sz w:val="48"/>
           <w:szCs w:val="48"/>
         </w:rPr>
+        <w:lastRenderedPageBreak/>
         <w:t xml:space="preserve"> </w:t>
       </w:r>
       <w:r>
@@ -4626,6 +4735,16 @@
         </w:rPr>
         <w:t>Estas features captam tanto a intensidade média como a dinâmica oscilatória do movimento.</w:t>
       </w:r>
+    </w:p>
+    <w:p>
+      <w:pPr>
+        <w:jc w:val="both"/>
+        <w:rPr>
+          <w:rFonts w:ascii="Times New Roman" w:hAnsi="Times New Roman" w:cs="Times New Roman"/>
+          <w:sz w:val="28"/>
+          <w:szCs w:val="28"/>
+        </w:rPr>
+      </w:pPr>
     </w:p>
     <w:p>
       <w:pPr>
@@ -4885,7 +5004,7 @@
           <w:szCs w:val="28"/>
         </w:rPr>
         <w:drawing>
-          <wp:anchor distT="0" distB="0" distL="114300" distR="114300" simplePos="0" relativeHeight="251675648" behindDoc="1" locked="0" layoutInCell="1" allowOverlap="1" wp14:anchorId="54A8846A" wp14:editId="373A10DB">
+          <wp:anchor distT="0" distB="0" distL="114300" distR="114300" simplePos="0" relativeHeight="251675648" behindDoc="1" locked="0" layoutInCell="1" allowOverlap="1" wp14:anchorId="54A8846A" wp14:editId="25772555">
             <wp:simplePos x="0" y="0"/>
             <wp:positionH relativeFrom="margin">
               <wp:posOffset>-325289</wp:posOffset>
@@ -5092,6 +5211,16 @@
     </w:p>
     <w:p>
       <w:pPr>
+        <w:jc w:val="both"/>
+        <w:rPr>
+          <w:rFonts w:ascii="Times New Roman" w:hAnsi="Times New Roman" w:cs="Times New Roman"/>
+          <w:sz w:val="28"/>
+          <w:szCs w:val="28"/>
+        </w:rPr>
+      </w:pPr>
+    </w:p>
+    <w:p>
+      <w:pPr>
         <w:pStyle w:val="ListParagraph"/>
         <w:numPr>
           <w:ilvl w:val="0"/>
@@ -5232,15 +5361,15 @@
           <w:szCs w:val="28"/>
         </w:rPr>
         <w:drawing>
-          <wp:anchor distT="0" distB="0" distL="114300" distR="114300" simplePos="0" relativeHeight="251676672" behindDoc="1" locked="0" layoutInCell="1" allowOverlap="1" wp14:anchorId="43F204FC" wp14:editId="7F998DDA">
+          <wp:anchor distT="0" distB="0" distL="114300" distR="114300" simplePos="0" relativeHeight="251676672" behindDoc="1" locked="0" layoutInCell="1" allowOverlap="1" wp14:anchorId="43F204FC" wp14:editId="41E9E109">
             <wp:simplePos x="0" y="0"/>
             <wp:positionH relativeFrom="margin">
-              <wp:align>center</wp:align>
+              <wp:posOffset>934991</wp:posOffset>
             </wp:positionH>
             <wp:positionV relativeFrom="paragraph">
-              <wp:posOffset>8345</wp:posOffset>
+              <wp:posOffset>6985</wp:posOffset>
             </wp:positionV>
-            <wp:extent cx="3890411" cy="2158796"/>
+            <wp:extent cx="3548343" cy="1968982"/>
             <wp:effectExtent l="0" t="0" r="0" b="0"/>
             <wp:wrapNone/>
             <wp:docPr id="1323923757" name="Picture 1" descr="A list of text on a white background&#10;&#10;AI-generated content may be incorrect."/>
@@ -5269,7 +5398,7 @@
                   <pic:spPr>
                     <a:xfrm>
                       <a:off x="0" y="0"/>
-                      <a:ext cx="3890411" cy="2158796"/>
+                      <a:ext cx="3548343" cy="1968982"/>
                     </a:xfrm>
                     <a:prstGeom prst="rect">
                       <a:avLst/>
@@ -5340,16 +5469,7 @@
     </w:p>
     <w:p>
       <w:pPr>
-        <w:jc w:val="both"/>
-        <w:rPr>
-          <w:rFonts w:ascii="Times New Roman" w:hAnsi="Times New Roman" w:cs="Times New Roman"/>
-          <w:sz w:val="28"/>
-          <w:szCs w:val="28"/>
-        </w:rPr>
-      </w:pPr>
-    </w:p>
-    <w:p>
-      <w:pPr>
+        <w:ind w:left="1416" w:firstLine="708"/>
         <w:jc w:val="both"/>
         <w:rPr>
           <w:noProof/>
@@ -5361,32 +5481,9 @@
           <w:rFonts w:ascii="Times New Roman" w:hAnsi="Times New Roman" w:cs="Times New Roman"/>
           <w:sz w:val="28"/>
           <w:szCs w:val="28"/>
-        </w:rPr>
-        <w:tab/>
-      </w:r>
-      <w:r>
-        <w:rPr>
-          <w:rFonts w:ascii="Times New Roman" w:hAnsi="Times New Roman" w:cs="Times New Roman"/>
-          <w:sz w:val="28"/>
-          <w:szCs w:val="28"/>
-        </w:rPr>
-        <w:tab/>
-      </w:r>
-      <w:r>
-        <w:rPr>
-          <w:rFonts w:ascii="Times New Roman" w:hAnsi="Times New Roman" w:cs="Times New Roman"/>
-          <w:sz w:val="28"/>
-          <w:szCs w:val="28"/>
-        </w:rPr>
-        <w:tab/>
-      </w:r>
-      <w:r>
-        <w:rPr>
-          <w:rFonts w:ascii="Times New Roman" w:hAnsi="Times New Roman" w:cs="Times New Roman"/>
-          <w:sz w:val="28"/>
-          <w:szCs w:val="28"/>
-        </w:rPr>
-        <w:t xml:space="preserve">    </w:t>
+          <w:lang w:val="en-US"/>
+        </w:rPr>
+        <w:t xml:space="preserve"> </w:t>
       </w:r>
       <w:r>
         <w:rPr>
@@ -5581,6 +5678,13 @@
       </w:r>
       <w:r>
         <w:rPr>
+          <w:noProof/>
+          <w:lang w:val="en-US"/>
+        </w:rPr>
+        <w:t xml:space="preserve">  </w:t>
+      </w:r>
+      <w:r>
+        <w:rPr>
           <w:rFonts w:ascii="Times New Roman" w:hAnsi="Times New Roman" w:cs="Times New Roman"/>
           <w:sz w:val="28"/>
           <w:szCs w:val="28"/>
@@ -5714,6 +5818,22 @@
         </w:rPr>
         <w:t>Stand:</w:t>
       </w:r>
+      <w:r>
+        <w:rPr>
+          <w:rFonts w:ascii="Times New Roman" w:hAnsi="Times New Roman" w:cs="Times New Roman"/>
+          <w:sz w:val="28"/>
+          <w:szCs w:val="28"/>
+        </w:rPr>
+        <w:t xml:space="preserve"> </w:t>
+      </w:r>
+      <w:r>
+        <w:rPr>
+          <w:rFonts w:ascii="Times New Roman" w:hAnsi="Times New Roman" w:cs="Times New Roman"/>
+          <w:sz w:val="28"/>
+          <w:szCs w:val="28"/>
+        </w:rPr>
+        <w:t>6629 samples</w:t>
+      </w:r>
     </w:p>
     <w:p>
       <w:pPr>
@@ -5753,6 +5873,14 @@
         </w:rPr>
         <w:t xml:space="preserve"> </w:t>
       </w:r>
+      <w:r>
+        <w:rPr>
+          <w:rFonts w:ascii="Times New Roman" w:hAnsi="Times New Roman" w:cs="Times New Roman"/>
+          <w:sz w:val="28"/>
+          <w:szCs w:val="28"/>
+        </w:rPr>
+        <w:t>2783 samples</w:t>
+      </w:r>
     </w:p>
     <w:p>
       <w:pPr>
@@ -5776,6 +5904,22 @@
         </w:rPr>
         <w:t>Sit and Talk:</w:t>
       </w:r>
+      <w:r>
+        <w:rPr>
+          <w:rFonts w:ascii="Times New Roman" w:hAnsi="Times New Roman" w:cs="Times New Roman"/>
+          <w:sz w:val="28"/>
+          <w:szCs w:val="28"/>
+        </w:rPr>
+        <w:t xml:space="preserve"> </w:t>
+      </w:r>
+      <w:r>
+        <w:rPr>
+          <w:rFonts w:ascii="Times New Roman" w:hAnsi="Times New Roman" w:cs="Times New Roman"/>
+          <w:sz w:val="28"/>
+          <w:szCs w:val="28"/>
+        </w:rPr>
+        <w:t>2756 samples</w:t>
+      </w:r>
     </w:p>
     <w:p>
       <w:pPr>
@@ -5807,6 +5951,22 @@
         </w:rPr>
         <w:t>:</w:t>
       </w:r>
+      <w:r>
+        <w:rPr>
+          <w:rFonts w:ascii="Times New Roman" w:hAnsi="Times New Roman" w:cs="Times New Roman"/>
+          <w:sz w:val="28"/>
+          <w:szCs w:val="28"/>
+        </w:rPr>
+        <w:t xml:space="preserve"> </w:t>
+      </w:r>
+      <w:r>
+        <w:rPr>
+          <w:rFonts w:ascii="Times New Roman" w:hAnsi="Times New Roman" w:cs="Times New Roman"/>
+          <w:sz w:val="28"/>
+          <w:szCs w:val="28"/>
+        </w:rPr>
+        <w:t>5405 samples</w:t>
+      </w:r>
     </w:p>
     <w:p>
       <w:pPr>
@@ -5838,6 +5998,22 @@
         </w:rPr>
         <w:t>:</w:t>
       </w:r>
+      <w:r>
+        <w:rPr>
+          <w:rFonts w:ascii="Times New Roman" w:hAnsi="Times New Roman" w:cs="Times New Roman"/>
+          <w:sz w:val="28"/>
+          <w:szCs w:val="28"/>
+        </w:rPr>
+        <w:t xml:space="preserve"> </w:t>
+      </w:r>
+      <w:r>
+        <w:rPr>
+          <w:rFonts w:ascii="Times New Roman" w:hAnsi="Times New Roman" w:cs="Times New Roman"/>
+          <w:sz w:val="28"/>
+          <w:szCs w:val="28"/>
+        </w:rPr>
+        <w:t>5384 samples</w:t>
+      </w:r>
     </w:p>
     <w:p>
       <w:pPr>
@@ -5861,6 +6037,22 @@
         </w:rPr>
         <w:t>Climb Stair:</w:t>
       </w:r>
+      <w:r>
+        <w:rPr>
+          <w:rFonts w:ascii="Times New Roman" w:hAnsi="Times New Roman" w:cs="Times New Roman"/>
+          <w:sz w:val="28"/>
+          <w:szCs w:val="28"/>
+        </w:rPr>
+        <w:t xml:space="preserve"> </w:t>
+      </w:r>
+      <w:r>
+        <w:rPr>
+          <w:rFonts w:ascii="Times New Roman" w:hAnsi="Times New Roman" w:cs="Times New Roman"/>
+          <w:sz w:val="28"/>
+          <w:szCs w:val="28"/>
+        </w:rPr>
+        <w:t>3551 samples</w:t>
+      </w:r>
     </w:p>
     <w:p>
       <w:pPr>
@@ -5874,26 +6066,110 @@
           <w:rFonts w:ascii="Times New Roman" w:hAnsi="Times New Roman" w:cs="Times New Roman"/>
           <w:sz w:val="28"/>
           <w:szCs w:val="28"/>
-        </w:rPr>
-      </w:pPr>
-      <w:r>
-        <w:rPr>
-          <w:rFonts w:ascii="Times New Roman" w:hAnsi="Times New Roman" w:cs="Times New Roman"/>
-          <w:sz w:val="28"/>
-          <w:szCs w:val="28"/>
+          <w:lang w:val="en-US"/>
+        </w:rPr>
+      </w:pPr>
+      <w:r>
+        <w:rPr>
+          <w:rFonts w:ascii="Times New Roman" w:hAnsi="Times New Roman" w:cs="Times New Roman"/>
+          <w:sz w:val="28"/>
+          <w:szCs w:val="28"/>
+          <w:lang w:val="en-US"/>
         </w:rPr>
         <w:t>Climb Stair and Talk:</w:t>
       </w:r>
-    </w:p>
-    <w:p>
-      <w:pPr>
-        <w:jc w:val="both"/>
-        <w:rPr>
-          <w:rFonts w:ascii="Times New Roman" w:hAnsi="Times New Roman" w:cs="Times New Roman"/>
-          <w:sz w:val="28"/>
-          <w:szCs w:val="28"/>
-        </w:rPr>
-      </w:pPr>
+      <w:r>
+        <w:rPr>
+          <w:rFonts w:ascii="Times New Roman" w:hAnsi="Times New Roman" w:cs="Times New Roman"/>
+          <w:sz w:val="28"/>
+          <w:szCs w:val="28"/>
+          <w:lang w:val="en-US"/>
+        </w:rPr>
+        <w:t xml:space="preserve"> </w:t>
+      </w:r>
+      <w:r>
+        <w:rPr>
+          <w:rFonts w:ascii="Times New Roman" w:hAnsi="Times New Roman" w:cs="Times New Roman"/>
+          <w:sz w:val="28"/>
+          <w:szCs w:val="28"/>
+          <w:lang w:val="en-US"/>
+        </w:rPr>
+        <w:t>1819 samples</w:t>
+      </w:r>
+    </w:p>
+    <w:p>
+      <w:pPr>
+        <w:jc w:val="both"/>
+        <w:rPr>
+          <w:rFonts w:ascii="Times New Roman" w:hAnsi="Times New Roman" w:cs="Times New Roman"/>
+          <w:sz w:val="28"/>
+          <w:szCs w:val="28"/>
+        </w:rPr>
+      </w:pPr>
+      <w:r>
+        <w:rPr>
+          <w:rFonts w:ascii="Times New Roman" w:hAnsi="Times New Roman" w:cs="Times New Roman"/>
+          <w:sz w:val="28"/>
+          <w:szCs w:val="28"/>
+        </w:rPr>
+        <w:drawing>
+          <wp:anchor distT="0" distB="0" distL="114300" distR="114300" simplePos="0" relativeHeight="251678720" behindDoc="1" locked="0" layoutInCell="1" allowOverlap="1" wp14:anchorId="47794484" wp14:editId="18C28407">
+            <wp:simplePos x="0" y="0"/>
+            <wp:positionH relativeFrom="margin">
+              <wp:align>left</wp:align>
+            </wp:positionH>
+            <wp:positionV relativeFrom="paragraph">
+              <wp:posOffset>1723918</wp:posOffset>
+            </wp:positionV>
+            <wp:extent cx="5400040" cy="2776220"/>
+            <wp:effectExtent l="0" t="0" r="0" b="5080"/>
+            <wp:wrapTight wrapText="bothSides">
+              <wp:wrapPolygon edited="0">
+                <wp:start x="0" y="0"/>
+                <wp:lineTo x="0" y="21491"/>
+                <wp:lineTo x="21488" y="21491"/>
+                <wp:lineTo x="21488" y="0"/>
+                <wp:lineTo x="0" y="0"/>
+              </wp:wrapPolygon>
+            </wp:wrapTight>
+            <wp:docPr id="1781091942" name="Picture 1" descr="A blue and red dots&#10;&#10;AI-generated content may be incorrect."/>
+            <wp:cNvGraphicFramePr>
+              <a:graphicFrameLocks xmlns:a="http://schemas.openxmlformats.org/drawingml/2006/main" noChangeAspect="1"/>
+            </wp:cNvGraphicFramePr>
+            <a:graphic xmlns:a="http://schemas.openxmlformats.org/drawingml/2006/main">
+              <a:graphicData uri="http://schemas.openxmlformats.org/drawingml/2006/picture">
+                <pic:pic xmlns:pic="http://schemas.openxmlformats.org/drawingml/2006/picture">
+                  <pic:nvPicPr>
+                    <pic:cNvPr id="1781091942" name="Picture 1" descr="A blue and red dots&#10;&#10;AI-generated content may be incorrect."/>
+                    <pic:cNvPicPr/>
+                  </pic:nvPicPr>
+                  <pic:blipFill>
+                    <a:blip r:embed="rId22" cstate="print">
+                      <a:extLst>
+                        <a:ext uri="{28A0092B-C50C-407E-A947-70E740481C1C}">
+                          <a14:useLocalDpi xmlns:a14="http://schemas.microsoft.com/office/drawing/2010/main" val="0"/>
+                        </a:ext>
+                      </a:extLst>
+                    </a:blip>
+                    <a:stretch>
+                      <a:fillRect/>
+                    </a:stretch>
+                  </pic:blipFill>
+                  <pic:spPr>
+                    <a:xfrm>
+                      <a:off x="0" y="0"/>
+                      <a:ext cx="5400040" cy="2776220"/>
+                    </a:xfrm>
+                    <a:prstGeom prst="rect">
+                      <a:avLst/>
+                    </a:prstGeom>
+                  </pic:spPr>
+                </pic:pic>
+              </a:graphicData>
+            </a:graphic>
+          </wp:anchor>
+        </w:drawing>
+      </w:r>
       <w:r>
         <w:rPr>
           <w:rFonts w:ascii="Times New Roman" w:hAnsi="Times New Roman" w:cs="Times New Roman"/>
@@ -5998,6 +6274,34 @@
         </w:rPr>
         <w:t>.</w:t>
       </w:r>
+    </w:p>
+    <w:p>
+      <w:pPr>
+        <w:jc w:val="both"/>
+        <w:rPr>
+          <w:rFonts w:ascii="Times New Roman" w:hAnsi="Times New Roman" w:cs="Times New Roman"/>
+          <w:sz w:val="28"/>
+          <w:szCs w:val="28"/>
+        </w:rPr>
+      </w:pPr>
+      <w:r>
+        <w:rPr>
+          <w:rFonts w:ascii="Times New Roman" w:hAnsi="Times New Roman" w:cs="Times New Roman"/>
+          <w:sz w:val="28"/>
+          <w:szCs w:val="28"/>
+        </w:rPr>
+        <w:t xml:space="preserve">                                                Samples Sintéticos</w:t>
+      </w:r>
+    </w:p>
+    <w:p>
+      <w:pPr>
+        <w:jc w:val="both"/>
+        <w:rPr>
+          <w:rFonts w:ascii="Times New Roman" w:hAnsi="Times New Roman" w:cs="Times New Roman"/>
+          <w:sz w:val="28"/>
+          <w:szCs w:val="28"/>
+        </w:rPr>
+      </w:pPr>
     </w:p>
     <w:p>
       <w:pPr>
@@ -6131,16 +6435,6 @@
         <w:jc w:val="both"/>
         <w:rPr>
           <w:rFonts w:ascii="Times New Roman" w:hAnsi="Times New Roman" w:cs="Times New Roman"/>
-          <w:sz w:val="28"/>
-          <w:szCs w:val="28"/>
-        </w:rPr>
-      </w:pPr>
-    </w:p>
-    <w:p>
-      <w:pPr>
-        <w:jc w:val="both"/>
-        <w:rPr>
-          <w:rFonts w:ascii="Times New Roman" w:hAnsi="Times New Roman" w:cs="Times New Roman"/>
         </w:rPr>
       </w:pPr>
     </w:p>
@@ -6164,7 +6458,6 @@
           <w:sz w:val="48"/>
           <w:szCs w:val="48"/>
         </w:rPr>
-        <w:lastRenderedPageBreak/>
         <w:t>Estratégias de Divisão de Dados</w:t>
       </w:r>
     </w:p>
@@ -6651,7 +6944,16 @@
           <w:sz w:val="28"/>
           <w:szCs w:val="28"/>
         </w:rPr>
-        <w:t>, os participantes foram divididos em três grupos exclusivos: 9 participantes para treino, 3 participantes para validação, 3 participantes para teste assegurando que cada conjunto contém apenas dados de indivíduos distintos. Esta estratégia é metodologicamente mais exigente, mas mais alinhada com a utilização real do sistema de reconhecimento de atividades, uma vez que o modelo é testado em pessoas cujos padrões de movimento não foram observados durante o treino.</w:t>
+        <w:t xml:space="preserve">, os participantes foram divididos em três grupos exclusivos: 9 participantes para treino, 3 participantes para validação, 3 participantes para teste assegurando que cada conjunto contém apenas dados </w:t>
+      </w:r>
+      <w:r>
+        <w:rPr>
+          <w:rFonts w:ascii="Times New Roman" w:hAnsi="Times New Roman" w:cs="Times New Roman"/>
+          <w:sz w:val="28"/>
+          <w:szCs w:val="28"/>
+        </w:rPr>
+        <w:lastRenderedPageBreak/>
+        <w:t>de indivíduos distintos. Esta estratégia é metodologicamente mais exigente, mas mais alinhada com a utilização real do sistema de reconhecimento de atividades, uma vez que o modelo é testado em pessoas cujos padrões de movimento não foram observados durante o treino.</w:t>
       </w:r>
     </w:p>
     <w:p>
@@ -6685,16 +6987,7 @@
           <w:sz w:val="28"/>
           <w:szCs w:val="28"/>
         </w:rPr>
-        <w:t xml:space="preserve">Em problemas de classificação de atividade humana, onde existe elevada </w:t>
-      </w:r>
-      <w:r>
-        <w:rPr>
-          <w:rFonts w:ascii="Times New Roman" w:hAnsi="Times New Roman" w:cs="Times New Roman"/>
-          <w:sz w:val="28"/>
-          <w:szCs w:val="28"/>
-        </w:rPr>
-        <w:lastRenderedPageBreak/>
-        <w:t>variabilidade biomecânica entre indivíduos, a abordagem inter-participante é, portanto, a que mais fielmente estima o desempenho real do sistema quando aplicado em novos utilizadores.</w:t>
+        <w:t>Em problemas de classificação de atividade humana, onde existe elevada variabilidade biomecânica entre indivíduos, a abordagem inter-participante é, portanto, a que mais fielmente estima o desempenho real do sistema quando aplicado em novos utilizadores.</w:t>
       </w:r>
     </w:p>
     <w:p>
@@ -7092,6 +7385,7 @@
           <w:sz w:val="28"/>
           <w:szCs w:val="28"/>
         </w:rPr>
+        <w:lastRenderedPageBreak/>
         <w:t>Dois tipos de dados (Features, Embeddings)</w:t>
       </w:r>
     </w:p>
@@ -7207,26 +7501,6 @@
     </w:p>
     <w:p>
       <w:pPr>
-        <w:jc w:val="both"/>
-        <w:rPr>
-          <w:rFonts w:ascii="Times New Roman" w:hAnsi="Times New Roman" w:cs="Times New Roman"/>
-          <w:sz w:val="28"/>
-          <w:szCs w:val="28"/>
-        </w:rPr>
-      </w:pPr>
-    </w:p>
-    <w:p>
-      <w:pPr>
-        <w:jc w:val="both"/>
-        <w:rPr>
-          <w:rFonts w:ascii="Times New Roman" w:hAnsi="Times New Roman" w:cs="Times New Roman"/>
-          <w:sz w:val="28"/>
-          <w:szCs w:val="28"/>
-        </w:rPr>
-      </w:pPr>
-    </w:p>
-    <w:p>
-      <w:pPr>
         <w:pStyle w:val="ListParagraph"/>
         <w:numPr>
           <w:ilvl w:val="0"/>
@@ -7245,26 +7519,496 @@
           <w:sz w:val="48"/>
           <w:szCs w:val="48"/>
         </w:rPr>
+        <w:t>Avaliação dos Modelos</w:t>
+      </w:r>
+    </w:p>
+    <w:p>
+      <w:pPr>
+        <w:jc w:val="both"/>
+        <w:rPr>
+          <w:rFonts w:ascii="Times New Roman" w:hAnsi="Times New Roman" w:cs="Times New Roman"/>
+          <w:sz w:val="28"/>
+          <w:szCs w:val="28"/>
+        </w:rPr>
+      </w:pPr>
+      <w:r>
+        <w:rPr>
+          <w:rFonts w:ascii="Times New Roman" w:hAnsi="Times New Roman" w:cs="Times New Roman"/>
+          <w:sz w:val="28"/>
+          <w:szCs w:val="28"/>
+        </w:rPr>
+        <w:drawing>
+          <wp:anchor distT="0" distB="0" distL="114300" distR="114300" simplePos="0" relativeHeight="251680768" behindDoc="0" locked="0" layoutInCell="1" allowOverlap="1" wp14:anchorId="5AFBC2A6" wp14:editId="348FE8B2">
+            <wp:simplePos x="0" y="0"/>
+            <wp:positionH relativeFrom="margin">
+              <wp:align>center</wp:align>
+            </wp:positionH>
+            <wp:positionV relativeFrom="paragraph">
+              <wp:posOffset>2768502</wp:posOffset>
+            </wp:positionV>
+            <wp:extent cx="4785995" cy="1954530"/>
+            <wp:effectExtent l="0" t="0" r="0" b="7620"/>
+            <wp:wrapThrough wrapText="bothSides">
+              <wp:wrapPolygon edited="0">
+                <wp:start x="0" y="0"/>
+                <wp:lineTo x="0" y="21474"/>
+                <wp:lineTo x="21494" y="21474"/>
+                <wp:lineTo x="21494" y="0"/>
+                <wp:lineTo x="0" y="0"/>
+              </wp:wrapPolygon>
+            </wp:wrapThrough>
+            <wp:docPr id="1231501515" name="Picture 1" descr="A table of numbers and a few percentages&#10;&#10;AI-generated content may be incorrect."/>
+            <wp:cNvGraphicFramePr>
+              <a:graphicFrameLocks xmlns:a="http://schemas.openxmlformats.org/drawingml/2006/main" noChangeAspect="1"/>
+            </wp:cNvGraphicFramePr>
+            <a:graphic xmlns:a="http://schemas.openxmlformats.org/drawingml/2006/main">
+              <a:graphicData uri="http://schemas.openxmlformats.org/drawingml/2006/picture">
+                <pic:pic xmlns:pic="http://schemas.openxmlformats.org/drawingml/2006/picture">
+                  <pic:nvPicPr>
+                    <pic:cNvPr id="1231501515" name="Picture 1" descr="A table of numbers and a few percentages&#10;&#10;AI-generated content may be incorrect."/>
+                    <pic:cNvPicPr/>
+                  </pic:nvPicPr>
+                  <pic:blipFill>
+                    <a:blip r:embed="rId23">
+                      <a:extLst>
+                        <a:ext uri="{28A0092B-C50C-407E-A947-70E740481C1C}">
+                          <a14:useLocalDpi xmlns:a14="http://schemas.microsoft.com/office/drawing/2010/main" val="0"/>
+                        </a:ext>
+                      </a:extLst>
+                    </a:blip>
+                    <a:stretch>
+                      <a:fillRect/>
+                    </a:stretch>
+                  </pic:blipFill>
+                  <pic:spPr>
+                    <a:xfrm>
+                      <a:off x="0" y="0"/>
+                      <a:ext cx="4785995" cy="1954530"/>
+                    </a:xfrm>
+                    <a:prstGeom prst="rect">
+                      <a:avLst/>
+                    </a:prstGeom>
+                  </pic:spPr>
+                </pic:pic>
+              </a:graphicData>
+            </a:graphic>
+            <wp14:sizeRelH relativeFrom="margin">
+              <wp14:pctWidth>0</wp14:pctWidth>
+            </wp14:sizeRelH>
+            <wp14:sizeRelV relativeFrom="margin">
+              <wp14:pctHeight>0</wp14:pctHeight>
+            </wp14:sizeRelV>
+          </wp:anchor>
+        </w:drawing>
+      </w:r>
+      <w:r>
+        <w:rPr>
+          <w:rFonts w:ascii="Times New Roman" w:hAnsi="Times New Roman" w:cs="Times New Roman"/>
+          <w:sz w:val="28"/>
+          <w:szCs w:val="28"/>
+        </w:rPr>
+        <w:t>Observando a</w:t>
+      </w:r>
+      <w:r>
+        <w:rPr>
+          <w:rFonts w:ascii="Times New Roman" w:hAnsi="Times New Roman" w:cs="Times New Roman"/>
+          <w:sz w:val="28"/>
+          <w:szCs w:val="28"/>
+        </w:rPr>
+        <w:t>s</w:t>
+      </w:r>
+      <w:r>
+        <w:rPr>
+          <w:rFonts w:ascii="Times New Roman" w:hAnsi="Times New Roman" w:cs="Times New Roman"/>
+          <w:sz w:val="28"/>
+          <w:szCs w:val="28"/>
+        </w:rPr>
+        <w:t xml:space="preserve"> matriz</w:t>
+      </w:r>
+      <w:r>
+        <w:rPr>
+          <w:rFonts w:ascii="Times New Roman" w:hAnsi="Times New Roman" w:cs="Times New Roman"/>
+          <w:sz w:val="28"/>
+          <w:szCs w:val="28"/>
+        </w:rPr>
+        <w:t>es</w:t>
+      </w:r>
+      <w:r>
+        <w:rPr>
+          <w:rFonts w:ascii="Times New Roman" w:hAnsi="Times New Roman" w:cs="Times New Roman"/>
+          <w:sz w:val="28"/>
+          <w:szCs w:val="28"/>
+        </w:rPr>
+        <w:t xml:space="preserve"> de confusão, nota-se que há uma confusão significativa entre pares de atividades muito semelhantes, sobretudo aquelas que diferem apenas pela presença da fala. Por exemplo, as classes 2 e 3 apresentam elevada taxa de erro cruzado, indicando que o modelo frequentemente confunde “</w:t>
+      </w:r>
+      <w:r>
+        <w:rPr>
+          <w:rFonts w:ascii="Times New Roman" w:hAnsi="Times New Roman" w:cs="Times New Roman"/>
+          <w:sz w:val="28"/>
+          <w:szCs w:val="28"/>
+        </w:rPr>
+        <w:t>Sit</w:t>
+      </w:r>
+      <w:r>
+        <w:rPr>
+          <w:rFonts w:ascii="Times New Roman" w:hAnsi="Times New Roman" w:cs="Times New Roman"/>
+          <w:sz w:val="28"/>
+          <w:szCs w:val="28"/>
+        </w:rPr>
+        <w:t>” com “</w:t>
+      </w:r>
+      <w:r>
+        <w:rPr>
+          <w:rFonts w:ascii="Times New Roman" w:hAnsi="Times New Roman" w:cs="Times New Roman"/>
+          <w:sz w:val="28"/>
+          <w:szCs w:val="28"/>
+        </w:rPr>
+        <w:t>Sit</w:t>
+      </w:r>
+      <w:r>
+        <w:rPr>
+          <w:rFonts w:ascii="Times New Roman" w:hAnsi="Times New Roman" w:cs="Times New Roman"/>
+          <w:sz w:val="28"/>
+          <w:szCs w:val="28"/>
+        </w:rPr>
+        <w:t xml:space="preserve"> and Talk”. Um padrão semelhante é observado entre as classes 4 e 5, onde “</w:t>
+      </w:r>
+      <w:r>
+        <w:rPr>
+          <w:rFonts w:ascii="Times New Roman" w:hAnsi="Times New Roman" w:cs="Times New Roman"/>
+          <w:sz w:val="28"/>
+          <w:szCs w:val="28"/>
+        </w:rPr>
+        <w:t>Walk</w:t>
+      </w:r>
+      <w:r>
+        <w:rPr>
+          <w:rFonts w:ascii="Times New Roman" w:hAnsi="Times New Roman" w:cs="Times New Roman"/>
+          <w:sz w:val="28"/>
+          <w:szCs w:val="28"/>
+        </w:rPr>
+        <w:t>” e “</w:t>
+      </w:r>
+      <w:r>
+        <w:rPr>
+          <w:rFonts w:ascii="Times New Roman" w:hAnsi="Times New Roman" w:cs="Times New Roman"/>
+          <w:sz w:val="28"/>
+          <w:szCs w:val="28"/>
+        </w:rPr>
+        <w:t>Walk</w:t>
+      </w:r>
+      <w:r>
+        <w:rPr>
+          <w:rFonts w:ascii="Times New Roman" w:hAnsi="Times New Roman" w:cs="Times New Roman"/>
+          <w:sz w:val="28"/>
+          <w:szCs w:val="28"/>
+        </w:rPr>
+        <w:t xml:space="preserve"> and Talk” também são erroneamente classificadas.</w:t>
+      </w:r>
+      <w:r>
+        <w:rPr>
+          <w:rFonts w:ascii="Times New Roman" w:hAnsi="Times New Roman" w:cs="Times New Roman"/>
+          <w:sz w:val="28"/>
+          <w:szCs w:val="28"/>
+        </w:rPr>
+        <w:t xml:space="preserve"> </w:t>
+      </w:r>
+      <w:r>
+        <w:rPr>
+          <w:rFonts w:ascii="Times New Roman" w:hAnsi="Times New Roman" w:cs="Times New Roman"/>
+          <w:sz w:val="28"/>
+          <w:szCs w:val="28"/>
+        </w:rPr>
+        <w:t>Este comportamento sugere que os sinais capturados pelo modelo não são suficientemente discriminativos para distinguir atividades que diferem apenas por falar, possivelmente porque o fator de fala introduz variações sutis no padrão de movimento que se sobrepõem aos sinais da atividade principal.</w:t>
+      </w:r>
+    </w:p>
+    <w:p>
+      <w:pPr>
+        <w:jc w:val="both"/>
+        <w:rPr>
+          <w:rFonts w:ascii="Times New Roman" w:hAnsi="Times New Roman" w:cs="Times New Roman"/>
+          <w:sz w:val="28"/>
+          <w:szCs w:val="28"/>
+        </w:rPr>
+      </w:pPr>
+      <w:r>
+        <w:rPr>
+          <w:rFonts w:ascii="Times New Roman" w:hAnsi="Times New Roman" w:cs="Times New Roman"/>
+          <w:sz w:val="28"/>
+          <w:szCs w:val="28"/>
+        </w:rPr>
+        <w:t xml:space="preserve">                             </w:t>
+      </w:r>
+      <w:r>
+        <w:rPr>
+          <w:rFonts w:ascii="Times New Roman" w:hAnsi="Times New Roman" w:cs="Times New Roman"/>
+          <w:sz w:val="28"/>
+          <w:szCs w:val="28"/>
+        </w:rPr>
+        <w:t>Acurácia de modelo para cada atividade</w:t>
+      </w:r>
+      <w:r>
+        <w:rPr>
+          <w:rFonts w:ascii="Times New Roman" w:hAnsi="Times New Roman" w:cs="Times New Roman"/>
+          <w:sz w:val="28"/>
+          <w:szCs w:val="28"/>
+        </w:rPr>
+        <w:t xml:space="preserve">    </w:t>
+      </w:r>
+    </w:p>
+    <w:p>
+      <w:pPr>
+        <w:jc w:val="both"/>
+        <w:rPr>
+          <w:rFonts w:ascii="Times New Roman" w:hAnsi="Times New Roman" w:cs="Times New Roman"/>
+          <w:sz w:val="28"/>
+          <w:szCs w:val="28"/>
+        </w:rPr>
+      </w:pPr>
+    </w:p>
+    <w:p>
+      <w:pPr>
+        <w:jc w:val="both"/>
+        <w:rPr>
+          <w:rFonts w:ascii="Times New Roman" w:hAnsi="Times New Roman" w:cs="Times New Roman"/>
+          <w:sz w:val="28"/>
+          <w:szCs w:val="28"/>
+        </w:rPr>
+      </w:pPr>
+    </w:p>
+    <w:p>
+      <w:pPr>
+        <w:jc w:val="both"/>
+        <w:rPr>
+          <w:rFonts w:ascii="Times New Roman" w:hAnsi="Times New Roman" w:cs="Times New Roman"/>
+          <w:sz w:val="28"/>
+          <w:szCs w:val="28"/>
+        </w:rPr>
+      </w:pPr>
+      <w:r>
+        <w:rPr>
+          <w:rFonts w:ascii="Times New Roman" w:hAnsi="Times New Roman" w:cs="Times New Roman"/>
+          <w:sz w:val="28"/>
+          <w:szCs w:val="28"/>
+        </w:rPr>
+        <w:t xml:space="preserve"> </w:t>
+      </w:r>
+    </w:p>
+    <w:p>
+      <w:pPr>
+        <w:jc w:val="both"/>
+        <w:rPr>
+          <w:rFonts w:ascii="Times New Roman" w:hAnsi="Times New Roman" w:cs="Times New Roman"/>
+          <w:sz w:val="28"/>
+          <w:szCs w:val="28"/>
+        </w:rPr>
+      </w:pPr>
+      <w:r>
+        <w:rPr>
+          <w:rFonts w:ascii="Times New Roman" w:hAnsi="Times New Roman" w:cs="Times New Roman"/>
+          <w:sz w:val="28"/>
+          <w:szCs w:val="28"/>
+        </w:rPr>
         <w:lastRenderedPageBreak/>
-        <w:t>Avaliação dos Modelos</w:t>
-      </w:r>
-    </w:p>
-    <w:p>
-      <w:pPr>
-        <w:jc w:val="both"/>
-        <w:rPr>
-          <w:rFonts w:ascii="Times New Roman" w:hAnsi="Times New Roman" w:cs="Times New Roman"/>
-          <w:sz w:val="28"/>
-          <w:szCs w:val="28"/>
-        </w:rPr>
-      </w:pPr>
-      <w:r>
-        <w:rPr>
-          <w:rFonts w:ascii="Times New Roman" w:hAnsi="Times New Roman" w:cs="Times New Roman"/>
-          <w:sz w:val="28"/>
-          <w:szCs w:val="28"/>
-        </w:rPr>
-        <w:t>Observando a</w:t>
+        <w:drawing>
+          <wp:anchor distT="0" distB="0" distL="114300" distR="114300" simplePos="0" relativeHeight="251682816" behindDoc="1" locked="0" layoutInCell="1" allowOverlap="1" wp14:anchorId="785A15B2" wp14:editId="6111887B">
+            <wp:simplePos x="0" y="0"/>
+            <wp:positionH relativeFrom="column">
+              <wp:posOffset>2822164</wp:posOffset>
+            </wp:positionH>
+            <wp:positionV relativeFrom="paragraph">
+              <wp:posOffset>-597141</wp:posOffset>
+            </wp:positionV>
+            <wp:extent cx="2378568" cy="2131453"/>
+            <wp:effectExtent l="0" t="0" r="3175" b="2540"/>
+            <wp:wrapNone/>
+            <wp:docPr id="517364760" name="Picture 1" descr="A table of numbers with black text&#10;&#10;AI-generated content may be incorrect."/>
+            <wp:cNvGraphicFramePr>
+              <a:graphicFrameLocks xmlns:a="http://schemas.openxmlformats.org/drawingml/2006/main" noChangeAspect="1"/>
+            </wp:cNvGraphicFramePr>
+            <a:graphic xmlns:a="http://schemas.openxmlformats.org/drawingml/2006/main">
+              <a:graphicData uri="http://schemas.openxmlformats.org/drawingml/2006/picture">
+                <pic:pic xmlns:pic="http://schemas.openxmlformats.org/drawingml/2006/picture">
+                  <pic:nvPicPr>
+                    <pic:cNvPr id="517364760" name="Picture 1" descr="A table of numbers with black text&#10;&#10;AI-generated content may be incorrect."/>
+                    <pic:cNvPicPr/>
+                  </pic:nvPicPr>
+                  <pic:blipFill>
+                    <a:blip r:embed="rId24">
+                      <a:extLst>
+                        <a:ext uri="{28A0092B-C50C-407E-A947-70E740481C1C}">
+                          <a14:useLocalDpi xmlns:a14="http://schemas.microsoft.com/office/drawing/2010/main" val="0"/>
+                        </a:ext>
+                      </a:extLst>
+                    </a:blip>
+                    <a:stretch>
+                      <a:fillRect/>
+                    </a:stretch>
+                  </pic:blipFill>
+                  <pic:spPr>
+                    <a:xfrm>
+                      <a:off x="0" y="0"/>
+                      <a:ext cx="2393321" cy="2144673"/>
+                    </a:xfrm>
+                    <a:prstGeom prst="rect">
+                      <a:avLst/>
+                    </a:prstGeom>
+                  </pic:spPr>
+                </pic:pic>
+              </a:graphicData>
+            </a:graphic>
+            <wp14:sizeRelH relativeFrom="margin">
+              <wp14:pctWidth>0</wp14:pctWidth>
+            </wp14:sizeRelH>
+            <wp14:sizeRelV relativeFrom="margin">
+              <wp14:pctHeight>0</wp14:pctHeight>
+            </wp14:sizeRelV>
+          </wp:anchor>
+        </w:drawing>
+      </w:r>
+      <w:r>
+        <w:rPr>
+          <w:rFonts w:ascii="Times New Roman" w:hAnsi="Times New Roman" w:cs="Times New Roman"/>
+          <w:sz w:val="28"/>
+          <w:szCs w:val="28"/>
+        </w:rPr>
+        <w:t xml:space="preserve"> </w:t>
+      </w:r>
+      <w:r>
+        <w:rPr>
+          <w:rFonts w:ascii="Times New Roman" w:hAnsi="Times New Roman" w:cs="Times New Roman"/>
+          <w:sz w:val="28"/>
+          <w:szCs w:val="28"/>
+        </w:rPr>
+        <w:drawing>
+          <wp:anchor distT="0" distB="0" distL="114300" distR="114300" simplePos="0" relativeHeight="251681792" behindDoc="1" locked="0" layoutInCell="1" allowOverlap="1" wp14:anchorId="1AD91FEF" wp14:editId="0763EE37">
+            <wp:simplePos x="0" y="0"/>
+            <wp:positionH relativeFrom="margin">
+              <wp:posOffset>-128788</wp:posOffset>
+            </wp:positionH>
+            <wp:positionV relativeFrom="paragraph">
+              <wp:posOffset>-596909</wp:posOffset>
+            </wp:positionV>
+            <wp:extent cx="2611062" cy="2154511"/>
+            <wp:effectExtent l="0" t="0" r="0" b="0"/>
+            <wp:wrapNone/>
+            <wp:docPr id="1411210881" name="Picture 1" descr="A table of numbers with numbers on it&#10;&#10;AI-generated content may be incorrect."/>
+            <wp:cNvGraphicFramePr>
+              <a:graphicFrameLocks xmlns:a="http://schemas.openxmlformats.org/drawingml/2006/main" noChangeAspect="1"/>
+            </wp:cNvGraphicFramePr>
+            <a:graphic xmlns:a="http://schemas.openxmlformats.org/drawingml/2006/main">
+              <a:graphicData uri="http://schemas.openxmlformats.org/drawingml/2006/picture">
+                <pic:pic xmlns:pic="http://schemas.openxmlformats.org/drawingml/2006/picture">
+                  <pic:nvPicPr>
+                    <pic:cNvPr id="1411210881" name="Picture 1" descr="A table of numbers with numbers on it&#10;&#10;AI-generated content may be incorrect."/>
+                    <pic:cNvPicPr/>
+                  </pic:nvPicPr>
+                  <pic:blipFill>
+                    <a:blip r:embed="rId25">
+                      <a:extLst>
+                        <a:ext uri="{28A0092B-C50C-407E-A947-70E740481C1C}">
+                          <a14:useLocalDpi xmlns:a14="http://schemas.microsoft.com/office/drawing/2010/main" val="0"/>
+                        </a:ext>
+                      </a:extLst>
+                    </a:blip>
+                    <a:stretch>
+                      <a:fillRect/>
+                    </a:stretch>
+                  </pic:blipFill>
+                  <pic:spPr>
+                    <a:xfrm>
+                      <a:off x="0" y="0"/>
+                      <a:ext cx="2611062" cy="2154511"/>
+                    </a:xfrm>
+                    <a:prstGeom prst="rect">
+                      <a:avLst/>
+                    </a:prstGeom>
+                  </pic:spPr>
+                </pic:pic>
+              </a:graphicData>
+            </a:graphic>
+            <wp14:sizeRelH relativeFrom="margin">
+              <wp14:pctWidth>0</wp14:pctWidth>
+            </wp14:sizeRelH>
+            <wp14:sizeRelV relativeFrom="margin">
+              <wp14:pctHeight>0</wp14:pctHeight>
+            </wp14:sizeRelV>
+          </wp:anchor>
+        </w:drawing>
+      </w:r>
+    </w:p>
+    <w:p>
+      <w:pPr>
+        <w:jc w:val="both"/>
+        <w:rPr>
+          <w:rFonts w:ascii="Times New Roman" w:hAnsi="Times New Roman" w:cs="Times New Roman"/>
+          <w:sz w:val="28"/>
+          <w:szCs w:val="28"/>
+        </w:rPr>
+      </w:pPr>
+    </w:p>
+    <w:p>
+      <w:pPr>
+        <w:jc w:val="both"/>
+        <w:rPr>
+          <w:rFonts w:ascii="Times New Roman" w:hAnsi="Times New Roman" w:cs="Times New Roman"/>
+          <w:sz w:val="28"/>
+          <w:szCs w:val="28"/>
+        </w:rPr>
+      </w:pPr>
+    </w:p>
+    <w:p>
+      <w:pPr>
+        <w:jc w:val="both"/>
+        <w:rPr>
+          <w:rFonts w:ascii="Times New Roman" w:hAnsi="Times New Roman" w:cs="Times New Roman"/>
+          <w:sz w:val="28"/>
+          <w:szCs w:val="28"/>
+        </w:rPr>
+      </w:pPr>
+      <w:r>
+        <w:rPr>
+          <w:rFonts w:ascii="Times New Roman" w:hAnsi="Times New Roman" w:cs="Times New Roman"/>
+          <w:sz w:val="28"/>
+          <w:szCs w:val="28"/>
+        </w:rPr>
+        <w:t xml:space="preserve">                                 </w:t>
+      </w:r>
+    </w:p>
+    <w:p>
+      <w:pPr>
+        <w:jc w:val="both"/>
+        <w:rPr>
+          <w:rFonts w:ascii="Times New Roman" w:hAnsi="Times New Roman" w:cs="Times New Roman"/>
+          <w:sz w:val="28"/>
+          <w:szCs w:val="28"/>
+        </w:rPr>
+      </w:pPr>
+    </w:p>
+    <w:p>
+      <w:pPr>
+        <w:jc w:val="both"/>
+        <w:rPr>
+          <w:rFonts w:ascii="Times New Roman" w:hAnsi="Times New Roman" w:cs="Times New Roman"/>
+          <w:sz w:val="28"/>
+          <w:szCs w:val="28"/>
+        </w:rPr>
+      </w:pPr>
+      <w:r>
+        <w:rPr>
+          <w:rFonts w:ascii="Times New Roman" w:hAnsi="Times New Roman" w:cs="Times New Roman"/>
+          <w:sz w:val="28"/>
+          <w:szCs w:val="28"/>
+        </w:rPr>
+        <w:t xml:space="preserve">                               </w:t>
+      </w:r>
+      <w:r>
+        <w:rPr>
+          <w:rFonts w:ascii="Times New Roman" w:hAnsi="Times New Roman" w:cs="Times New Roman"/>
+          <w:sz w:val="28"/>
+          <w:szCs w:val="28"/>
+        </w:rPr>
+        <w:t>Exemplo</w:t>
       </w:r>
       <w:r>
         <w:rPr>
@@ -7280,87 +8024,175 @@
           <w:sz w:val="28"/>
           <w:szCs w:val="28"/>
         </w:rPr>
-        <w:t xml:space="preserve"> matriz</w:t>
-      </w:r>
-      <w:r>
-        <w:rPr>
-          <w:rFonts w:ascii="Times New Roman" w:hAnsi="Times New Roman" w:cs="Times New Roman"/>
-          <w:sz w:val="28"/>
-          <w:szCs w:val="28"/>
-        </w:rPr>
-        <w:t>es</w:t>
-      </w:r>
-      <w:r>
-        <w:rPr>
-          <w:rFonts w:ascii="Times New Roman" w:hAnsi="Times New Roman" w:cs="Times New Roman"/>
-          <w:sz w:val="28"/>
-          <w:szCs w:val="28"/>
-        </w:rPr>
-        <w:t xml:space="preserve"> de confusão, nota-se que há uma confusão significativa entre pares de atividades muito semelhantes, sobretudo aquelas que diferem apenas pela presença da fala. Por exemplo, as classes 2 e 3 apresentam elevada taxa de erro cruzado, indicando que o modelo frequentemente confunde “</w:t>
-      </w:r>
-      <w:r>
-        <w:rPr>
-          <w:rFonts w:ascii="Times New Roman" w:hAnsi="Times New Roman" w:cs="Times New Roman"/>
-          <w:sz w:val="28"/>
-          <w:szCs w:val="28"/>
-        </w:rPr>
-        <w:t>Sit</w:t>
-      </w:r>
-      <w:r>
-        <w:rPr>
-          <w:rFonts w:ascii="Times New Roman" w:hAnsi="Times New Roman" w:cs="Times New Roman"/>
-          <w:sz w:val="28"/>
-          <w:szCs w:val="28"/>
-        </w:rPr>
-        <w:t>” com “</w:t>
-      </w:r>
-      <w:r>
-        <w:rPr>
-          <w:rFonts w:ascii="Times New Roman" w:hAnsi="Times New Roman" w:cs="Times New Roman"/>
-          <w:sz w:val="28"/>
-          <w:szCs w:val="28"/>
-        </w:rPr>
-        <w:t>Sit</w:t>
-      </w:r>
-      <w:r>
-        <w:rPr>
-          <w:rFonts w:ascii="Times New Roman" w:hAnsi="Times New Roman" w:cs="Times New Roman"/>
-          <w:sz w:val="28"/>
-          <w:szCs w:val="28"/>
-        </w:rPr>
-        <w:t xml:space="preserve"> and Talk”. Um padrão semelhante é observado entre as classes 4 e 5, onde “</w:t>
-      </w:r>
-      <w:r>
-        <w:rPr>
-          <w:rFonts w:ascii="Times New Roman" w:hAnsi="Times New Roman" w:cs="Times New Roman"/>
-          <w:sz w:val="28"/>
-          <w:szCs w:val="28"/>
-        </w:rPr>
-        <w:t>Walk</w:t>
-      </w:r>
-      <w:r>
-        <w:rPr>
-          <w:rFonts w:ascii="Times New Roman" w:hAnsi="Times New Roman" w:cs="Times New Roman"/>
-          <w:sz w:val="28"/>
-          <w:szCs w:val="28"/>
-        </w:rPr>
-        <w:t>” e “</w:t>
-      </w:r>
-      <w:r>
-        <w:rPr>
-          <w:rFonts w:ascii="Times New Roman" w:hAnsi="Times New Roman" w:cs="Times New Roman"/>
-          <w:sz w:val="28"/>
-          <w:szCs w:val="28"/>
-        </w:rPr>
-        <w:t>Walk</w:t>
-      </w:r>
-      <w:r>
-        <w:rPr>
-          <w:rFonts w:ascii="Times New Roman" w:hAnsi="Times New Roman" w:cs="Times New Roman"/>
-          <w:sz w:val="28"/>
-          <w:szCs w:val="28"/>
-        </w:rPr>
-        <w:t xml:space="preserve"> and Talk” também são erroneamente classificadas.</w:t>
+        <w:t xml:space="preserve"> de Matriz de Confusão</w:t>
+      </w:r>
+    </w:p>
+    <w:p>
+      <w:pPr>
+        <w:jc w:val="both"/>
+        <w:rPr>
+          <w:rFonts w:ascii="Times New Roman" w:hAnsi="Times New Roman" w:cs="Times New Roman"/>
+          <w:sz w:val="28"/>
+          <w:szCs w:val="28"/>
+        </w:rPr>
+      </w:pPr>
+      <w:r>
+        <w:rPr>
+          <w:rFonts w:ascii="Times New Roman" w:hAnsi="Times New Roman" w:cs="Times New Roman"/>
+          <w:sz w:val="28"/>
+          <w:szCs w:val="28"/>
+        </w:rPr>
+        <w:drawing>
+          <wp:anchor distT="0" distB="0" distL="114300" distR="114300" simplePos="0" relativeHeight="251679744" behindDoc="1" locked="0" layoutInCell="1" allowOverlap="1" wp14:anchorId="259279E3" wp14:editId="13EAD581">
+            <wp:simplePos x="0" y="0"/>
+            <wp:positionH relativeFrom="margin">
+              <wp:align>left</wp:align>
+            </wp:positionH>
+            <wp:positionV relativeFrom="paragraph">
+              <wp:posOffset>4039691</wp:posOffset>
+            </wp:positionV>
+            <wp:extent cx="5458460" cy="1735455"/>
+            <wp:effectExtent l="0" t="0" r="8890" b="0"/>
+            <wp:wrapThrough wrapText="bothSides">
+              <wp:wrapPolygon edited="0">
+                <wp:start x="0" y="0"/>
+                <wp:lineTo x="0" y="21339"/>
+                <wp:lineTo x="21560" y="21339"/>
+                <wp:lineTo x="21560" y="0"/>
+                <wp:lineTo x="0" y="0"/>
+              </wp:wrapPolygon>
+            </wp:wrapThrough>
+            <wp:docPr id="286008633" name="Picture 1" descr="A table of numbers and a few black text&#10;&#10;AI-generated content may be incorrect."/>
+            <wp:cNvGraphicFramePr>
+              <a:graphicFrameLocks xmlns:a="http://schemas.openxmlformats.org/drawingml/2006/main" noChangeAspect="1"/>
+            </wp:cNvGraphicFramePr>
+            <a:graphic xmlns:a="http://schemas.openxmlformats.org/drawingml/2006/main">
+              <a:graphicData uri="http://schemas.openxmlformats.org/drawingml/2006/picture">
+                <pic:pic xmlns:pic="http://schemas.openxmlformats.org/drawingml/2006/picture">
+                  <pic:nvPicPr>
+                    <pic:cNvPr id="286008633" name="Picture 1" descr="A table of numbers and a few black text&#10;&#10;AI-generated content may be incorrect."/>
+                    <pic:cNvPicPr/>
+                  </pic:nvPicPr>
+                  <pic:blipFill>
+                    <a:blip r:embed="rId26">
+                      <a:extLst>
+                        <a:ext uri="{28A0092B-C50C-407E-A947-70E740481C1C}">
+                          <a14:useLocalDpi xmlns:a14="http://schemas.microsoft.com/office/drawing/2010/main" val="0"/>
+                        </a:ext>
+                      </a:extLst>
+                    </a:blip>
+                    <a:stretch>
+                      <a:fillRect/>
+                    </a:stretch>
+                  </pic:blipFill>
+                  <pic:spPr>
+                    <a:xfrm>
+                      <a:off x="0" y="0"/>
+                      <a:ext cx="5458460" cy="1735455"/>
+                    </a:xfrm>
+                    <a:prstGeom prst="rect">
+                      <a:avLst/>
+                    </a:prstGeom>
+                  </pic:spPr>
+                </pic:pic>
+              </a:graphicData>
+            </a:graphic>
+            <wp14:sizeRelH relativeFrom="margin">
+              <wp14:pctWidth>0</wp14:pctWidth>
+            </wp14:sizeRelH>
+            <wp14:sizeRelV relativeFrom="margin">
+              <wp14:pctHeight>0</wp14:pctHeight>
+            </wp14:sizeRelV>
+          </wp:anchor>
+        </w:drawing>
+      </w:r>
+      <w:r>
+        <w:rPr>
+          <w:rFonts w:ascii="Times New Roman" w:hAnsi="Times New Roman" w:cs="Times New Roman"/>
+          <w:sz w:val="28"/>
+          <w:szCs w:val="28"/>
+        </w:rPr>
+        <w:t>Fica</w:t>
+      </w:r>
+      <w:r>
+        <w:rPr>
+          <w:rFonts w:ascii="Times New Roman" w:hAnsi="Times New Roman" w:cs="Times New Roman"/>
+          <w:sz w:val="28"/>
+          <w:szCs w:val="28"/>
+        </w:rPr>
+        <w:t xml:space="preserve"> também</w:t>
+      </w:r>
+      <w:r>
+        <w:rPr>
+          <w:rFonts w:ascii="Times New Roman" w:hAnsi="Times New Roman" w:cs="Times New Roman"/>
+          <w:sz w:val="28"/>
+          <w:szCs w:val="28"/>
+        </w:rPr>
+        <w:t xml:space="preserve"> claro que os </w:t>
+      </w:r>
+      <w:r>
+        <w:rPr>
+          <w:rFonts w:ascii="Times New Roman" w:hAnsi="Times New Roman" w:cs="Times New Roman"/>
+          <w:sz w:val="28"/>
+          <w:szCs w:val="28"/>
+        </w:rPr>
+        <w:t>modelos baseados em features</w:t>
+      </w:r>
+      <w:r>
+        <w:rPr>
+          <w:rFonts w:ascii="Times New Roman" w:hAnsi="Times New Roman" w:cs="Times New Roman"/>
+          <w:sz w:val="28"/>
+          <w:szCs w:val="28"/>
+        </w:rPr>
+        <w:t xml:space="preserve"> superaram consistentemente os baseados em embeddings em todos os cenários. Esse padrão repete-se em todas as variações dos datasets </w:t>
+      </w:r>
+      <w:r>
+        <w:rPr>
+          <w:rFonts w:ascii="Times New Roman" w:hAnsi="Times New Roman" w:cs="Times New Roman"/>
+          <w:sz w:val="28"/>
+          <w:szCs w:val="28"/>
+        </w:rPr>
+        <w:t xml:space="preserve">intra-participante </w:t>
+      </w:r>
+      <w:r>
+        <w:rPr>
+          <w:rFonts w:ascii="Times New Roman" w:hAnsi="Times New Roman" w:cs="Times New Roman"/>
+          <w:sz w:val="28"/>
+          <w:szCs w:val="28"/>
+        </w:rPr>
+        <w:t xml:space="preserve">e </w:t>
+      </w:r>
+      <w:r>
+        <w:rPr>
+          <w:rFonts w:ascii="Times New Roman" w:hAnsi="Times New Roman" w:cs="Times New Roman"/>
+          <w:sz w:val="28"/>
+          <w:szCs w:val="28"/>
+        </w:rPr>
+        <w:t>inter-participante</w:t>
+      </w:r>
+      <w:r>
+        <w:rPr>
+          <w:rFonts w:ascii="Times New Roman" w:hAnsi="Times New Roman" w:cs="Times New Roman"/>
+          <w:sz w:val="28"/>
+          <w:szCs w:val="28"/>
+        </w:rPr>
+        <w:t>. Es</w:t>
+      </w:r>
+      <w:r>
+        <w:rPr>
+          <w:rFonts w:ascii="Times New Roman" w:hAnsi="Times New Roman" w:cs="Times New Roman"/>
+          <w:sz w:val="28"/>
+          <w:szCs w:val="28"/>
+        </w:rPr>
+        <w:t>t</w:t>
+      </w:r>
+      <w:r>
+        <w:rPr>
+          <w:rFonts w:ascii="Times New Roman" w:hAnsi="Times New Roman" w:cs="Times New Roman"/>
+          <w:sz w:val="28"/>
+          <w:szCs w:val="28"/>
+        </w:rPr>
+        <w:t>es resultados indicam que</w:t>
       </w:r>
       <w:r>
         <w:rPr>
@@ -7376,105 +8208,79 @@
           <w:sz w:val="28"/>
           <w:szCs w:val="28"/>
         </w:rPr>
-        <w:t>Este comportamento sugere que os sinais capturados pelo modelo não são suficientemente discriminativos para distinguir atividades que diferem apenas por falar, possivelmente porque o fator de fala introduz variações sutis no padrão de movimento que se sobrepõem aos sinais da atividade principal.</w:t>
-      </w:r>
-    </w:p>
-    <w:p>
-      <w:pPr>
-        <w:jc w:val="both"/>
-        <w:rPr>
-          <w:rFonts w:ascii="Times New Roman" w:hAnsi="Times New Roman" w:cs="Times New Roman"/>
-          <w:sz w:val="28"/>
-          <w:szCs w:val="28"/>
-        </w:rPr>
-      </w:pPr>
-      <w:r>
-        <w:rPr>
-          <w:rFonts w:ascii="Times New Roman" w:hAnsi="Times New Roman" w:cs="Times New Roman"/>
-          <w:sz w:val="28"/>
-          <w:szCs w:val="28"/>
-        </w:rPr>
-        <w:t>Fica</w:t>
-      </w:r>
-      <w:r>
-        <w:rPr>
-          <w:rFonts w:ascii="Times New Roman" w:hAnsi="Times New Roman" w:cs="Times New Roman"/>
-          <w:sz w:val="28"/>
-          <w:szCs w:val="28"/>
-        </w:rPr>
-        <w:t xml:space="preserve"> também</w:t>
-      </w:r>
-      <w:r>
-        <w:rPr>
-          <w:rFonts w:ascii="Times New Roman" w:hAnsi="Times New Roman" w:cs="Times New Roman"/>
-          <w:sz w:val="28"/>
-          <w:szCs w:val="28"/>
-        </w:rPr>
-        <w:t xml:space="preserve"> claro que os </w:t>
-      </w:r>
-      <w:r>
-        <w:rPr>
-          <w:rFonts w:ascii="Times New Roman" w:hAnsi="Times New Roman" w:cs="Times New Roman"/>
-          <w:sz w:val="28"/>
-          <w:szCs w:val="28"/>
-        </w:rPr>
-        <w:t>modelos baseados em features</w:t>
-      </w:r>
-      <w:r>
-        <w:rPr>
-          <w:rFonts w:ascii="Times New Roman" w:hAnsi="Times New Roman" w:cs="Times New Roman"/>
-          <w:sz w:val="28"/>
-          <w:szCs w:val="28"/>
-        </w:rPr>
-        <w:t xml:space="preserve"> superaram consistentemente os baseados em embeddings em todos os cenários. Esse padrão repete-se em todas as variações dos datasets </w:t>
-      </w:r>
-      <w:r>
-        <w:rPr>
-          <w:rFonts w:ascii="Times New Roman" w:hAnsi="Times New Roman" w:cs="Times New Roman"/>
-          <w:sz w:val="28"/>
-          <w:szCs w:val="28"/>
-        </w:rPr>
-        <w:t xml:space="preserve">intra-participante </w:t>
-      </w:r>
-      <w:r>
-        <w:rPr>
-          <w:rFonts w:ascii="Times New Roman" w:hAnsi="Times New Roman" w:cs="Times New Roman"/>
-          <w:sz w:val="28"/>
-          <w:szCs w:val="28"/>
-        </w:rPr>
-        <w:t xml:space="preserve">e </w:t>
-      </w:r>
-      <w:r>
-        <w:rPr>
-          <w:rFonts w:ascii="Times New Roman" w:hAnsi="Times New Roman" w:cs="Times New Roman"/>
-          <w:sz w:val="28"/>
-          <w:szCs w:val="28"/>
-        </w:rPr>
-        <w:t>int</w:t>
-      </w:r>
-      <w:r>
-        <w:rPr>
-          <w:rFonts w:ascii="Times New Roman" w:hAnsi="Times New Roman" w:cs="Times New Roman"/>
-          <w:sz w:val="28"/>
-          <w:szCs w:val="28"/>
-        </w:rPr>
-        <w:t>er</w:t>
-      </w:r>
-      <w:r>
-        <w:rPr>
-          <w:rFonts w:ascii="Times New Roman" w:hAnsi="Times New Roman" w:cs="Times New Roman"/>
-          <w:sz w:val="28"/>
-          <w:szCs w:val="28"/>
-        </w:rPr>
-        <w:t>-participante</w:t>
-      </w:r>
-      <w:r>
-        <w:rPr>
-          <w:rFonts w:ascii="Times New Roman" w:hAnsi="Times New Roman" w:cs="Times New Roman"/>
-          <w:sz w:val="28"/>
-          <w:szCs w:val="28"/>
-        </w:rPr>
-        <w:t>. Es</w:t>
+        <w:t>as features extraídas manualmente</w:t>
+      </w:r>
+      <w:r>
+        <w:rPr>
+          <w:rFonts w:ascii="Times New Roman" w:hAnsi="Times New Roman" w:cs="Times New Roman"/>
+          <w:sz w:val="28"/>
+          <w:szCs w:val="28"/>
+        </w:rPr>
+        <w:t xml:space="preserve"> </w:t>
+      </w:r>
+      <w:r>
+        <w:rPr>
+          <w:rFonts w:ascii="Times New Roman" w:hAnsi="Times New Roman" w:cs="Times New Roman"/>
+          <w:sz w:val="28"/>
+          <w:szCs w:val="28"/>
+        </w:rPr>
+        <w:t>fornecem sinais mais discriminativos para a classificação das atividades do que</w:t>
+      </w:r>
+      <w:r>
+        <w:rPr>
+          <w:rFonts w:ascii="Times New Roman" w:hAnsi="Times New Roman" w:cs="Times New Roman"/>
+          <w:sz w:val="28"/>
+          <w:szCs w:val="28"/>
+        </w:rPr>
+        <w:t xml:space="preserve"> embeddings</w:t>
+      </w:r>
+      <w:r>
+        <w:rPr>
+          <w:rFonts w:ascii="Times New Roman" w:hAnsi="Times New Roman" w:cs="Times New Roman"/>
+          <w:sz w:val="28"/>
+          <w:szCs w:val="28"/>
+        </w:rPr>
+        <w:t>. Os embeddings parecem perder informações importantes para distinguir entre atividades, sobretudo quando há variações sutis entre classes.</w:t>
+      </w:r>
+      <w:r>
+        <w:rPr>
+          <w:rFonts w:ascii="Times New Roman" w:hAnsi="Times New Roman" w:cs="Times New Roman"/>
+          <w:sz w:val="28"/>
+          <w:szCs w:val="28"/>
+        </w:rPr>
+        <w:t xml:space="preserve"> </w:t>
+      </w:r>
+      <w:r>
+        <w:rPr>
+          <w:rFonts w:ascii="Times New Roman" w:hAnsi="Times New Roman" w:cs="Times New Roman"/>
+          <w:sz w:val="28"/>
+          <w:szCs w:val="28"/>
+        </w:rPr>
+        <w:t>O</w:t>
+      </w:r>
+      <w:r>
+        <w:rPr>
+          <w:rFonts w:ascii="Times New Roman" w:hAnsi="Times New Roman" w:cs="Times New Roman"/>
+          <w:sz w:val="28"/>
+          <w:szCs w:val="28"/>
+        </w:rPr>
+        <w:t xml:space="preserve"> efeito da seleção de features, observa-se que </w:t>
+      </w:r>
+      <w:r>
+        <w:rPr>
+          <w:rFonts w:ascii="Times New Roman" w:hAnsi="Times New Roman" w:cs="Times New Roman"/>
+          <w:sz w:val="28"/>
+          <w:szCs w:val="28"/>
+        </w:rPr>
+        <w:t>o cenário</w:t>
+      </w:r>
+      <w:r>
+        <w:rPr>
+          <w:rFonts w:ascii="Times New Roman" w:hAnsi="Times New Roman" w:cs="Times New Roman"/>
+          <w:sz w:val="28"/>
+          <w:szCs w:val="28"/>
+        </w:rPr>
+        <w:t xml:space="preserve"> A de cada dataset apresentou consistentemente o melhor desempenho, enquanto as versões B e C, que representam variações com menos features, registraram quedas nas métricas. Es</w:t>
       </w:r>
       <w:r>
         <w:rPr>
@@ -7490,112 +8296,6 @@
           <w:sz w:val="28"/>
           <w:szCs w:val="28"/>
         </w:rPr>
-        <w:t>es resultados indicam que</w:t>
-      </w:r>
-      <w:r>
-        <w:rPr>
-          <w:rFonts w:ascii="Times New Roman" w:hAnsi="Times New Roman" w:cs="Times New Roman"/>
-          <w:sz w:val="28"/>
-          <w:szCs w:val="28"/>
-        </w:rPr>
-        <w:t xml:space="preserve"> </w:t>
-      </w:r>
-      <w:r>
-        <w:rPr>
-          <w:rFonts w:ascii="Times New Roman" w:hAnsi="Times New Roman" w:cs="Times New Roman"/>
-          <w:sz w:val="28"/>
-          <w:szCs w:val="28"/>
-        </w:rPr>
-        <w:t>as features extraídas manualmente</w:t>
-      </w:r>
-      <w:r>
-        <w:rPr>
-          <w:rFonts w:ascii="Times New Roman" w:hAnsi="Times New Roman" w:cs="Times New Roman"/>
-          <w:sz w:val="28"/>
-          <w:szCs w:val="28"/>
-        </w:rPr>
-        <w:t xml:space="preserve"> </w:t>
-      </w:r>
-      <w:r>
-        <w:rPr>
-          <w:rFonts w:ascii="Times New Roman" w:hAnsi="Times New Roman" w:cs="Times New Roman"/>
-          <w:sz w:val="28"/>
-          <w:szCs w:val="28"/>
-        </w:rPr>
-        <w:t>fornecem sinais mais discriminativos para a classificação das atividades do que</w:t>
-      </w:r>
-      <w:r>
-        <w:rPr>
-          <w:rFonts w:ascii="Times New Roman" w:hAnsi="Times New Roman" w:cs="Times New Roman"/>
-          <w:sz w:val="28"/>
-          <w:szCs w:val="28"/>
-        </w:rPr>
-        <w:t xml:space="preserve"> embeddings</w:t>
-      </w:r>
-      <w:r>
-        <w:rPr>
-          <w:rFonts w:ascii="Times New Roman" w:hAnsi="Times New Roman" w:cs="Times New Roman"/>
-          <w:sz w:val="28"/>
-          <w:szCs w:val="28"/>
-        </w:rPr>
-        <w:t>. Os embeddings parecem perder informações importantes para distinguir entre atividades, sobretudo quando há variações sutis entre classes.</w:t>
-      </w:r>
-    </w:p>
-    <w:p>
-      <w:pPr>
-        <w:jc w:val="both"/>
-        <w:rPr>
-          <w:rFonts w:ascii="Times New Roman" w:hAnsi="Times New Roman" w:cs="Times New Roman"/>
-          <w:sz w:val="28"/>
-          <w:szCs w:val="28"/>
-        </w:rPr>
-      </w:pPr>
-      <w:r>
-        <w:rPr>
-          <w:rFonts w:ascii="Times New Roman" w:hAnsi="Times New Roman" w:cs="Times New Roman"/>
-          <w:sz w:val="28"/>
-          <w:szCs w:val="28"/>
-        </w:rPr>
-        <w:t>O</w:t>
-      </w:r>
-      <w:r>
-        <w:rPr>
-          <w:rFonts w:ascii="Times New Roman" w:hAnsi="Times New Roman" w:cs="Times New Roman"/>
-          <w:sz w:val="28"/>
-          <w:szCs w:val="28"/>
-        </w:rPr>
-        <w:t xml:space="preserve"> efeito da seleção de features, observa-se que </w:t>
-      </w:r>
-      <w:r>
-        <w:rPr>
-          <w:rFonts w:ascii="Times New Roman" w:hAnsi="Times New Roman" w:cs="Times New Roman"/>
-          <w:sz w:val="28"/>
-          <w:szCs w:val="28"/>
-        </w:rPr>
-        <w:t>o cenário</w:t>
-      </w:r>
-      <w:r>
-        <w:rPr>
-          <w:rFonts w:ascii="Times New Roman" w:hAnsi="Times New Roman" w:cs="Times New Roman"/>
-          <w:sz w:val="28"/>
-          <w:szCs w:val="28"/>
-        </w:rPr>
-        <w:t xml:space="preserve"> A de cada dataset apresentou consistentemente o melhor desempenho, enquanto as versões B e C, que representam variações com menos features, registraram quedas nas métricas. Es</w:t>
-      </w:r>
-      <w:r>
-        <w:rPr>
-          <w:rFonts w:ascii="Times New Roman" w:hAnsi="Times New Roman" w:cs="Times New Roman"/>
-          <w:sz w:val="28"/>
-          <w:szCs w:val="28"/>
-        </w:rPr>
-        <w:t>t</w:t>
-      </w:r>
-      <w:r>
-        <w:rPr>
-          <w:rFonts w:ascii="Times New Roman" w:hAnsi="Times New Roman" w:cs="Times New Roman"/>
-          <w:sz w:val="28"/>
-          <w:szCs w:val="28"/>
-        </w:rPr>
         <w:t>e padrão sugere que a seleção de features não melhorou o desempenho</w:t>
       </w:r>
       <w:r>
@@ -7624,16 +8324,14 @@
           <w:szCs w:val="28"/>
         </w:rPr>
       </w:pPr>
-    </w:p>
-    <w:p>
-      <w:pPr>
-        <w:jc w:val="both"/>
-        <w:rPr>
-          <w:rFonts w:ascii="Times New Roman" w:hAnsi="Times New Roman" w:cs="Times New Roman"/>
-          <w:sz w:val="28"/>
-          <w:szCs w:val="28"/>
-        </w:rPr>
-      </w:pPr>
+      <w:r>
+        <w:rPr>
+          <w:rFonts w:ascii="Times New Roman" w:hAnsi="Times New Roman" w:cs="Times New Roman"/>
+          <w:sz w:val="28"/>
+          <w:szCs w:val="28"/>
+        </w:rPr>
+        <w:t xml:space="preserve">                                              Tabela de Métricas</w:t>
+      </w:r>
     </w:p>
     <w:p>
       <w:pPr>
@@ -7681,68 +8379,984 @@
     </w:p>
     <w:p>
       <w:pPr>
-        <w:jc w:val="both"/>
-        <w:rPr>
-          <w:rFonts w:ascii="Times New Roman" w:hAnsi="Times New Roman" w:cs="Times New Roman"/>
-          <w:sz w:val="28"/>
-          <w:szCs w:val="28"/>
-        </w:rPr>
-      </w:pPr>
-      <w:r>
-        <w:rPr>
-          <w:rFonts w:ascii="Times New Roman" w:hAnsi="Times New Roman" w:cs="Times New Roman"/>
-          <w:sz w:val="28"/>
-          <w:szCs w:val="28"/>
-        </w:rPr>
-        <w:t>Para determinar se as diferenças entre modelos eram estatisticamente significativas, repetiu-se todo o processo train → validation → test várias vezes, obtendo distribuições de F1-score para cada um dos 12 modelos.</w:t>
-      </w:r>
-    </w:p>
-    <w:p>
-      <w:pPr>
-        <w:jc w:val="both"/>
-        <w:rPr>
-          <w:rFonts w:ascii="Times New Roman" w:hAnsi="Times New Roman" w:cs="Times New Roman"/>
-          <w:sz w:val="28"/>
-          <w:szCs w:val="28"/>
-        </w:rPr>
-      </w:pPr>
-      <w:r>
-        <w:rPr>
-          <w:rFonts w:ascii="Times New Roman" w:hAnsi="Times New Roman" w:cs="Times New Roman"/>
-          <w:sz w:val="28"/>
-          <w:szCs w:val="28"/>
-        </w:rPr>
-        <w:t>Como as distribuições não satisfaziam o pressuposto de normalidade, aplicaram-se testes não paramétricos:</w:t>
-      </w:r>
-    </w:p>
-    <w:p>
-      <w:pPr>
+        <w:spacing w:before="100" w:beforeAutospacing="1" w:after="100" w:afterAutospacing="1" w:line="240" w:lineRule="auto"/>
+        <w:jc w:val="both"/>
+        <w:rPr>
+          <w:rFonts w:ascii="Times New Roman" w:eastAsia="Times New Roman" w:hAnsi="Times New Roman" w:cs="Times New Roman"/>
+          <w:kern w:val="0"/>
+          <w:sz w:val="28"/>
+          <w:szCs w:val="28"/>
+          <w:lang w:eastAsia="pt-PT"/>
+          <w14:ligatures w14:val="none"/>
+        </w:rPr>
+      </w:pPr>
+      <w:r>
+        <w:rPr>
+          <w:rFonts w:ascii="Times New Roman" w:eastAsia="Times New Roman" w:hAnsi="Times New Roman" w:cs="Times New Roman"/>
+          <w:kern w:val="0"/>
+          <w:sz w:val="28"/>
+          <w:szCs w:val="28"/>
+          <w:lang w:eastAsia="pt-PT"/>
+          <w14:ligatures w14:val="none"/>
+        </w:rPr>
+        <w:t>A validação final do desempenho baseou-se numa análise estatística</w:t>
+      </w:r>
+      <w:r>
+        <w:rPr>
+          <w:rFonts w:ascii="Times New Roman" w:eastAsia="Times New Roman" w:hAnsi="Times New Roman" w:cs="Times New Roman"/>
+          <w:kern w:val="0"/>
+          <w:sz w:val="28"/>
+          <w:szCs w:val="28"/>
+          <w:lang w:eastAsia="pt-PT"/>
+          <w14:ligatures w14:val="none"/>
+        </w:rPr>
+        <w:t xml:space="preserve"> </w:t>
+      </w:r>
+      <w:r>
+        <w:rPr>
+          <w:rFonts w:ascii="Times New Roman" w:eastAsia="Times New Roman" w:hAnsi="Times New Roman" w:cs="Times New Roman"/>
+          <w:kern w:val="0"/>
+          <w:sz w:val="28"/>
+          <w:szCs w:val="28"/>
+          <w:lang w:eastAsia="pt-PT"/>
+          <w14:ligatures w14:val="none"/>
+        </w:rPr>
+        <w:t>para assegurar que as superioridades observadas entre as configurações de modelos possuíam significância real. O processo iniciou-se com a aplicação do teste de Kolmogorov-Smirnov para verificar a aderência das distribuições à normalidade. Os resultados deste teste indicaram que os erros dos modelos seguiam uma distribuição normal, o que permitiu a utilização de testes paramétricos, como o teste t, conferindo maior robustez e sensibilidade às conclusões obtidas.</w:t>
+      </w:r>
+    </w:p>
+    <w:p>
+      <w:pPr>
+        <w:spacing w:before="100" w:beforeAutospacing="1" w:after="100" w:afterAutospacing="1" w:line="240" w:lineRule="auto"/>
+        <w:jc w:val="both"/>
+        <w:rPr>
+          <w:rFonts w:ascii="Times New Roman" w:eastAsia="Times New Roman" w:hAnsi="Times New Roman" w:cs="Times New Roman"/>
+          <w:kern w:val="0"/>
+          <w:sz w:val="28"/>
+          <w:szCs w:val="28"/>
+          <w:lang w:eastAsia="pt-PT"/>
+          <w14:ligatures w14:val="none"/>
+        </w:rPr>
+      </w:pPr>
+      <w:r>
+        <w:rPr>
+          <w:rFonts w:ascii="Times New Roman" w:eastAsia="Times New Roman" w:hAnsi="Times New Roman" w:cs="Times New Roman"/>
+          <w:kern w:val="0"/>
+          <w:sz w:val="28"/>
+          <w:szCs w:val="28"/>
+          <w:lang w:eastAsia="pt-PT"/>
+          <w14:ligatures w14:val="none"/>
+        </w:rPr>
+        <w:t>Através de testes t</w:t>
+      </w:r>
+      <w:r>
+        <w:rPr>
+          <w:rFonts w:ascii="Times New Roman" w:eastAsia="Times New Roman" w:hAnsi="Times New Roman" w:cs="Times New Roman"/>
+          <w:kern w:val="0"/>
+          <w:sz w:val="28"/>
+          <w:szCs w:val="28"/>
+          <w:lang w:eastAsia="pt-PT"/>
+          <w14:ligatures w14:val="none"/>
+        </w:rPr>
+        <w:t xml:space="preserve"> </w:t>
+      </w:r>
+      <w:r>
+        <w:rPr>
+          <w:rFonts w:ascii="Times New Roman" w:eastAsia="Times New Roman" w:hAnsi="Times New Roman" w:cs="Times New Roman"/>
+          <w:kern w:val="0"/>
+          <w:sz w:val="28"/>
+          <w:szCs w:val="28"/>
+          <w:lang w:eastAsia="pt-PT"/>
+          <w14:ligatures w14:val="none"/>
+        </w:rPr>
+        <w:t xml:space="preserve">emparelhados, confirmou-se de forma inequívoca que o uso de </w:t>
+      </w:r>
+      <w:r>
+        <w:rPr>
+          <w:rFonts w:ascii="Times New Roman" w:eastAsia="Times New Roman" w:hAnsi="Times New Roman" w:cs="Times New Roman"/>
+          <w:kern w:val="0"/>
+          <w:sz w:val="28"/>
+          <w:szCs w:val="28"/>
+          <w:lang w:eastAsia="pt-PT"/>
+          <w14:ligatures w14:val="none"/>
+        </w:rPr>
+        <w:t>features</w:t>
+      </w:r>
+      <w:r>
+        <w:rPr>
+          <w:rFonts w:ascii="Times New Roman" w:eastAsia="Times New Roman" w:hAnsi="Times New Roman" w:cs="Times New Roman"/>
+          <w:kern w:val="0"/>
+          <w:sz w:val="28"/>
+          <w:szCs w:val="28"/>
+          <w:lang w:eastAsia="pt-PT"/>
+          <w14:ligatures w14:val="none"/>
+        </w:rPr>
+        <w:t xml:space="preserve"> é estatisticamente superior ao uso de </w:t>
+      </w:r>
+      <w:r>
+        <w:rPr>
+          <w:rFonts w:ascii="Times New Roman" w:eastAsia="Times New Roman" w:hAnsi="Times New Roman" w:cs="Times New Roman"/>
+          <w:kern w:val="0"/>
+          <w:sz w:val="28"/>
+          <w:szCs w:val="28"/>
+          <w:lang w:eastAsia="pt-PT"/>
+          <w14:ligatures w14:val="none"/>
+        </w:rPr>
+        <w:t xml:space="preserve">embeddings </w:t>
+      </w:r>
+      <w:r>
+        <w:rPr>
+          <w:rFonts w:ascii="Times New Roman" w:eastAsia="Times New Roman" w:hAnsi="Times New Roman" w:cs="Times New Roman"/>
+          <w:kern w:val="0"/>
+          <w:sz w:val="28"/>
+          <w:szCs w:val="28"/>
+          <w:lang w:eastAsia="pt-PT"/>
+          <w14:ligatures w14:val="none"/>
+        </w:rPr>
+        <w:t>em todos os cenários testados. Da mesma forma, a comparação entre os métodos de seleção revelou que a utilização do conjunto completo de características apresenta um ganho de performance estatisticamente relevante face às abordagens de redução de dimensionalidade por PCA ou seleção por Relief, sugerindo que estas últimas descartam componentes essenciais para a distinção de atividade</w:t>
+      </w:r>
+      <w:r>
+        <w:rPr>
+          <w:rFonts w:ascii="Times New Roman" w:eastAsia="Times New Roman" w:hAnsi="Times New Roman" w:cs="Times New Roman"/>
+          <w:kern w:val="0"/>
+          <w:sz w:val="28"/>
+          <w:szCs w:val="28"/>
+          <w:lang w:eastAsia="pt-PT"/>
+          <w14:ligatures w14:val="none"/>
+        </w:rPr>
+        <w:t>s</w:t>
+      </w:r>
+      <w:r>
+        <w:rPr>
+          <w:rFonts w:ascii="Times New Roman" w:eastAsia="Times New Roman" w:hAnsi="Times New Roman" w:cs="Times New Roman"/>
+          <w:kern w:val="0"/>
+          <w:sz w:val="28"/>
+          <w:szCs w:val="28"/>
+          <w:lang w:eastAsia="pt-PT"/>
+          <w14:ligatures w14:val="none"/>
+        </w:rPr>
+        <w:t>.</w:t>
+      </w:r>
+    </w:p>
+    <w:p>
+      <w:pPr>
+        <w:spacing w:before="100" w:beforeAutospacing="1" w:after="100" w:afterAutospacing="1" w:line="240" w:lineRule="auto"/>
+        <w:jc w:val="both"/>
+        <w:rPr>
+          <w:rFonts w:ascii="Times New Roman" w:eastAsia="Times New Roman" w:hAnsi="Times New Roman" w:cs="Times New Roman"/>
+          <w:kern w:val="0"/>
+          <w:sz w:val="28"/>
+          <w:szCs w:val="28"/>
+          <w:lang w:eastAsia="pt-PT"/>
+          <w14:ligatures w14:val="none"/>
+        </w:rPr>
+      </w:pPr>
+      <w:r>
+        <w:rPr>
+          <w:rFonts w:ascii="Times New Roman" w:eastAsia="Times New Roman" w:hAnsi="Times New Roman" w:cs="Times New Roman"/>
+          <w:kern w:val="0"/>
+          <w:sz w:val="28"/>
+          <w:szCs w:val="28"/>
+          <w:lang w:eastAsia="pt-PT"/>
+          <w14:ligatures w14:val="none"/>
+        </w:rPr>
+        <w:drawing>
+          <wp:anchor distT="0" distB="0" distL="114300" distR="114300" simplePos="0" relativeHeight="251683840" behindDoc="1" locked="0" layoutInCell="1" allowOverlap="1" wp14:anchorId="7FB286B5" wp14:editId="1D27F176">
+            <wp:simplePos x="0" y="0"/>
+            <wp:positionH relativeFrom="margin">
+              <wp:align>center</wp:align>
+            </wp:positionH>
+            <wp:positionV relativeFrom="paragraph">
+              <wp:posOffset>205189</wp:posOffset>
+            </wp:positionV>
+            <wp:extent cx="6010275" cy="3066415"/>
+            <wp:effectExtent l="0" t="0" r="9525" b="635"/>
+            <wp:wrapThrough wrapText="bothSides">
+              <wp:wrapPolygon edited="0">
+                <wp:start x="0" y="0"/>
+                <wp:lineTo x="0" y="21470"/>
+                <wp:lineTo x="21566" y="21470"/>
+                <wp:lineTo x="21566" y="0"/>
+                <wp:lineTo x="0" y="0"/>
+              </wp:wrapPolygon>
+            </wp:wrapThrough>
+            <wp:docPr id="181405675" name="Picture 1" descr="A group of graphs showing different sizes and shapes&#10;&#10;AI-generated content may be incorrect."/>
+            <wp:cNvGraphicFramePr>
+              <a:graphicFrameLocks xmlns:a="http://schemas.openxmlformats.org/drawingml/2006/main" noChangeAspect="1"/>
+            </wp:cNvGraphicFramePr>
+            <a:graphic xmlns:a="http://schemas.openxmlformats.org/drawingml/2006/main">
+              <a:graphicData uri="http://schemas.openxmlformats.org/drawingml/2006/picture">
+                <pic:pic xmlns:pic="http://schemas.openxmlformats.org/drawingml/2006/picture">
+                  <pic:nvPicPr>
+                    <pic:cNvPr id="181405675" name="Picture 1" descr="A group of graphs showing different sizes and shapes&#10;&#10;AI-generated content may be incorrect."/>
+                    <pic:cNvPicPr/>
+                  </pic:nvPicPr>
+                  <pic:blipFill>
+                    <a:blip r:embed="rId27" cstate="print">
+                      <a:extLst>
+                        <a:ext uri="{28A0092B-C50C-407E-A947-70E740481C1C}">
+                          <a14:useLocalDpi xmlns:a14="http://schemas.microsoft.com/office/drawing/2010/main" val="0"/>
+                        </a:ext>
+                      </a:extLst>
+                    </a:blip>
+                    <a:stretch>
+                      <a:fillRect/>
+                    </a:stretch>
+                  </pic:blipFill>
+                  <pic:spPr>
+                    <a:xfrm>
+                      <a:off x="0" y="0"/>
+                      <a:ext cx="6010275" cy="3066415"/>
+                    </a:xfrm>
+                    <a:prstGeom prst="rect">
+                      <a:avLst/>
+                    </a:prstGeom>
+                  </pic:spPr>
+                </pic:pic>
+              </a:graphicData>
+            </a:graphic>
+            <wp14:sizeRelH relativeFrom="margin">
+              <wp14:pctWidth>0</wp14:pctWidth>
+            </wp14:sizeRelH>
+            <wp14:sizeRelV relativeFrom="margin">
+              <wp14:pctHeight>0</wp14:pctHeight>
+            </wp14:sizeRelV>
+          </wp:anchor>
+        </w:drawing>
+      </w:r>
+    </w:p>
+    <w:p>
+      <w:pPr>
+        <w:spacing w:before="100" w:beforeAutospacing="1" w:after="100" w:afterAutospacing="1" w:line="240" w:lineRule="auto"/>
+        <w:jc w:val="both"/>
+        <w:rPr>
+          <w:rFonts w:ascii="Times New Roman" w:eastAsia="Times New Roman" w:hAnsi="Times New Roman" w:cs="Times New Roman"/>
+          <w:kern w:val="0"/>
+          <w:sz w:val="28"/>
+          <w:szCs w:val="28"/>
+          <w:lang w:eastAsia="pt-PT"/>
+          <w14:ligatures w14:val="none"/>
+        </w:rPr>
+      </w:pPr>
+      <w:r>
+        <w:rPr>
+          <w:rFonts w:ascii="Times New Roman" w:eastAsia="Times New Roman" w:hAnsi="Times New Roman" w:cs="Times New Roman"/>
+          <w:kern w:val="0"/>
+          <w:sz w:val="28"/>
+          <w:szCs w:val="28"/>
+          <w:lang w:eastAsia="pt-PT"/>
+          <w14:ligatures w14:val="none"/>
+        </w:rPr>
+        <w:t xml:space="preserve">                          Comparações entre modelos in</w:t>
+      </w:r>
+      <w:r>
+        <w:rPr>
+          <w:rFonts w:ascii="Times New Roman" w:eastAsia="Times New Roman" w:hAnsi="Times New Roman" w:cs="Times New Roman"/>
+          <w:kern w:val="0"/>
+          <w:sz w:val="28"/>
+          <w:szCs w:val="28"/>
+          <w:lang w:eastAsia="pt-PT"/>
+          <w14:ligatures w14:val="none"/>
+        </w:rPr>
+        <w:t>tra-participante</w:t>
+      </w:r>
+    </w:p>
+    <w:p>
+      <w:pPr>
+        <w:spacing w:before="100" w:beforeAutospacing="1" w:after="100" w:afterAutospacing="1" w:line="240" w:lineRule="auto"/>
+        <w:jc w:val="both"/>
+        <w:rPr>
+          <w:rFonts w:ascii="Times New Roman" w:eastAsia="Times New Roman" w:hAnsi="Times New Roman" w:cs="Times New Roman"/>
+          <w:kern w:val="0"/>
+          <w:sz w:val="28"/>
+          <w:szCs w:val="28"/>
+          <w:lang w:eastAsia="pt-PT"/>
+          <w14:ligatures w14:val="none"/>
+        </w:rPr>
+      </w:pPr>
+    </w:p>
+    <w:p>
+      <w:pPr>
+        <w:spacing w:before="100" w:beforeAutospacing="1" w:after="100" w:afterAutospacing="1" w:line="240" w:lineRule="auto"/>
+        <w:jc w:val="both"/>
+        <w:rPr>
+          <w:rFonts w:ascii="Times New Roman" w:eastAsia="Times New Roman" w:hAnsi="Times New Roman" w:cs="Times New Roman"/>
+          <w:kern w:val="0"/>
+          <w:sz w:val="28"/>
+          <w:szCs w:val="28"/>
+          <w:lang w:eastAsia="pt-PT"/>
+          <w14:ligatures w14:val="none"/>
+        </w:rPr>
+      </w:pPr>
+    </w:p>
+    <w:p>
+      <w:pPr>
+        <w:spacing w:before="100" w:beforeAutospacing="1" w:after="100" w:afterAutospacing="1" w:line="240" w:lineRule="auto"/>
+        <w:jc w:val="both"/>
+        <w:rPr>
+          <w:rFonts w:ascii="Times New Roman" w:eastAsia="Times New Roman" w:hAnsi="Times New Roman" w:cs="Times New Roman"/>
+          <w:kern w:val="0"/>
+          <w:sz w:val="28"/>
+          <w:szCs w:val="28"/>
+          <w:lang w:eastAsia="pt-PT"/>
+          <w14:ligatures w14:val="none"/>
+        </w:rPr>
+      </w:pPr>
+      <w:r>
+        <w:rPr>
+          <w:rFonts w:ascii="Times New Roman" w:eastAsia="Times New Roman" w:hAnsi="Times New Roman" w:cs="Times New Roman"/>
+          <w:kern w:val="0"/>
+          <w:sz w:val="28"/>
+          <w:szCs w:val="28"/>
+          <w:lang w:eastAsia="pt-PT"/>
+          <w14:ligatures w14:val="none"/>
+        </w:rPr>
+        <w:lastRenderedPageBreak/>
+        <w:drawing>
+          <wp:anchor distT="0" distB="0" distL="114300" distR="114300" simplePos="0" relativeHeight="251684864" behindDoc="1" locked="0" layoutInCell="1" allowOverlap="1" wp14:anchorId="085CAE01" wp14:editId="738EA127">
+            <wp:simplePos x="0" y="0"/>
+            <wp:positionH relativeFrom="margin">
+              <wp:align>center</wp:align>
+            </wp:positionH>
+            <wp:positionV relativeFrom="paragraph">
+              <wp:posOffset>-414037</wp:posOffset>
+            </wp:positionV>
+            <wp:extent cx="5839302" cy="2969777"/>
+            <wp:effectExtent l="0" t="0" r="0" b="2540"/>
+            <wp:wrapNone/>
+            <wp:docPr id="326970306" name="Picture 1" descr="A group of graphs showing different sizes and shapes&#10;&#10;AI-generated content may be incorrect."/>
+            <wp:cNvGraphicFramePr>
+              <a:graphicFrameLocks xmlns:a="http://schemas.openxmlformats.org/drawingml/2006/main" noChangeAspect="1"/>
+            </wp:cNvGraphicFramePr>
+            <a:graphic xmlns:a="http://schemas.openxmlformats.org/drawingml/2006/main">
+              <a:graphicData uri="http://schemas.openxmlformats.org/drawingml/2006/picture">
+                <pic:pic xmlns:pic="http://schemas.openxmlformats.org/drawingml/2006/picture">
+                  <pic:nvPicPr>
+                    <pic:cNvPr id="326970306" name="Picture 1" descr="A group of graphs showing different sizes and shapes&#10;&#10;AI-generated content may be incorrect."/>
+                    <pic:cNvPicPr/>
+                  </pic:nvPicPr>
+                  <pic:blipFill>
+                    <a:blip r:embed="rId28" cstate="print">
+                      <a:extLst>
+                        <a:ext uri="{28A0092B-C50C-407E-A947-70E740481C1C}">
+                          <a14:useLocalDpi xmlns:a14="http://schemas.microsoft.com/office/drawing/2010/main" val="0"/>
+                        </a:ext>
+                      </a:extLst>
+                    </a:blip>
+                    <a:stretch>
+                      <a:fillRect/>
+                    </a:stretch>
+                  </pic:blipFill>
+                  <pic:spPr>
+                    <a:xfrm>
+                      <a:off x="0" y="0"/>
+                      <a:ext cx="5839302" cy="2969777"/>
+                    </a:xfrm>
+                    <a:prstGeom prst="rect">
+                      <a:avLst/>
+                    </a:prstGeom>
+                  </pic:spPr>
+                </pic:pic>
+              </a:graphicData>
+            </a:graphic>
+            <wp14:sizeRelH relativeFrom="margin">
+              <wp14:pctWidth>0</wp14:pctWidth>
+            </wp14:sizeRelH>
+            <wp14:sizeRelV relativeFrom="margin">
+              <wp14:pctHeight>0</wp14:pctHeight>
+            </wp14:sizeRelV>
+          </wp:anchor>
+        </w:drawing>
+      </w:r>
+    </w:p>
+    <w:p>
+      <w:pPr>
+        <w:spacing w:before="100" w:beforeAutospacing="1" w:after="100" w:afterAutospacing="1" w:line="240" w:lineRule="auto"/>
+        <w:jc w:val="both"/>
+        <w:rPr>
+          <w:rFonts w:ascii="Times New Roman" w:eastAsia="Times New Roman" w:hAnsi="Times New Roman" w:cs="Times New Roman"/>
+          <w:kern w:val="0"/>
+          <w:sz w:val="28"/>
+          <w:szCs w:val="28"/>
+          <w:lang w:eastAsia="pt-PT"/>
+          <w14:ligatures w14:val="none"/>
+        </w:rPr>
+      </w:pPr>
+    </w:p>
+    <w:p>
+      <w:pPr>
+        <w:spacing w:before="100" w:beforeAutospacing="1" w:after="100" w:afterAutospacing="1" w:line="240" w:lineRule="auto"/>
+        <w:jc w:val="both"/>
+        <w:rPr>
+          <w:rFonts w:ascii="Times New Roman" w:eastAsia="Times New Roman" w:hAnsi="Times New Roman" w:cs="Times New Roman"/>
+          <w:kern w:val="0"/>
+          <w:sz w:val="28"/>
+          <w:szCs w:val="28"/>
+          <w:lang w:eastAsia="pt-PT"/>
+          <w14:ligatures w14:val="none"/>
+        </w:rPr>
+      </w:pPr>
+    </w:p>
+    <w:p>
+      <w:pPr>
+        <w:spacing w:before="100" w:beforeAutospacing="1" w:after="100" w:afterAutospacing="1" w:line="240" w:lineRule="auto"/>
+        <w:jc w:val="both"/>
+        <w:rPr>
+          <w:rFonts w:ascii="Times New Roman" w:eastAsia="Times New Roman" w:hAnsi="Times New Roman" w:cs="Times New Roman"/>
+          <w:kern w:val="0"/>
+          <w:sz w:val="28"/>
+          <w:szCs w:val="28"/>
+          <w:lang w:eastAsia="pt-PT"/>
+          <w14:ligatures w14:val="none"/>
+        </w:rPr>
+      </w:pPr>
+    </w:p>
+    <w:p>
+      <w:pPr>
+        <w:spacing w:before="100" w:beforeAutospacing="1" w:after="100" w:afterAutospacing="1" w:line="240" w:lineRule="auto"/>
+        <w:jc w:val="both"/>
+        <w:rPr>
+          <w:rFonts w:ascii="Times New Roman" w:eastAsia="Times New Roman" w:hAnsi="Times New Roman" w:cs="Times New Roman"/>
+          <w:kern w:val="0"/>
+          <w:sz w:val="28"/>
+          <w:szCs w:val="28"/>
+          <w:lang w:eastAsia="pt-PT"/>
+          <w14:ligatures w14:val="none"/>
+        </w:rPr>
+      </w:pPr>
+    </w:p>
+    <w:p>
+      <w:pPr>
+        <w:spacing w:before="100" w:beforeAutospacing="1" w:after="100" w:afterAutospacing="1" w:line="240" w:lineRule="auto"/>
+        <w:jc w:val="both"/>
+        <w:rPr>
+          <w:rFonts w:ascii="Times New Roman" w:eastAsia="Times New Roman" w:hAnsi="Times New Roman" w:cs="Times New Roman"/>
+          <w:kern w:val="0"/>
+          <w:sz w:val="28"/>
+          <w:szCs w:val="28"/>
+          <w:lang w:eastAsia="pt-PT"/>
+          <w14:ligatures w14:val="none"/>
+        </w:rPr>
+      </w:pPr>
+    </w:p>
+    <w:p>
+      <w:pPr>
+        <w:spacing w:before="100" w:beforeAutospacing="1" w:after="100" w:afterAutospacing="1" w:line="240" w:lineRule="auto"/>
+        <w:jc w:val="both"/>
+        <w:rPr>
+          <w:rFonts w:ascii="Times New Roman" w:eastAsia="Times New Roman" w:hAnsi="Times New Roman" w:cs="Times New Roman"/>
+          <w:kern w:val="0"/>
+          <w:sz w:val="28"/>
+          <w:szCs w:val="28"/>
+          <w:lang w:eastAsia="pt-PT"/>
+          <w14:ligatures w14:val="none"/>
+        </w:rPr>
+      </w:pPr>
+    </w:p>
+    <w:p>
+      <w:pPr>
+        <w:spacing w:before="100" w:beforeAutospacing="1" w:after="100" w:afterAutospacing="1" w:line="240" w:lineRule="auto"/>
+        <w:ind w:left="1416"/>
+        <w:jc w:val="both"/>
+        <w:rPr>
+          <w:rFonts w:ascii="Times New Roman" w:eastAsia="Times New Roman" w:hAnsi="Times New Roman" w:cs="Times New Roman"/>
+          <w:kern w:val="0"/>
+          <w:sz w:val="28"/>
+          <w:szCs w:val="28"/>
+          <w:lang w:eastAsia="pt-PT"/>
+          <w14:ligatures w14:val="none"/>
+        </w:rPr>
+      </w:pPr>
+      <w:r>
+        <w:rPr>
+          <w:rFonts w:ascii="Times New Roman" w:eastAsia="Times New Roman" w:hAnsi="Times New Roman" w:cs="Times New Roman"/>
+          <w:kern w:val="0"/>
+          <w:sz w:val="28"/>
+          <w:szCs w:val="28"/>
+          <w:lang w:eastAsia="pt-PT"/>
+          <w14:ligatures w14:val="none"/>
+        </w:rPr>
+        <w:t xml:space="preserve">      </w:t>
+      </w:r>
+      <w:r>
+        <w:rPr>
+          <w:rFonts w:ascii="Times New Roman" w:eastAsia="Times New Roman" w:hAnsi="Times New Roman" w:cs="Times New Roman"/>
+          <w:kern w:val="0"/>
+          <w:sz w:val="28"/>
+          <w:szCs w:val="28"/>
+          <w:lang w:eastAsia="pt-PT"/>
+          <w14:ligatures w14:val="none"/>
+        </w:rPr>
+        <w:t>Comparações entre modelos int</w:t>
+      </w:r>
+      <w:r>
+        <w:rPr>
+          <w:rFonts w:ascii="Times New Roman" w:eastAsia="Times New Roman" w:hAnsi="Times New Roman" w:cs="Times New Roman"/>
+          <w:kern w:val="0"/>
+          <w:sz w:val="28"/>
+          <w:szCs w:val="28"/>
+          <w:lang w:eastAsia="pt-PT"/>
+          <w14:ligatures w14:val="none"/>
+        </w:rPr>
+        <w:t>er</w:t>
+      </w:r>
+      <w:r>
+        <w:rPr>
+          <w:rFonts w:ascii="Times New Roman" w:eastAsia="Times New Roman" w:hAnsi="Times New Roman" w:cs="Times New Roman"/>
+          <w:kern w:val="0"/>
+          <w:sz w:val="28"/>
+          <w:szCs w:val="28"/>
+          <w:lang w:eastAsia="pt-PT"/>
+          <w14:ligatures w14:val="none"/>
+        </w:rPr>
+        <w:t>-participante</w:t>
+      </w:r>
+    </w:p>
+    <w:p>
+      <w:pPr>
+        <w:spacing w:before="100" w:beforeAutospacing="1" w:after="100" w:afterAutospacing="1" w:line="240" w:lineRule="auto"/>
+        <w:jc w:val="both"/>
+        <w:rPr>
+          <w:rFonts w:ascii="Times New Roman" w:eastAsia="Times New Roman" w:hAnsi="Times New Roman" w:cs="Times New Roman"/>
+          <w:kern w:val="0"/>
+          <w:sz w:val="28"/>
+          <w:szCs w:val="28"/>
+          <w:lang w:eastAsia="pt-PT"/>
+          <w14:ligatures w14:val="none"/>
+        </w:rPr>
+      </w:pPr>
+      <w:r>
+        <w:rPr>
+          <w:rFonts w:ascii="Times New Roman" w:eastAsia="Times New Roman" w:hAnsi="Times New Roman" w:cs="Times New Roman"/>
+          <w:kern w:val="0"/>
+          <w:sz w:val="28"/>
+          <w:szCs w:val="28"/>
+          <w:lang w:eastAsia="pt-PT"/>
+          <w14:ligatures w14:val="none"/>
+        </w:rPr>
+        <w:t>Finalmente, a aplicação de testes t</w:t>
+      </w:r>
+      <w:r>
+        <w:rPr>
+          <w:rFonts w:ascii="Times New Roman" w:eastAsia="Times New Roman" w:hAnsi="Times New Roman" w:cs="Times New Roman"/>
+          <w:kern w:val="0"/>
+          <w:sz w:val="28"/>
+          <w:szCs w:val="28"/>
+          <w:lang w:eastAsia="pt-PT"/>
+          <w14:ligatures w14:val="none"/>
+        </w:rPr>
+        <w:t xml:space="preserve"> </w:t>
+      </w:r>
+      <w:r>
+        <w:rPr>
+          <w:rFonts w:ascii="Times New Roman" w:eastAsia="Times New Roman" w:hAnsi="Times New Roman" w:cs="Times New Roman"/>
+          <w:kern w:val="0"/>
+          <w:sz w:val="28"/>
+          <w:szCs w:val="28"/>
+          <w:lang w:eastAsia="pt-PT"/>
+          <w14:ligatures w14:val="none"/>
+        </w:rPr>
+        <w:t>independentes para comparar as estratégias de divisão de dados confirmou que a diferença de desempenho entre a abordagem intra-participante e a inter-participante não é fruto do acaso. Esta evidência estatística valida a hipótese de que modelos avaliados em novos utilizadores sofrem um impacto real na precisão devido à variabilidade biomecânica, consolidando a estratégia baseada em participantes como o método mais honesto e robusto para estimar o sucesso do sistema em cenários reais.</w:t>
+      </w:r>
+    </w:p>
+    <w:p>
+      <w:pPr>
+        <w:spacing w:before="100" w:beforeAutospacing="1" w:after="100" w:afterAutospacing="1" w:line="240" w:lineRule="auto"/>
+        <w:jc w:val="both"/>
+        <w:rPr>
+          <w:rFonts w:ascii="Times New Roman" w:eastAsia="Times New Roman" w:hAnsi="Times New Roman" w:cs="Times New Roman"/>
+          <w:kern w:val="0"/>
+          <w:sz w:val="28"/>
+          <w:szCs w:val="28"/>
+          <w:lang w:eastAsia="pt-PT"/>
+          <w14:ligatures w14:val="none"/>
+        </w:rPr>
+      </w:pPr>
+      <w:r>
+        <w:rPr>
+          <w:rFonts w:ascii="Times New Roman" w:eastAsia="Times New Roman" w:hAnsi="Times New Roman" w:cs="Times New Roman"/>
+          <w:kern w:val="0"/>
+          <w:sz w:val="28"/>
+          <w:szCs w:val="28"/>
+          <w:lang w:eastAsia="pt-PT"/>
+          <w14:ligatures w14:val="none"/>
+        </w:rPr>
+        <w:drawing>
+          <wp:anchor distT="0" distB="0" distL="114300" distR="114300" simplePos="0" relativeHeight="251685888" behindDoc="1" locked="0" layoutInCell="1" allowOverlap="1" wp14:anchorId="22E5AD2D" wp14:editId="6581D15A">
+            <wp:simplePos x="0" y="0"/>
+            <wp:positionH relativeFrom="margin">
+              <wp:align>center</wp:align>
+            </wp:positionH>
+            <wp:positionV relativeFrom="paragraph">
+              <wp:posOffset>151422</wp:posOffset>
+            </wp:positionV>
+            <wp:extent cx="6077964" cy="3091157"/>
+            <wp:effectExtent l="0" t="0" r="0" b="0"/>
+            <wp:wrapNone/>
+            <wp:docPr id="1581287129" name="Picture 1" descr="A group of graphs showing different sizes and colors&#10;&#10;AI-generated content may be incorrect."/>
+            <wp:cNvGraphicFramePr>
+              <a:graphicFrameLocks xmlns:a="http://schemas.openxmlformats.org/drawingml/2006/main" noChangeAspect="1"/>
+            </wp:cNvGraphicFramePr>
+            <a:graphic xmlns:a="http://schemas.openxmlformats.org/drawingml/2006/main">
+              <a:graphicData uri="http://schemas.openxmlformats.org/drawingml/2006/picture">
+                <pic:pic xmlns:pic="http://schemas.openxmlformats.org/drawingml/2006/picture">
+                  <pic:nvPicPr>
+                    <pic:cNvPr id="1581287129" name="Picture 1" descr="A group of graphs showing different sizes and colors&#10;&#10;AI-generated content may be incorrect."/>
+                    <pic:cNvPicPr/>
+                  </pic:nvPicPr>
+                  <pic:blipFill>
+                    <a:blip r:embed="rId29" cstate="print">
+                      <a:extLst>
+                        <a:ext uri="{28A0092B-C50C-407E-A947-70E740481C1C}">
+                          <a14:useLocalDpi xmlns:a14="http://schemas.microsoft.com/office/drawing/2010/main" val="0"/>
+                        </a:ext>
+                      </a:extLst>
+                    </a:blip>
+                    <a:stretch>
+                      <a:fillRect/>
+                    </a:stretch>
+                  </pic:blipFill>
+                  <pic:spPr>
+                    <a:xfrm>
+                      <a:off x="0" y="0"/>
+                      <a:ext cx="6077964" cy="3091157"/>
+                    </a:xfrm>
+                    <a:prstGeom prst="rect">
+                      <a:avLst/>
+                    </a:prstGeom>
+                  </pic:spPr>
+                </pic:pic>
+              </a:graphicData>
+            </a:graphic>
+            <wp14:sizeRelH relativeFrom="margin">
+              <wp14:pctWidth>0</wp14:pctWidth>
+            </wp14:sizeRelH>
+            <wp14:sizeRelV relativeFrom="margin">
+              <wp14:pctHeight>0</wp14:pctHeight>
+            </wp14:sizeRelV>
+          </wp:anchor>
+        </w:drawing>
+      </w:r>
+    </w:p>
+    <w:p>
+      <w:pPr>
+        <w:spacing w:before="100" w:beforeAutospacing="1" w:after="100" w:afterAutospacing="1" w:line="240" w:lineRule="auto"/>
+        <w:jc w:val="both"/>
+        <w:rPr>
+          <w:rFonts w:ascii="Times New Roman" w:eastAsia="Times New Roman" w:hAnsi="Times New Roman" w:cs="Times New Roman"/>
+          <w:kern w:val="0"/>
+          <w:sz w:val="28"/>
+          <w:szCs w:val="28"/>
+          <w:lang w:eastAsia="pt-PT"/>
+          <w14:ligatures w14:val="none"/>
+        </w:rPr>
+      </w:pPr>
+    </w:p>
+    <w:p>
+      <w:pPr>
+        <w:spacing w:before="100" w:beforeAutospacing="1" w:after="100" w:afterAutospacing="1" w:line="240" w:lineRule="auto"/>
+        <w:jc w:val="both"/>
+        <w:rPr>
+          <w:rFonts w:ascii="Times New Roman" w:eastAsia="Times New Roman" w:hAnsi="Times New Roman" w:cs="Times New Roman"/>
+          <w:kern w:val="0"/>
+          <w:sz w:val="28"/>
+          <w:szCs w:val="28"/>
+          <w:lang w:eastAsia="pt-PT"/>
+          <w14:ligatures w14:val="none"/>
+        </w:rPr>
+      </w:pPr>
+    </w:p>
+    <w:p>
+      <w:pPr>
+        <w:spacing w:before="100" w:beforeAutospacing="1" w:after="100" w:afterAutospacing="1" w:line="240" w:lineRule="auto"/>
+        <w:jc w:val="both"/>
+        <w:rPr>
+          <w:rFonts w:ascii="Times New Roman" w:eastAsia="Times New Roman" w:hAnsi="Times New Roman" w:cs="Times New Roman"/>
+          <w:kern w:val="0"/>
+          <w:sz w:val="28"/>
+          <w:szCs w:val="28"/>
+          <w:lang w:eastAsia="pt-PT"/>
+          <w14:ligatures w14:val="none"/>
+        </w:rPr>
+      </w:pPr>
+    </w:p>
+    <w:p>
+      <w:pPr>
+        <w:spacing w:before="100" w:beforeAutospacing="1" w:after="100" w:afterAutospacing="1" w:line="240" w:lineRule="auto"/>
+        <w:jc w:val="both"/>
+        <w:rPr>
+          <w:rFonts w:ascii="Times New Roman" w:eastAsia="Times New Roman" w:hAnsi="Times New Roman" w:cs="Times New Roman"/>
+          <w:kern w:val="0"/>
+          <w:sz w:val="28"/>
+          <w:szCs w:val="28"/>
+          <w:lang w:eastAsia="pt-PT"/>
+          <w14:ligatures w14:val="none"/>
+        </w:rPr>
+      </w:pPr>
+    </w:p>
+    <w:p>
+      <w:pPr>
+        <w:spacing w:before="100" w:beforeAutospacing="1" w:after="100" w:afterAutospacing="1" w:line="240" w:lineRule="auto"/>
+        <w:jc w:val="both"/>
+        <w:rPr>
+          <w:rFonts w:ascii="Times New Roman" w:eastAsia="Times New Roman" w:hAnsi="Times New Roman" w:cs="Times New Roman"/>
+          <w:kern w:val="0"/>
+          <w:sz w:val="28"/>
+          <w:szCs w:val="28"/>
+          <w:lang w:eastAsia="pt-PT"/>
+          <w14:ligatures w14:val="none"/>
+        </w:rPr>
+      </w:pPr>
+    </w:p>
+    <w:p>
+      <w:pPr>
+        <w:spacing w:before="100" w:beforeAutospacing="1" w:after="100" w:afterAutospacing="1" w:line="240" w:lineRule="auto"/>
+        <w:jc w:val="both"/>
+        <w:rPr>
+          <w:rFonts w:ascii="Times New Roman" w:eastAsia="Times New Roman" w:hAnsi="Times New Roman" w:cs="Times New Roman"/>
+          <w:kern w:val="0"/>
+          <w:sz w:val="28"/>
+          <w:szCs w:val="28"/>
+          <w:lang w:eastAsia="pt-PT"/>
+          <w14:ligatures w14:val="none"/>
+        </w:rPr>
+      </w:pPr>
+    </w:p>
+    <w:p>
+      <w:pPr>
+        <w:spacing w:before="100" w:beforeAutospacing="1" w:after="100" w:afterAutospacing="1" w:line="240" w:lineRule="auto"/>
+        <w:jc w:val="both"/>
+        <w:rPr>
+          <w:rFonts w:ascii="Times New Roman" w:eastAsia="Times New Roman" w:hAnsi="Times New Roman" w:cs="Times New Roman"/>
+          <w:kern w:val="0"/>
+          <w:sz w:val="28"/>
+          <w:szCs w:val="28"/>
+          <w:lang w:eastAsia="pt-PT"/>
+          <w14:ligatures w14:val="none"/>
+        </w:rPr>
+      </w:pPr>
+    </w:p>
+    <w:p>
+      <w:pPr>
+        <w:spacing w:before="100" w:beforeAutospacing="1" w:after="100" w:afterAutospacing="1" w:line="240" w:lineRule="auto"/>
+        <w:jc w:val="both"/>
+        <w:rPr>
+          <w:rFonts w:ascii="Times New Roman" w:eastAsia="Times New Roman" w:hAnsi="Times New Roman" w:cs="Times New Roman"/>
+          <w:kern w:val="0"/>
+          <w:sz w:val="28"/>
+          <w:szCs w:val="28"/>
+          <w:lang w:eastAsia="pt-PT"/>
+          <w14:ligatures w14:val="none"/>
+        </w:rPr>
+      </w:pPr>
+    </w:p>
+    <w:p>
+      <w:pPr>
+        <w:spacing w:before="100" w:beforeAutospacing="1" w:after="100" w:afterAutospacing="1" w:line="240" w:lineRule="auto"/>
+        <w:jc w:val="both"/>
+        <w:rPr>
+          <w:rFonts w:ascii="Times New Roman" w:eastAsia="Times New Roman" w:hAnsi="Times New Roman" w:cs="Times New Roman"/>
+          <w:kern w:val="0"/>
+          <w:sz w:val="28"/>
+          <w:szCs w:val="28"/>
+          <w:lang w:eastAsia="pt-PT"/>
+          <w14:ligatures w14:val="none"/>
+        </w:rPr>
+      </w:pPr>
+      <w:r>
+        <w:rPr>
+          <w:rFonts w:ascii="Times New Roman" w:eastAsia="Times New Roman" w:hAnsi="Times New Roman" w:cs="Times New Roman"/>
+          <w:kern w:val="0"/>
+          <w:sz w:val="28"/>
+          <w:szCs w:val="28"/>
+          <w:lang w:eastAsia="pt-PT"/>
+          <w14:ligatures w14:val="none"/>
+        </w:rPr>
+        <w:t xml:space="preserve">                       </w:t>
+      </w:r>
+      <w:r>
+        <w:rPr>
+          <w:rFonts w:ascii="Times New Roman" w:eastAsia="Times New Roman" w:hAnsi="Times New Roman" w:cs="Times New Roman"/>
+          <w:kern w:val="0"/>
+          <w:sz w:val="28"/>
+          <w:szCs w:val="28"/>
+          <w:lang w:eastAsia="pt-PT"/>
+          <w14:ligatures w14:val="none"/>
+        </w:rPr>
+        <w:t xml:space="preserve">Comparações entre </w:t>
+      </w:r>
+      <w:r>
+        <w:rPr>
+          <w:rFonts w:ascii="Times New Roman" w:eastAsia="Times New Roman" w:hAnsi="Times New Roman" w:cs="Times New Roman"/>
+          <w:kern w:val="0"/>
+          <w:sz w:val="28"/>
+          <w:szCs w:val="28"/>
+          <w:lang w:eastAsia="pt-PT"/>
+          <w14:ligatures w14:val="none"/>
+        </w:rPr>
+        <w:t>diferentes métodos de partição</w:t>
+      </w:r>
+    </w:p>
+    <w:p>
+      <w:pPr>
+        <w:pStyle w:val="ListParagraph"/>
         <w:numPr>
           <w:ilvl w:val="0"/>
-          <w:numId w:val="26"/>
+          <w:numId w:val="2"/>
         </w:numPr>
-        <w:jc w:val="both"/>
-        <w:rPr>
-          <w:rFonts w:ascii="Times New Roman" w:hAnsi="Times New Roman" w:cs="Times New Roman"/>
-          <w:sz w:val="28"/>
-          <w:szCs w:val="28"/>
-        </w:rPr>
-      </w:pPr>
-      <w:r>
-        <w:rPr>
-          <w:rFonts w:ascii="Times New Roman" w:hAnsi="Times New Roman" w:cs="Times New Roman"/>
-          <w:sz w:val="28"/>
-          <w:szCs w:val="28"/>
-        </w:rPr>
-        <w:t>Wilcoxon signed-rank test, quando os modelos eram comparados sobre as mesmas repetições;</w:t>
+        <w:spacing w:before="100" w:beforeAutospacing="1" w:after="100" w:afterAutospacing="1" w:line="240" w:lineRule="auto"/>
+        <w:jc w:val="both"/>
+        <w:rPr>
+          <w:rFonts w:ascii="Times New Roman" w:eastAsia="Times New Roman" w:hAnsi="Times New Roman" w:cs="Times New Roman"/>
+          <w:kern w:val="0"/>
+          <w:sz w:val="28"/>
+          <w:szCs w:val="28"/>
+          <w:lang w:eastAsia="pt-PT"/>
+          <w14:ligatures w14:val="none"/>
+        </w:rPr>
+      </w:pPr>
+      <w:r>
+        <w:rPr>
+          <w:rFonts w:ascii="Times New Roman" w:hAnsi="Times New Roman" w:cs="Times New Roman"/>
+          <w:b/>
+          <w:bCs/>
+          <w:sz w:val="48"/>
+          <w:szCs w:val="48"/>
+        </w:rPr>
+        <w:lastRenderedPageBreak/>
+        <w:t xml:space="preserve">Modelo de </w:t>
+      </w:r>
+      <w:r>
+        <w:rPr>
+          <w:rFonts w:ascii="Times New Roman" w:hAnsi="Times New Roman" w:cs="Times New Roman"/>
+          <w:b/>
+          <w:bCs/>
+          <w:sz w:val="48"/>
+          <w:szCs w:val="48"/>
+        </w:rPr>
+        <w:t>I</w:t>
+      </w:r>
+      <w:r>
+        <w:rPr>
+          <w:rFonts w:ascii="Times New Roman" w:hAnsi="Times New Roman" w:cs="Times New Roman"/>
+          <w:b/>
+          <w:bCs/>
+          <w:sz w:val="48"/>
+          <w:szCs w:val="48"/>
+        </w:rPr>
+        <w:t>mplantação</w:t>
+      </w:r>
+    </w:p>
+    <w:p>
+      <w:pPr>
+        <w:jc w:val="both"/>
+        <w:rPr>
+          <w:rFonts w:ascii="Times New Roman" w:hAnsi="Times New Roman" w:cs="Times New Roman"/>
+          <w:sz w:val="28"/>
+          <w:szCs w:val="28"/>
+        </w:rPr>
+      </w:pPr>
+      <w:r>
+        <w:rPr>
+          <w:rFonts w:ascii="Times New Roman" w:hAnsi="Times New Roman" w:cs="Times New Roman"/>
+          <w:sz w:val="28"/>
+          <w:szCs w:val="28"/>
+        </w:rPr>
+        <w:t xml:space="preserve">Para a fase de deployment, foi selecionado o modelo </w:t>
+      </w:r>
+      <w:r>
+        <w:rPr>
+          <w:rFonts w:ascii="Times New Roman" w:hAnsi="Times New Roman" w:cs="Times New Roman"/>
+          <w:b/>
+          <w:bCs/>
+          <w:sz w:val="28"/>
+          <w:szCs w:val="28"/>
+        </w:rPr>
+        <w:t>Participant-Features-A</w:t>
+      </w:r>
+      <w:r>
+        <w:rPr>
+          <w:rFonts w:ascii="Times New Roman" w:hAnsi="Times New Roman" w:cs="Times New Roman"/>
+          <w:sz w:val="28"/>
+          <w:szCs w:val="28"/>
+        </w:rPr>
+        <w:t xml:space="preserve">, com k = 19. Este modelo destaca-se por utilizar o conjunto completo de </w:t>
+      </w:r>
+      <w:r>
+        <w:rPr>
+          <w:rFonts w:ascii="Times New Roman" w:hAnsi="Times New Roman" w:cs="Times New Roman"/>
+          <w:sz w:val="28"/>
+          <w:szCs w:val="28"/>
+        </w:rPr>
+        <w:t>features</w:t>
+      </w:r>
+      <w:r>
+        <w:rPr>
+          <w:rFonts w:ascii="Times New Roman" w:hAnsi="Times New Roman" w:cs="Times New Roman"/>
+          <w:sz w:val="28"/>
+          <w:szCs w:val="28"/>
+        </w:rPr>
+        <w:t>, o que provou estatisticamente ser mais eficaz do que o uso de embeddings ou técnicas de redução de dimensionalidade</w:t>
+      </w:r>
+      <w:r>
+        <w:rPr>
+          <w:rFonts w:ascii="Times New Roman" w:hAnsi="Times New Roman" w:cs="Times New Roman"/>
+          <w:sz w:val="28"/>
+          <w:szCs w:val="28"/>
+        </w:rPr>
+        <w:t>.</w:t>
+      </w:r>
+    </w:p>
+    <w:p>
+      <w:pPr>
+        <w:jc w:val="both"/>
+        <w:rPr>
+          <w:rFonts w:ascii="Times New Roman" w:hAnsi="Times New Roman" w:cs="Times New Roman"/>
+          <w:sz w:val="28"/>
+          <w:szCs w:val="28"/>
+        </w:rPr>
+      </w:pPr>
+      <w:r>
+        <w:rPr>
+          <w:rFonts w:ascii="Times New Roman" w:hAnsi="Times New Roman" w:cs="Times New Roman"/>
+          <w:sz w:val="28"/>
+          <w:szCs w:val="28"/>
+        </w:rPr>
+        <w:t>A função de classificação segue uma estrutura pipeline que transforma uma janela temporal bruta de 256 amostras (5 segundos a 5</w:t>
+      </w:r>
+      <w:r>
+        <w:rPr>
+          <w:rFonts w:ascii="Times New Roman" w:hAnsi="Times New Roman" w:cs="Times New Roman"/>
+          <w:sz w:val="28"/>
+          <w:szCs w:val="28"/>
+        </w:rPr>
+        <w:t>1.5</w:t>
+      </w:r>
+      <w:r>
+        <w:rPr>
+          <w:rFonts w:ascii="Times New Roman" w:hAnsi="Times New Roman" w:cs="Times New Roman"/>
+          <w:sz w:val="28"/>
+          <w:szCs w:val="28"/>
+        </w:rPr>
+        <w:t>Hz) numa previsão de atividade</w:t>
+      </w:r>
+      <w:r>
+        <w:rPr>
+          <w:rFonts w:ascii="Times New Roman" w:hAnsi="Times New Roman" w:cs="Times New Roman"/>
+          <w:sz w:val="28"/>
+          <w:szCs w:val="28"/>
+        </w:rPr>
+        <w:t xml:space="preserve"> seguindo as etapas:</w:t>
       </w:r>
     </w:p>
     <w:p>
       <w:pPr>
         <w:numPr>
           <w:ilvl w:val="0"/>
-          <w:numId w:val="26"/>
+          <w:numId w:val="28"/>
         </w:numPr>
+        <w:tabs>
+          <w:tab w:val="num" w:pos="720"/>
+        </w:tabs>
         <w:jc w:val="both"/>
         <w:rPr>
           <w:rFonts w:ascii="Times New Roman" w:hAnsi="Times New Roman" w:cs="Times New Roman"/>
@@ -7758,25 +9372,49 @@
           <w:sz w:val="28"/>
           <w:szCs w:val="28"/>
         </w:rPr>
-        <w:t>Mann–Whitney U test</w:t>
-      </w:r>
-      <w:r>
-        <w:rPr>
-          <w:rFonts w:ascii="Times New Roman" w:hAnsi="Times New Roman" w:cs="Times New Roman"/>
-          <w:sz w:val="28"/>
-          <w:szCs w:val="28"/>
-        </w:rPr>
-        <w:t>, quando as comparações não eram emparelhadas.</w:t>
-      </w:r>
-      <w:r>
-        <w:rPr>
-          <w:rFonts w:ascii="Times New Roman" w:hAnsi="Times New Roman" w:cs="Times New Roman"/>
-          <w:sz w:val="28"/>
-          <w:szCs w:val="28"/>
-        </w:rPr>
-        <w:br/>
-        <w:t xml:space="preserve">O nível de significância adotado foi </w:t>
-      </w:r>
+        <w:t>Extração de Features:</w:t>
+      </w:r>
+      <w:r>
+        <w:rPr>
+          <w:rFonts w:ascii="Times New Roman" w:hAnsi="Times New Roman" w:cs="Times New Roman"/>
+          <w:sz w:val="28"/>
+          <w:szCs w:val="28"/>
+        </w:rPr>
+        <w:t xml:space="preserve"> Cálculo das métricas estatísticas e espectrais para cada eixo</w:t>
+      </w:r>
+      <w:r>
+        <w:rPr>
+          <w:rFonts w:ascii="Times New Roman" w:hAnsi="Times New Roman" w:cs="Times New Roman"/>
+          <w:sz w:val="28"/>
+          <w:szCs w:val="28"/>
+        </w:rPr>
+        <w:t xml:space="preserve"> de cada variável</w:t>
+      </w:r>
+      <w:r>
+        <w:rPr>
+          <w:rFonts w:ascii="Times New Roman" w:hAnsi="Times New Roman" w:cs="Times New Roman"/>
+          <w:sz w:val="28"/>
+          <w:szCs w:val="28"/>
+        </w:rPr>
+        <w:t>.</w:t>
+      </w:r>
+    </w:p>
+    <w:p>
+      <w:pPr>
+        <w:numPr>
+          <w:ilvl w:val="0"/>
+          <w:numId w:val="28"/>
+        </w:numPr>
+        <w:tabs>
+          <w:tab w:val="num" w:pos="720"/>
+        </w:tabs>
+        <w:jc w:val="both"/>
+        <w:rPr>
+          <w:rFonts w:ascii="Times New Roman" w:hAnsi="Times New Roman" w:cs="Times New Roman"/>
+          <w:sz w:val="28"/>
+          <w:szCs w:val="28"/>
+        </w:rPr>
+      </w:pPr>
       <w:r>
         <w:rPr>
           <w:rFonts w:ascii="Times New Roman" w:hAnsi="Times New Roman" w:cs="Times New Roman"/>
@@ -7785,56 +9423,33 @@
           <w:sz w:val="28"/>
           <w:szCs w:val="28"/>
         </w:rPr>
-        <w:t>α = 0.05</w:t>
-      </w:r>
-      <w:r>
-        <w:rPr>
-          <w:rFonts w:ascii="Times New Roman" w:hAnsi="Times New Roman" w:cs="Times New Roman"/>
-          <w:sz w:val="28"/>
-          <w:szCs w:val="28"/>
-        </w:rPr>
-        <w:t>.</w:t>
-      </w:r>
-    </w:p>
-    <w:p>
-      <w:pPr>
-        <w:jc w:val="both"/>
-        <w:rPr>
-          <w:rFonts w:ascii="Times New Roman" w:hAnsi="Times New Roman" w:cs="Times New Roman"/>
-          <w:sz w:val="28"/>
-          <w:szCs w:val="28"/>
-        </w:rPr>
-      </w:pPr>
-      <w:r>
-        <w:rPr>
-          <w:rFonts w:ascii="Times New Roman" w:hAnsi="Times New Roman" w:cs="Times New Roman"/>
-          <w:sz w:val="28"/>
-          <w:szCs w:val="28"/>
-        </w:rPr>
-        <w:t>Os testes revelaram que:</w:t>
+        <w:t>Normalização (Z-Score):</w:t>
+      </w:r>
+      <w:r>
+        <w:rPr>
+          <w:rFonts w:ascii="Times New Roman" w:hAnsi="Times New Roman" w:cs="Times New Roman"/>
+          <w:sz w:val="28"/>
+          <w:szCs w:val="28"/>
+        </w:rPr>
+        <w:t xml:space="preserve"> Aplicação dos parâmetros de média e desvio padrão guardados durante o treino para alinhar a escala das features.</w:t>
       </w:r>
     </w:p>
     <w:p>
       <w:pPr>
         <w:numPr>
           <w:ilvl w:val="0"/>
-          <w:numId w:val="27"/>
+          <w:numId w:val="28"/>
         </w:numPr>
-        <w:jc w:val="both"/>
-        <w:rPr>
-          <w:rFonts w:ascii="Times New Roman" w:hAnsi="Times New Roman" w:cs="Times New Roman"/>
-          <w:sz w:val="28"/>
-          <w:szCs w:val="28"/>
-        </w:rPr>
-      </w:pPr>
-      <w:r>
-        <w:rPr>
-          <w:rFonts w:ascii="Times New Roman" w:hAnsi="Times New Roman" w:cs="Times New Roman"/>
-          <w:sz w:val="28"/>
-          <w:szCs w:val="28"/>
-        </w:rPr>
-        <w:t xml:space="preserve">O </w:t>
-      </w:r>
+        <w:tabs>
+          <w:tab w:val="num" w:pos="720"/>
+        </w:tabs>
+        <w:jc w:val="both"/>
+        <w:rPr>
+          <w:rFonts w:ascii="Times New Roman" w:hAnsi="Times New Roman" w:cs="Times New Roman"/>
+          <w:sz w:val="28"/>
+          <w:szCs w:val="28"/>
+        </w:rPr>
+      </w:pPr>
       <w:r>
         <w:rPr>
           <w:rFonts w:ascii="Times New Roman" w:hAnsi="Times New Roman" w:cs="Times New Roman"/>
@@ -7843,78 +9458,108 @@
           <w:sz w:val="28"/>
           <w:szCs w:val="28"/>
         </w:rPr>
-        <w:t>Participant Features A</w:t>
-      </w:r>
-      <w:r>
-        <w:rPr>
-          <w:rFonts w:ascii="Times New Roman" w:hAnsi="Times New Roman" w:cs="Times New Roman"/>
-          <w:sz w:val="28"/>
-          <w:szCs w:val="28"/>
-        </w:rPr>
-        <w:t xml:space="preserve"> teve desempenho estatisticamente superior aos restantes modelos baseados em features.</w:t>
-      </w:r>
-    </w:p>
-    <w:p>
-      <w:pPr>
+        <w:t>Classificação kNN:</w:t>
+      </w:r>
+      <w:r>
+        <w:rPr>
+          <w:rFonts w:ascii="Times New Roman" w:hAnsi="Times New Roman" w:cs="Times New Roman"/>
+          <w:sz w:val="28"/>
+          <w:szCs w:val="28"/>
+        </w:rPr>
+        <w:t xml:space="preserve"> O vetor de features resultante é classificado pelo modelo no espaço multidimensional.</w:t>
+      </w:r>
+    </w:p>
+    <w:p>
+      <w:pPr>
+        <w:jc w:val="both"/>
+        <w:rPr>
+          <w:rFonts w:ascii="Times New Roman" w:hAnsi="Times New Roman" w:cs="Times New Roman"/>
+          <w:sz w:val="28"/>
+          <w:szCs w:val="28"/>
+        </w:rPr>
+      </w:pPr>
+    </w:p>
+    <w:p>
+      <w:pPr>
+        <w:pStyle w:val="ListParagraph"/>
         <w:numPr>
           <w:ilvl w:val="0"/>
-          <w:numId w:val="27"/>
+          <w:numId w:val="2"/>
         </w:numPr>
-        <w:jc w:val="both"/>
-        <w:rPr>
-          <w:rFonts w:ascii="Times New Roman" w:hAnsi="Times New Roman" w:cs="Times New Roman"/>
-          <w:sz w:val="28"/>
-          <w:szCs w:val="28"/>
-        </w:rPr>
-      </w:pPr>
-      <w:r>
-        <w:rPr>
-          <w:rFonts w:ascii="Times New Roman" w:hAnsi="Times New Roman" w:cs="Times New Roman"/>
-          <w:sz w:val="28"/>
-          <w:szCs w:val="28"/>
-        </w:rPr>
-        <w:t>As abordagens PCA e ReliefF mostraram diferenças significativas entre si, mas ambas ficaram abaixo do Features A.</w:t>
+        <w:spacing w:before="100" w:beforeAutospacing="1" w:after="100" w:afterAutospacing="1" w:line="240" w:lineRule="auto"/>
+        <w:jc w:val="both"/>
+        <w:rPr>
+          <w:rFonts w:ascii="Times New Roman" w:eastAsia="Times New Roman" w:hAnsi="Times New Roman" w:cs="Times New Roman"/>
+          <w:kern w:val="0"/>
+          <w:sz w:val="28"/>
+          <w:szCs w:val="28"/>
+          <w:lang w:eastAsia="pt-PT"/>
+          <w14:ligatures w14:val="none"/>
+        </w:rPr>
+      </w:pPr>
+      <w:r>
+        <w:rPr>
+          <w:rFonts w:ascii="Times New Roman" w:hAnsi="Times New Roman" w:cs="Times New Roman"/>
+          <w:b/>
+          <w:bCs/>
+          <w:sz w:val="48"/>
+          <w:szCs w:val="48"/>
+        </w:rPr>
+        <w:t>M</w:t>
+      </w:r>
+      <w:r>
+        <w:rPr>
+          <w:rFonts w:ascii="Times New Roman" w:hAnsi="Times New Roman" w:cs="Times New Roman"/>
+          <w:b/>
+          <w:bCs/>
+          <w:sz w:val="48"/>
+          <w:szCs w:val="48"/>
+        </w:rPr>
+        <w:t>elhorias Abordadas</w:t>
+      </w:r>
+    </w:p>
+    <w:p>
+      <w:pPr>
+        <w:jc w:val="both"/>
+        <w:rPr>
+          <w:rFonts w:ascii="Times New Roman" w:hAnsi="Times New Roman" w:cs="Times New Roman"/>
+          <w:sz w:val="28"/>
+          <w:szCs w:val="28"/>
+        </w:rPr>
+      </w:pPr>
+      <w:r>
+        <w:rPr>
+          <w:rFonts w:ascii="Times New Roman" w:hAnsi="Times New Roman" w:cs="Times New Roman"/>
+          <w:sz w:val="28"/>
+          <w:szCs w:val="28"/>
+        </w:rPr>
+        <w:t>Para elevar a eficácia do sistema de reconhecimento de atividades, foram identificadas e exploradas diversas vias de otimização, focadas tanto na qualidade dos dados como na parametrização do algoritmo de aprendizagem</w:t>
+      </w:r>
+      <w:r>
+        <w:rPr>
+          <w:rFonts w:ascii="Times New Roman" w:hAnsi="Times New Roman" w:cs="Times New Roman"/>
+          <w:sz w:val="28"/>
+          <w:szCs w:val="28"/>
+        </w:rPr>
+        <w:t>:</w:t>
       </w:r>
     </w:p>
     <w:p>
       <w:pPr>
         <w:numPr>
           <w:ilvl w:val="0"/>
-          <w:numId w:val="27"/>
+          <w:numId w:val="29"/>
         </w:numPr>
-        <w:jc w:val="both"/>
-        <w:rPr>
-          <w:rFonts w:ascii="Times New Roman" w:hAnsi="Times New Roman" w:cs="Times New Roman"/>
-          <w:sz w:val="28"/>
-          <w:szCs w:val="28"/>
-        </w:rPr>
-      </w:pPr>
-      <w:r>
-        <w:rPr>
-          <w:rFonts w:ascii="Times New Roman" w:hAnsi="Times New Roman" w:cs="Times New Roman"/>
-          <w:sz w:val="28"/>
-          <w:szCs w:val="28"/>
-        </w:rPr>
-        <w:t>Os modelos que usavam embeddings também apresentaram diferenças estatísticas relevantes, sem alcançar o desempenho do modelo final.</w:t>
-      </w:r>
-    </w:p>
-    <w:p>
-      <w:pPr>
-        <w:jc w:val="both"/>
-        <w:rPr>
-          <w:rFonts w:ascii="Times New Roman" w:hAnsi="Times New Roman" w:cs="Times New Roman"/>
-          <w:sz w:val="28"/>
-          <w:szCs w:val="28"/>
-        </w:rPr>
-      </w:pPr>
-      <w:r>
-        <w:rPr>
-          <w:rFonts w:ascii="Times New Roman" w:hAnsi="Times New Roman" w:cs="Times New Roman"/>
-          <w:sz w:val="28"/>
-          <w:szCs w:val="28"/>
-        </w:rPr>
-        <w:t xml:space="preserve">Assim, o modelo </w:t>
-      </w:r>
+        <w:tabs>
+          <w:tab w:val="num" w:pos="720"/>
+        </w:tabs>
+        <w:jc w:val="both"/>
+        <w:rPr>
+          <w:rFonts w:ascii="Times New Roman" w:hAnsi="Times New Roman" w:cs="Times New Roman"/>
+          <w:sz w:val="28"/>
+          <w:szCs w:val="28"/>
+        </w:rPr>
+      </w:pPr>
       <w:r>
         <w:rPr>
           <w:rFonts w:ascii="Times New Roman" w:hAnsi="Times New Roman" w:cs="Times New Roman"/>
@@ -7923,26 +9568,372 @@
           <w:sz w:val="28"/>
           <w:szCs w:val="28"/>
         </w:rPr>
-        <w:t>Participant Features A (k = 19)</w:t>
-      </w:r>
-      <w:r>
-        <w:rPr>
-          <w:rFonts w:ascii="Times New Roman" w:hAnsi="Times New Roman" w:cs="Times New Roman"/>
-          <w:sz w:val="28"/>
-          <w:szCs w:val="28"/>
-        </w:rPr>
-        <w:t xml:space="preserve"> foi validado como a escolha mais robusta entre os 12 modelos estudados.</w:t>
-      </w:r>
-    </w:p>
-    <w:p>
-      <w:pPr>
-        <w:jc w:val="both"/>
-        <w:rPr>
-          <w:rFonts w:ascii="Times New Roman" w:hAnsi="Times New Roman" w:cs="Times New Roman"/>
-          <w:sz w:val="28"/>
-          <w:szCs w:val="28"/>
-        </w:rPr>
-      </w:pPr>
+        <w:t>Refinação do Dataset:</w:t>
+      </w:r>
+      <w:r>
+        <w:rPr>
+          <w:rFonts w:ascii="Times New Roman" w:hAnsi="Times New Roman" w:cs="Times New Roman"/>
+          <w:sz w:val="28"/>
+          <w:szCs w:val="28"/>
+        </w:rPr>
+        <w:t xml:space="preserve"> Procedeu-se à remoção seletiva de outliers identificados pelos métodos IQR e Z-Score, eliminando ruído que poderia distorcer as fronteiras de decisão do kNN.</w:t>
+      </w:r>
+    </w:p>
+    <w:p>
+      <w:pPr>
+        <w:numPr>
+          <w:ilvl w:val="0"/>
+          <w:numId w:val="29"/>
+        </w:numPr>
+        <w:tabs>
+          <w:tab w:val="num" w:pos="720"/>
+        </w:tabs>
+        <w:jc w:val="both"/>
+        <w:rPr>
+          <w:rFonts w:ascii="Times New Roman" w:hAnsi="Times New Roman" w:cs="Times New Roman"/>
+          <w:sz w:val="28"/>
+          <w:szCs w:val="28"/>
+        </w:rPr>
+      </w:pPr>
+      <w:r>
+        <w:rPr>
+          <w:rFonts w:ascii="Times New Roman" w:hAnsi="Times New Roman" w:cs="Times New Roman"/>
+          <w:b/>
+          <w:bCs/>
+          <w:sz w:val="28"/>
+          <w:szCs w:val="28"/>
+        </w:rPr>
+        <w:t>Balanceamento Estratégico:</w:t>
+      </w:r>
+      <w:r>
+        <w:rPr>
+          <w:rFonts w:ascii="Times New Roman" w:hAnsi="Times New Roman" w:cs="Times New Roman"/>
+          <w:sz w:val="28"/>
+          <w:szCs w:val="28"/>
+        </w:rPr>
+        <w:t xml:space="preserve"> Utilizou-se a técnica SMOTE no dataset de treino para equilibrar as classes minoritárias</w:t>
+      </w:r>
+      <w:r>
+        <w:rPr>
+          <w:rFonts w:ascii="Times New Roman" w:hAnsi="Times New Roman" w:cs="Times New Roman"/>
+          <w:sz w:val="28"/>
+          <w:szCs w:val="28"/>
+        </w:rPr>
+        <w:t xml:space="preserve"> </w:t>
+      </w:r>
+      <w:r>
+        <w:rPr>
+          <w:rFonts w:ascii="Times New Roman" w:hAnsi="Times New Roman" w:cs="Times New Roman"/>
+          <w:sz w:val="28"/>
+          <w:szCs w:val="28"/>
+        </w:rPr>
+        <w:t>prevenindo o enviesamento do modelo para as atividades mais frequentes.</w:t>
+      </w:r>
+    </w:p>
+    <w:p>
+      <w:pPr>
+        <w:pStyle w:val="ListParagraph"/>
+        <w:numPr>
+          <w:ilvl w:val="0"/>
+          <w:numId w:val="29"/>
+        </w:numPr>
+        <w:jc w:val="both"/>
+        <w:rPr>
+          <w:rFonts w:ascii="Times New Roman" w:hAnsi="Times New Roman" w:cs="Times New Roman"/>
+          <w:sz w:val="28"/>
+          <w:szCs w:val="28"/>
+        </w:rPr>
+      </w:pPr>
+      <w:r>
+        <w:rPr>
+          <w:rFonts w:ascii="Times New Roman" w:hAnsi="Times New Roman" w:cs="Times New Roman"/>
+          <w:b/>
+          <w:bCs/>
+          <w:sz w:val="28"/>
+          <w:szCs w:val="28"/>
+        </w:rPr>
+        <w:t>Distance Weights:</w:t>
+      </w:r>
+      <w:r>
+        <w:rPr>
+          <w:rFonts w:ascii="Times New Roman" w:hAnsi="Times New Roman" w:cs="Times New Roman"/>
+          <w:sz w:val="28"/>
+          <w:szCs w:val="28"/>
+        </w:rPr>
+        <w:t xml:space="preserve"> Atribuição de pesos inversamente proporcionais à distância, garantindo que vizinhos mais próximos tenham maior influência na decisão.</w:t>
+      </w:r>
+    </w:p>
+    <w:p>
+      <w:pPr>
+        <w:pStyle w:val="ListParagraph"/>
+        <w:numPr>
+          <w:ilvl w:val="0"/>
+          <w:numId w:val="29"/>
+        </w:numPr>
+        <w:jc w:val="both"/>
+        <w:rPr>
+          <w:rFonts w:ascii="Times New Roman" w:hAnsi="Times New Roman" w:cs="Times New Roman"/>
+          <w:sz w:val="28"/>
+          <w:szCs w:val="28"/>
+        </w:rPr>
+      </w:pPr>
+      <w:r>
+        <w:rPr>
+          <w:rFonts w:ascii="Times New Roman" w:hAnsi="Times New Roman" w:cs="Times New Roman"/>
+          <w:b/>
+          <w:bCs/>
+          <w:sz w:val="28"/>
+          <w:szCs w:val="28"/>
+        </w:rPr>
+        <w:t>Métrica de Manhattan:</w:t>
+      </w:r>
+      <w:r>
+        <w:rPr>
+          <w:rFonts w:ascii="Times New Roman" w:hAnsi="Times New Roman" w:cs="Times New Roman"/>
+          <w:sz w:val="28"/>
+          <w:szCs w:val="28"/>
+        </w:rPr>
+        <w:t xml:space="preserve"> Testou-se a distânci</w:t>
+      </w:r>
+      <w:r>
+        <w:rPr>
+          <w:rFonts w:ascii="Times New Roman" w:hAnsi="Times New Roman" w:cs="Times New Roman"/>
+          <w:sz w:val="28"/>
+          <w:szCs w:val="28"/>
+        </w:rPr>
+        <w:t>a</w:t>
+      </w:r>
+      <w:r>
+        <w:rPr>
+          <w:rFonts w:ascii="Times New Roman" w:hAnsi="Times New Roman" w:cs="Times New Roman"/>
+          <w:sz w:val="28"/>
+          <w:szCs w:val="28"/>
+        </w:rPr>
+        <w:t xml:space="preserve"> como alternativa à Euclidiana, por ser frequentemente mais robusta em espaços de características de escalas heterogéneas.</w:t>
+      </w:r>
+    </w:p>
+    <w:p>
+      <w:pPr>
+        <w:numPr>
+          <w:ilvl w:val="0"/>
+          <w:numId w:val="29"/>
+        </w:numPr>
+        <w:tabs>
+          <w:tab w:val="num" w:pos="720"/>
+        </w:tabs>
+        <w:jc w:val="both"/>
+        <w:rPr>
+          <w:rFonts w:ascii="Times New Roman" w:hAnsi="Times New Roman" w:cs="Times New Roman"/>
+          <w:sz w:val="28"/>
+          <w:szCs w:val="28"/>
+        </w:rPr>
+      </w:pPr>
+      <w:r>
+        <w:rPr>
+          <w:rFonts w:ascii="Times New Roman" w:hAnsi="Times New Roman" w:cs="Times New Roman"/>
+          <w:b/>
+          <w:bCs/>
+          <w:sz w:val="28"/>
+          <w:szCs w:val="28"/>
+        </w:rPr>
+        <w:t>Arquitetura Multi-Dispositivo:</w:t>
+      </w:r>
+      <w:r>
+        <w:rPr>
+          <w:rFonts w:ascii="Times New Roman" w:hAnsi="Times New Roman" w:cs="Times New Roman"/>
+          <w:sz w:val="28"/>
+          <w:szCs w:val="28"/>
+        </w:rPr>
+        <w:t xml:space="preserve"> Explorou-se a ideia de treinar cinco classificadores independentes</w:t>
+      </w:r>
+      <w:r>
+        <w:rPr>
+          <w:rFonts w:ascii="Times New Roman" w:hAnsi="Times New Roman" w:cs="Times New Roman"/>
+          <w:sz w:val="28"/>
+          <w:szCs w:val="28"/>
+        </w:rPr>
+        <w:t>,</w:t>
+      </w:r>
+      <w:r>
+        <w:rPr>
+          <w:rFonts w:ascii="Times New Roman" w:hAnsi="Times New Roman" w:cs="Times New Roman"/>
+          <w:sz w:val="28"/>
+          <w:szCs w:val="28"/>
+        </w:rPr>
+        <w:t xml:space="preserve"> um dedicado a cada um dos cinco dispositivos. Dependendo da origem da amostra, o sistema utiliza o classificador especializado, permitindo captar melhor as biomecânicas de cada </w:t>
+      </w:r>
+      <w:r>
+        <w:rPr>
+          <w:rFonts w:ascii="Times New Roman" w:hAnsi="Times New Roman" w:cs="Times New Roman"/>
+          <w:sz w:val="28"/>
+          <w:szCs w:val="28"/>
+        </w:rPr>
+        <w:t>componente</w:t>
+      </w:r>
+      <w:r>
+        <w:rPr>
+          <w:rFonts w:ascii="Times New Roman" w:hAnsi="Times New Roman" w:cs="Times New Roman"/>
+          <w:sz w:val="28"/>
+          <w:szCs w:val="28"/>
+        </w:rPr>
+        <w:t xml:space="preserve"> corporal.</w:t>
+      </w:r>
+    </w:p>
+    <w:p>
+      <w:pPr>
+        <w:jc w:val="both"/>
+        <w:rPr>
+          <w:rFonts w:ascii="Times New Roman" w:hAnsi="Times New Roman" w:cs="Times New Roman"/>
+          <w:sz w:val="28"/>
+          <w:szCs w:val="28"/>
+        </w:rPr>
+      </w:pPr>
+      <w:r>
+        <w:rPr>
+          <w:rFonts w:ascii="Times New Roman" w:hAnsi="Times New Roman" w:cs="Times New Roman"/>
+          <w:sz w:val="28"/>
+          <w:szCs w:val="28"/>
+        </w:rPr>
+        <w:t>As melhorias implementadas visam reduzir a confusão observada entre atividades com e sem fala . A remoção de outliers e o balanceamento com SMOTE permitem que o modelo defina melhor os padrões subtis do sinal, resultando numa matriz de confusão mais limpa e num F1-score mais elevado, especialmente na estratégia de divisão por participantes</w:t>
+      </w:r>
+      <w:r>
+        <w:rPr>
+          <w:rFonts w:ascii="Times New Roman" w:hAnsi="Times New Roman" w:cs="Times New Roman"/>
+          <w:sz w:val="28"/>
+          <w:szCs w:val="28"/>
+        </w:rPr>
+        <w:t>.</w:t>
+      </w:r>
+    </w:p>
+    <w:p>
+      <w:pPr>
+        <w:jc w:val="both"/>
+        <w:rPr>
+          <w:rFonts w:ascii="Times New Roman" w:hAnsi="Times New Roman" w:cs="Times New Roman"/>
+          <w:sz w:val="28"/>
+          <w:szCs w:val="28"/>
+        </w:rPr>
+      </w:pPr>
+    </w:p>
+    <w:p>
+      <w:pPr>
+        <w:pStyle w:val="ListParagraph"/>
+        <w:numPr>
+          <w:ilvl w:val="0"/>
+          <w:numId w:val="2"/>
+        </w:numPr>
+        <w:spacing w:before="100" w:beforeAutospacing="1" w:after="100" w:afterAutospacing="1" w:line="240" w:lineRule="auto"/>
+        <w:jc w:val="both"/>
+        <w:rPr>
+          <w:rFonts w:ascii="Times New Roman" w:eastAsia="Times New Roman" w:hAnsi="Times New Roman" w:cs="Times New Roman"/>
+          <w:kern w:val="0"/>
+          <w:sz w:val="28"/>
+          <w:szCs w:val="28"/>
+          <w:lang w:eastAsia="pt-PT"/>
+          <w14:ligatures w14:val="none"/>
+        </w:rPr>
+      </w:pPr>
+      <w:r>
+        <w:rPr>
+          <w:rFonts w:ascii="Times New Roman" w:hAnsi="Times New Roman" w:cs="Times New Roman"/>
+          <w:b/>
+          <w:bCs/>
+          <w:sz w:val="48"/>
+          <w:szCs w:val="48"/>
+        </w:rPr>
+        <w:t>Conclusão</w:t>
+      </w:r>
+    </w:p>
+    <w:p>
+      <w:pPr>
+        <w:spacing w:after="100" w:afterAutospacing="1" w:line="240" w:lineRule="auto"/>
+        <w:jc w:val="both"/>
+        <w:rPr>
+          <w:rFonts w:ascii="Times New Roman" w:eastAsia="Times New Roman" w:hAnsi="Times New Roman" w:cs="Times New Roman"/>
+          <w:kern w:val="0"/>
+          <w:sz w:val="28"/>
+          <w:szCs w:val="28"/>
+          <w:lang w:eastAsia="pt-PT"/>
+          <w14:ligatures w14:val="none"/>
+        </w:rPr>
+      </w:pPr>
+      <w:r>
+        <w:rPr>
+          <w:rFonts w:ascii="Times New Roman" w:eastAsia="Times New Roman" w:hAnsi="Times New Roman" w:cs="Times New Roman"/>
+          <w:kern w:val="0"/>
+          <w:sz w:val="28"/>
+          <w:szCs w:val="28"/>
+          <w:lang w:eastAsia="pt-PT"/>
+          <w14:ligatures w14:val="none"/>
+        </w:rPr>
+        <w:t>O</w:t>
+      </w:r>
+      <w:r>
+        <w:rPr>
+          <w:rFonts w:ascii="Times New Roman" w:eastAsia="Times New Roman" w:hAnsi="Times New Roman" w:cs="Times New Roman"/>
+          <w:kern w:val="0"/>
+          <w:sz w:val="28"/>
+          <w:szCs w:val="28"/>
+          <w:lang w:eastAsia="pt-PT"/>
+          <w14:ligatures w14:val="none"/>
+        </w:rPr>
+        <w:t xml:space="preserve"> </w:t>
+      </w:r>
+      <w:r>
+        <w:rPr>
+          <w:rFonts w:ascii="Times New Roman" w:eastAsia="Times New Roman" w:hAnsi="Times New Roman" w:cs="Times New Roman"/>
+          <w:kern w:val="0"/>
+          <w:sz w:val="28"/>
+          <w:szCs w:val="28"/>
+          <w:lang w:eastAsia="pt-PT"/>
+          <w14:ligatures w14:val="none"/>
+        </w:rPr>
+        <w:t xml:space="preserve">trabalho permitiu validar uma pipeline completa de reconhecimento de atividades humanas, desde o pré-processamento físico até à validação estatística rigorosa. A comparação sistemática dos 12 modelos demonstrou que as </w:t>
+      </w:r>
+      <w:r>
+        <w:rPr>
+          <w:rFonts w:ascii="Times New Roman" w:eastAsia="Times New Roman" w:hAnsi="Times New Roman" w:cs="Times New Roman"/>
+          <w:kern w:val="0"/>
+          <w:sz w:val="28"/>
+          <w:szCs w:val="28"/>
+          <w:lang w:eastAsia="pt-PT"/>
+          <w14:ligatures w14:val="none"/>
+        </w:rPr>
+        <w:t>features manuais</w:t>
+      </w:r>
+      <w:r>
+        <w:rPr>
+          <w:rFonts w:ascii="Times New Roman" w:eastAsia="Times New Roman" w:hAnsi="Times New Roman" w:cs="Times New Roman"/>
+          <w:kern w:val="0"/>
+          <w:sz w:val="28"/>
+          <w:szCs w:val="28"/>
+          <w:lang w:eastAsia="pt-PT"/>
+          <w14:ligatures w14:val="none"/>
+        </w:rPr>
+        <w:t xml:space="preserve"> superam os embeddings</w:t>
+      </w:r>
+      <w:r>
+        <w:rPr>
+          <w:rFonts w:ascii="Times New Roman" w:eastAsia="Times New Roman" w:hAnsi="Times New Roman" w:cs="Times New Roman"/>
+          <w:kern w:val="0"/>
+          <w:sz w:val="28"/>
+          <w:szCs w:val="28"/>
+          <w:lang w:eastAsia="pt-PT"/>
+          <w14:ligatures w14:val="none"/>
+        </w:rPr>
+        <w:t xml:space="preserve"> na resolução do problema</w:t>
+      </w:r>
+      <w:r>
+        <w:rPr>
+          <w:rFonts w:ascii="Times New Roman" w:eastAsia="Times New Roman" w:hAnsi="Times New Roman" w:cs="Times New Roman"/>
+          <w:kern w:val="0"/>
+          <w:sz w:val="28"/>
+          <w:szCs w:val="28"/>
+          <w:lang w:eastAsia="pt-PT"/>
+          <w14:ligatures w14:val="none"/>
+        </w:rPr>
+        <w:t xml:space="preserve">. </w:t>
+      </w:r>
     </w:p>
     <w:p>
       <w:pPr>
@@ -7955,7 +9946,7 @@
       </w:pPr>
     </w:p>
     <w:sectPr>
-      <w:footerReference w:type="default" r:id="rId22"/>
+      <w:footerReference w:type="default" r:id="rId30"/>
       <w:pgSz w:w="11906" w:h="16838"/>
       <w:pgMar w:top="1417" w:right="1701" w:bottom="1417" w:left="1701" w:header="708" w:footer="708" w:gutter="0"/>
       <w:cols w:space="708"/>
@@ -10829,6 +12820,272 @@
     </w:lvl>
   </w:abstractNum>
   <w:abstractNum w:abstractNumId="25" w15:restartNumberingAfterBreak="0">
+    <w:nsid w:val="73F955A8"/>
+    <w:multiLevelType w:val="multilevel"/>
+    <w:tmpl w:val="B6F8F874"/>
+    <w:lvl w:ilvl="0">
+      <w:start w:val="1"/>
+      <w:numFmt w:val="bullet"/>
+      <w:lvlText w:val=""/>
+      <w:lvlJc w:val="left"/>
+      <w:pPr>
+        <w:tabs>
+          <w:tab w:val="num" w:pos="360"/>
+        </w:tabs>
+        <w:ind w:left="360" w:hanging="360"/>
+      </w:pPr>
+      <w:rPr>
+        <w:rFonts w:ascii="Symbol" w:hAnsi="Symbol" w:hint="default"/>
+      </w:rPr>
+    </w:lvl>
+    <w:lvl w:ilvl="1" w:tentative="1">
+      <w:start w:val="1"/>
+      <w:numFmt w:val="decimal"/>
+      <w:lvlText w:val="%2."/>
+      <w:lvlJc w:val="left"/>
+      <w:pPr>
+        <w:tabs>
+          <w:tab w:val="num" w:pos="1080"/>
+        </w:tabs>
+        <w:ind w:left="1080" w:hanging="360"/>
+      </w:pPr>
+    </w:lvl>
+    <w:lvl w:ilvl="2" w:tentative="1">
+      <w:start w:val="1"/>
+      <w:numFmt w:val="decimal"/>
+      <w:lvlText w:val="%3."/>
+      <w:lvlJc w:val="left"/>
+      <w:pPr>
+        <w:tabs>
+          <w:tab w:val="num" w:pos="1800"/>
+        </w:tabs>
+        <w:ind w:left="1800" w:hanging="360"/>
+      </w:pPr>
+    </w:lvl>
+    <w:lvl w:ilvl="3" w:tentative="1">
+      <w:start w:val="1"/>
+      <w:numFmt w:val="decimal"/>
+      <w:lvlText w:val="%4."/>
+      <w:lvlJc w:val="left"/>
+      <w:pPr>
+        <w:tabs>
+          <w:tab w:val="num" w:pos="2520"/>
+        </w:tabs>
+        <w:ind w:left="2520" w:hanging="360"/>
+      </w:pPr>
+    </w:lvl>
+    <w:lvl w:ilvl="4" w:tentative="1">
+      <w:start w:val="1"/>
+      <w:numFmt w:val="decimal"/>
+      <w:lvlText w:val="%5."/>
+      <w:lvlJc w:val="left"/>
+      <w:pPr>
+        <w:tabs>
+          <w:tab w:val="num" w:pos="3240"/>
+        </w:tabs>
+        <w:ind w:left="3240" w:hanging="360"/>
+      </w:pPr>
+    </w:lvl>
+    <w:lvl w:ilvl="5" w:tentative="1">
+      <w:start w:val="1"/>
+      <w:numFmt w:val="decimal"/>
+      <w:lvlText w:val="%6."/>
+      <w:lvlJc w:val="left"/>
+      <w:pPr>
+        <w:tabs>
+          <w:tab w:val="num" w:pos="3960"/>
+        </w:tabs>
+        <w:ind w:left="3960" w:hanging="360"/>
+      </w:pPr>
+    </w:lvl>
+    <w:lvl w:ilvl="6" w:tentative="1">
+      <w:start w:val="1"/>
+      <w:numFmt w:val="decimal"/>
+      <w:lvlText w:val="%7."/>
+      <w:lvlJc w:val="left"/>
+      <w:pPr>
+        <w:tabs>
+          <w:tab w:val="num" w:pos="4680"/>
+        </w:tabs>
+        <w:ind w:left="4680" w:hanging="360"/>
+      </w:pPr>
+    </w:lvl>
+    <w:lvl w:ilvl="7" w:tentative="1">
+      <w:start w:val="1"/>
+      <w:numFmt w:val="decimal"/>
+      <w:lvlText w:val="%8."/>
+      <w:lvlJc w:val="left"/>
+      <w:pPr>
+        <w:tabs>
+          <w:tab w:val="num" w:pos="5400"/>
+        </w:tabs>
+        <w:ind w:left="5400" w:hanging="360"/>
+      </w:pPr>
+    </w:lvl>
+    <w:lvl w:ilvl="8" w:tentative="1">
+      <w:start w:val="1"/>
+      <w:numFmt w:val="decimal"/>
+      <w:lvlText w:val="%9."/>
+      <w:lvlJc w:val="left"/>
+      <w:pPr>
+        <w:tabs>
+          <w:tab w:val="num" w:pos="6120"/>
+        </w:tabs>
+        <w:ind w:left="6120" w:hanging="360"/>
+      </w:pPr>
+    </w:lvl>
+  </w:abstractNum>
+  <w:abstractNum w:abstractNumId="26" w15:restartNumberingAfterBreak="0">
+    <w:nsid w:val="750F050F"/>
+    <w:multiLevelType w:val="multilevel"/>
+    <w:tmpl w:val="CFDA6254"/>
+    <w:lvl w:ilvl="0">
+      <w:start w:val="1"/>
+      <w:numFmt w:val="bullet"/>
+      <w:lvlText w:val=""/>
+      <w:lvlJc w:val="left"/>
+      <w:pPr>
+        <w:tabs>
+          <w:tab w:val="num" w:pos="360"/>
+        </w:tabs>
+        <w:ind w:left="360" w:hanging="360"/>
+      </w:pPr>
+      <w:rPr>
+        <w:rFonts w:ascii="Symbol" w:hAnsi="Symbol" w:hint="default"/>
+        <w:sz w:val="28"/>
+        <w:szCs w:val="40"/>
+      </w:rPr>
+    </w:lvl>
+    <w:lvl w:ilvl="1">
+      <w:start w:val="1"/>
+      <w:numFmt w:val="bullet"/>
+      <w:lvlText w:val="o"/>
+      <w:lvlJc w:val="left"/>
+      <w:pPr>
+        <w:tabs>
+          <w:tab w:val="num" w:pos="360"/>
+        </w:tabs>
+        <w:ind w:left="360" w:hanging="360"/>
+      </w:pPr>
+      <w:rPr>
+        <w:rFonts w:ascii="Courier New" w:hAnsi="Courier New" w:hint="default"/>
+        <w:sz w:val="20"/>
+      </w:rPr>
+    </w:lvl>
+    <w:lvl w:ilvl="2" w:tentative="1">
+      <w:start w:val="1"/>
+      <w:numFmt w:val="bullet"/>
+      <w:lvlText w:val=""/>
+      <w:lvlJc w:val="left"/>
+      <w:pPr>
+        <w:tabs>
+          <w:tab w:val="num" w:pos="1800"/>
+        </w:tabs>
+        <w:ind w:left="1800" w:hanging="360"/>
+      </w:pPr>
+      <w:rPr>
+        <w:rFonts w:ascii="Wingdings" w:hAnsi="Wingdings" w:hint="default"/>
+        <w:sz w:val="20"/>
+      </w:rPr>
+    </w:lvl>
+    <w:lvl w:ilvl="3" w:tentative="1">
+      <w:start w:val="1"/>
+      <w:numFmt w:val="bullet"/>
+      <w:lvlText w:val=""/>
+      <w:lvlJc w:val="left"/>
+      <w:pPr>
+        <w:tabs>
+          <w:tab w:val="num" w:pos="2520"/>
+        </w:tabs>
+        <w:ind w:left="2520" w:hanging="360"/>
+      </w:pPr>
+      <w:rPr>
+        <w:rFonts w:ascii="Wingdings" w:hAnsi="Wingdings" w:hint="default"/>
+        <w:sz w:val="20"/>
+      </w:rPr>
+    </w:lvl>
+    <w:lvl w:ilvl="4" w:tentative="1">
+      <w:start w:val="1"/>
+      <w:numFmt w:val="bullet"/>
+      <w:lvlText w:val=""/>
+      <w:lvlJc w:val="left"/>
+      <w:pPr>
+        <w:tabs>
+          <w:tab w:val="num" w:pos="3240"/>
+        </w:tabs>
+        <w:ind w:left="3240" w:hanging="360"/>
+      </w:pPr>
+      <w:rPr>
+        <w:rFonts w:ascii="Wingdings" w:hAnsi="Wingdings" w:hint="default"/>
+        <w:sz w:val="20"/>
+      </w:rPr>
+    </w:lvl>
+    <w:lvl w:ilvl="5" w:tentative="1">
+      <w:start w:val="1"/>
+      <w:numFmt w:val="bullet"/>
+      <w:lvlText w:val=""/>
+      <w:lvlJc w:val="left"/>
+      <w:pPr>
+        <w:tabs>
+          <w:tab w:val="num" w:pos="3960"/>
+        </w:tabs>
+        <w:ind w:left="3960" w:hanging="360"/>
+      </w:pPr>
+      <w:rPr>
+        <w:rFonts w:ascii="Wingdings" w:hAnsi="Wingdings" w:hint="default"/>
+        <w:sz w:val="20"/>
+      </w:rPr>
+    </w:lvl>
+    <w:lvl w:ilvl="6" w:tentative="1">
+      <w:start w:val="1"/>
+      <w:numFmt w:val="bullet"/>
+      <w:lvlText w:val=""/>
+      <w:lvlJc w:val="left"/>
+      <w:pPr>
+        <w:tabs>
+          <w:tab w:val="num" w:pos="4680"/>
+        </w:tabs>
+        <w:ind w:left="4680" w:hanging="360"/>
+      </w:pPr>
+      <w:rPr>
+        <w:rFonts w:ascii="Wingdings" w:hAnsi="Wingdings" w:hint="default"/>
+        <w:sz w:val="20"/>
+      </w:rPr>
+    </w:lvl>
+    <w:lvl w:ilvl="7" w:tentative="1">
+      <w:start w:val="1"/>
+      <w:numFmt w:val="bullet"/>
+      <w:lvlText w:val=""/>
+      <w:lvlJc w:val="left"/>
+      <w:pPr>
+        <w:tabs>
+          <w:tab w:val="num" w:pos="5400"/>
+        </w:tabs>
+        <w:ind w:left="5400" w:hanging="360"/>
+      </w:pPr>
+      <w:rPr>
+        <w:rFonts w:ascii="Wingdings" w:hAnsi="Wingdings" w:hint="default"/>
+        <w:sz w:val="20"/>
+      </w:rPr>
+    </w:lvl>
+    <w:lvl w:ilvl="8" w:tentative="1">
+      <w:start w:val="1"/>
+      <w:numFmt w:val="bullet"/>
+      <w:lvlText w:val=""/>
+      <w:lvlJc w:val="left"/>
+      <w:pPr>
+        <w:tabs>
+          <w:tab w:val="num" w:pos="6120"/>
+        </w:tabs>
+        <w:ind w:left="6120" w:hanging="360"/>
+      </w:pPr>
+      <w:rPr>
+        <w:rFonts w:ascii="Wingdings" w:hAnsi="Wingdings" w:hint="default"/>
+        <w:sz w:val="20"/>
+      </w:rPr>
+    </w:lvl>
+  </w:abstractNum>
+  <w:abstractNum w:abstractNumId="27" w15:restartNumberingAfterBreak="0">
     <w:nsid w:val="78912538"/>
     <w:multiLevelType w:val="multilevel"/>
     <w:tmpl w:val="15BE714C"/>
@@ -10977,7 +13234,7 @@
       </w:rPr>
     </w:lvl>
   </w:abstractNum>
-  <w:abstractNum w:abstractNumId="26" w15:restartNumberingAfterBreak="0">
+  <w:abstractNum w:abstractNumId="28" w15:restartNumberingAfterBreak="0">
     <w:nsid w:val="7F385848"/>
     <w:multiLevelType w:val="hybridMultilevel"/>
     <w:tmpl w:val="202EFB88"/>
@@ -11112,7 +13369,7 @@
     <w:abstractNumId w:val="13"/>
   </w:num>
   <w:num w:numId="8" w16cid:durableId="2030787739">
-    <w:abstractNumId w:val="26"/>
+    <w:abstractNumId w:val="28"/>
   </w:num>
   <w:num w:numId="9" w16cid:durableId="1608923020">
     <w:abstractNumId w:val="8"/>
@@ -11169,7 +13426,13 @@
     <w:abstractNumId w:val="24"/>
   </w:num>
   <w:num w:numId="27" w16cid:durableId="2087191153">
+    <w:abstractNumId w:val="27"/>
+  </w:num>
+  <w:num w:numId="28" w16cid:durableId="615328650">
     <w:abstractNumId w:val="25"/>
+  </w:num>
+  <w:num w:numId="29" w16cid:durableId="889876423">
+    <w:abstractNumId w:val="26"/>
   </w:num>
   <w:numIdMacAtCleanup w:val="19"/>
 </w:numbering>
@@ -12224,6 +14487,36 @@
       <w:rFonts w:ascii="Times New Roman" w:hAnsi="Times New Roman" w:cs="Times New Roman"/>
     </w:rPr>
   </w:style>
+  <w:style w:type="character" w:customStyle="1" w:styleId="citation-129">
+    <w:name w:val="citation-129"/>
+    <w:basedOn w:val="DefaultParagraphFont"/>
+    <w:rsid w:val="00B47706"/>
+  </w:style>
+  <w:style w:type="character" w:customStyle="1" w:styleId="citation-128">
+    <w:name w:val="citation-128"/>
+    <w:basedOn w:val="DefaultParagraphFont"/>
+    <w:rsid w:val="00B47706"/>
+  </w:style>
+  <w:style w:type="character" w:customStyle="1" w:styleId="citation-127">
+    <w:name w:val="citation-127"/>
+    <w:basedOn w:val="DefaultParagraphFont"/>
+    <w:rsid w:val="00B47706"/>
+  </w:style>
+  <w:style w:type="character" w:customStyle="1" w:styleId="citation-126">
+    <w:name w:val="citation-126"/>
+    <w:basedOn w:val="DefaultParagraphFont"/>
+    <w:rsid w:val="00B47706"/>
+  </w:style>
+  <w:style w:type="character" w:customStyle="1" w:styleId="math-inline">
+    <w:name w:val="math-inline"/>
+    <w:basedOn w:val="DefaultParagraphFont"/>
+    <w:rsid w:val="00B47706"/>
+  </w:style>
+  <w:style w:type="character" w:customStyle="1" w:styleId="citation-125">
+    <w:name w:val="citation-125"/>
+    <w:basedOn w:val="DefaultParagraphFont"/>
+    <w:rsid w:val="00B47706"/>
+  </w:style>
 </w:styles>
 </file>
 

</xml_diff>

<commit_message>
Refactor documentation and update synthetic sample noise level: enhance table of contents in reports and adjust noise standard deviation in synthetic sample generation for improved data accuracy.
</commit_message>
<xml_diff>
--- a/docs/Relatório.docx
+++ b/docs/Relatório.docx
@@ -832,6 +832,24 @@
         </w:rPr>
         <w:t>Introdução</w:t>
       </w:r>
+      <w:r>
+        <w:rPr>
+          <w:rFonts w:ascii="Times New Roman" w:hAnsi="Times New Roman" w:cs="Times New Roman"/>
+          <w:b/>
+          <w:bCs/>
+          <w:sz w:val="40"/>
+          <w:szCs w:val="40"/>
+        </w:rPr>
+        <w:t xml:space="preserve"> </w:t>
+      </w:r>
+      <w:r>
+        <w:rPr>
+          <w:rFonts w:ascii="Times New Roman" w:hAnsi="Times New Roman" w:cs="Times New Roman"/>
+          <w:sz w:val="28"/>
+          <w:szCs w:val="28"/>
+        </w:rPr>
+        <w:t>(3)</w:t>
+      </w:r>
     </w:p>
     <w:p>
       <w:pPr>
@@ -859,6 +877,30 @@
         </w:rPr>
         <w:t xml:space="preserve">Dados e Contexto </w:t>
       </w:r>
+      <w:r>
+        <w:rPr>
+          <w:rFonts w:ascii="Times New Roman" w:hAnsi="Times New Roman" w:cs="Times New Roman"/>
+          <w:sz w:val="28"/>
+          <w:szCs w:val="28"/>
+        </w:rPr>
+        <w:t>(</w:t>
+      </w:r>
+      <w:r>
+        <w:rPr>
+          <w:rFonts w:ascii="Times New Roman" w:hAnsi="Times New Roman" w:cs="Times New Roman"/>
+          <w:sz w:val="28"/>
+          <w:szCs w:val="28"/>
+        </w:rPr>
+        <w:t>3</w:t>
+      </w:r>
+      <w:r>
+        <w:rPr>
+          <w:rFonts w:ascii="Times New Roman" w:hAnsi="Times New Roman" w:cs="Times New Roman"/>
+          <w:sz w:val="28"/>
+          <w:szCs w:val="28"/>
+        </w:rPr>
+        <w:t>)</w:t>
+      </w:r>
     </w:p>
     <w:p>
       <w:pPr>
@@ -886,6 +928,40 @@
         </w:rPr>
         <w:t>Cálculo dos Módulos dos Vetores</w:t>
       </w:r>
+      <w:r>
+        <w:rPr>
+          <w:rFonts w:ascii="Times New Roman" w:hAnsi="Times New Roman" w:cs="Times New Roman"/>
+          <w:b/>
+          <w:bCs/>
+          <w:sz w:val="40"/>
+          <w:szCs w:val="40"/>
+        </w:rPr>
+        <w:t xml:space="preserve"> </w:t>
+      </w:r>
+      <w:r>
+        <w:rPr>
+          <w:rFonts w:ascii="Times New Roman" w:hAnsi="Times New Roman" w:cs="Times New Roman"/>
+          <w:sz w:val="28"/>
+          <w:szCs w:val="28"/>
+        </w:rPr>
+        <w:t>(</w:t>
+      </w:r>
+      <w:r>
+        <w:rPr>
+          <w:rFonts w:ascii="Times New Roman" w:hAnsi="Times New Roman" w:cs="Times New Roman"/>
+          <w:sz w:val="28"/>
+          <w:szCs w:val="28"/>
+        </w:rPr>
+        <w:t>3</w:t>
+      </w:r>
+      <w:r>
+        <w:rPr>
+          <w:rFonts w:ascii="Times New Roman" w:hAnsi="Times New Roman" w:cs="Times New Roman"/>
+          <w:sz w:val="28"/>
+          <w:szCs w:val="28"/>
+        </w:rPr>
+        <w:t>)</w:t>
+      </w:r>
     </w:p>
     <w:p>
       <w:pPr>
@@ -950,6 +1026,30 @@
         </w:rPr>
         <w:t xml:space="preserve"> de Outliers </w:t>
       </w:r>
+      <w:r>
+        <w:rPr>
+          <w:rFonts w:ascii="Times New Roman" w:hAnsi="Times New Roman" w:cs="Times New Roman"/>
+          <w:sz w:val="28"/>
+          <w:szCs w:val="28"/>
+        </w:rPr>
+        <w:t>(</w:t>
+      </w:r>
+      <w:r>
+        <w:rPr>
+          <w:rFonts w:ascii="Times New Roman" w:hAnsi="Times New Roman" w:cs="Times New Roman"/>
+          <w:sz w:val="28"/>
+          <w:szCs w:val="28"/>
+        </w:rPr>
+        <w:t>4</w:t>
+      </w:r>
+      <w:r>
+        <w:rPr>
+          <w:rFonts w:ascii="Times New Roman" w:hAnsi="Times New Roman" w:cs="Times New Roman"/>
+          <w:sz w:val="28"/>
+          <w:szCs w:val="28"/>
+        </w:rPr>
+        <w:t>)</w:t>
+      </w:r>
     </w:p>
     <w:p>
       <w:pPr>
@@ -992,6 +1092,41 @@
         <w:t>Normalidade</w:t>
       </w:r>
       <w:proofErr w:type="spellEnd"/>
+      <w:r>
+        <w:rPr>
+          <w:rFonts w:ascii="Times New Roman" w:hAnsi="Times New Roman" w:cs="Times New Roman"/>
+          <w:b/>
+          <w:bCs/>
+          <w:sz w:val="40"/>
+          <w:szCs w:val="40"/>
+          <w:lang w:val="en-US"/>
+        </w:rPr>
+        <w:t xml:space="preserve"> </w:t>
+      </w:r>
+      <w:r>
+        <w:rPr>
+          <w:rFonts w:ascii="Times New Roman" w:hAnsi="Times New Roman" w:cs="Times New Roman"/>
+          <w:sz w:val="28"/>
+          <w:szCs w:val="28"/>
+        </w:rPr>
+        <w:t>(</w:t>
+      </w:r>
+      <w:r>
+        <w:rPr>
+          <w:rFonts w:ascii="Times New Roman" w:hAnsi="Times New Roman" w:cs="Times New Roman"/>
+          <w:sz w:val="28"/>
+          <w:szCs w:val="28"/>
+        </w:rPr>
+        <w:t>8</w:t>
+      </w:r>
+      <w:r>
+        <w:rPr>
+          <w:rFonts w:ascii="Times New Roman" w:hAnsi="Times New Roman" w:cs="Times New Roman"/>
+          <w:sz w:val="28"/>
+          <w:szCs w:val="28"/>
+        </w:rPr>
+        <w:t>)</w:t>
+      </w:r>
     </w:p>
     <w:p>
       <w:pPr>
@@ -1017,7 +1152,51 @@
           <w:sz w:val="40"/>
           <w:szCs w:val="40"/>
         </w:rPr>
-        <w:t>Segmentação Temporal e Extração de Features</w:t>
+        <w:t>Extração de Features</w:t>
+      </w:r>
+      <w:r>
+        <w:rPr>
+          <w:rFonts w:ascii="Times New Roman" w:hAnsi="Times New Roman" w:cs="Times New Roman"/>
+          <w:b/>
+          <w:bCs/>
+          <w:sz w:val="40"/>
+          <w:szCs w:val="40"/>
+        </w:rPr>
+        <w:t xml:space="preserve"> </w:t>
+      </w:r>
+      <w:r>
+        <w:rPr>
+          <w:rFonts w:ascii="Times New Roman" w:hAnsi="Times New Roman" w:cs="Times New Roman"/>
+          <w:sz w:val="28"/>
+          <w:szCs w:val="28"/>
+        </w:rPr>
+        <w:t>(</w:t>
+      </w:r>
+      <w:r>
+        <w:rPr>
+          <w:rFonts w:ascii="Times New Roman" w:hAnsi="Times New Roman" w:cs="Times New Roman"/>
+          <w:sz w:val="28"/>
+          <w:szCs w:val="28"/>
+        </w:rPr>
+        <w:t>9</w:t>
+      </w:r>
+      <w:r>
+        <w:rPr>
+          <w:rFonts w:ascii="Times New Roman" w:hAnsi="Times New Roman" w:cs="Times New Roman"/>
+          <w:sz w:val="28"/>
+          <w:szCs w:val="28"/>
+        </w:rPr>
+        <w:t>)</w:t>
+      </w:r>
+      <w:r>
+        <w:rPr>
+          <w:rFonts w:ascii="Times New Roman" w:hAnsi="Times New Roman" w:cs="Times New Roman"/>
+          <w:b/>
+          <w:bCs/>
+          <w:sz w:val="40"/>
+          <w:szCs w:val="40"/>
+        </w:rPr>
+        <w:t xml:space="preserve"> </w:t>
       </w:r>
     </w:p>
     <w:p>
@@ -1046,6 +1225,40 @@
         </w:rPr>
         <w:t>Normalização e PCA</w:t>
       </w:r>
+      <w:r>
+        <w:rPr>
+          <w:rFonts w:ascii="Times New Roman" w:hAnsi="Times New Roman" w:cs="Times New Roman"/>
+          <w:b/>
+          <w:bCs/>
+          <w:sz w:val="40"/>
+          <w:szCs w:val="40"/>
+        </w:rPr>
+        <w:t xml:space="preserve"> </w:t>
+      </w:r>
+      <w:r>
+        <w:rPr>
+          <w:rFonts w:ascii="Times New Roman" w:hAnsi="Times New Roman" w:cs="Times New Roman"/>
+          <w:sz w:val="28"/>
+          <w:szCs w:val="28"/>
+        </w:rPr>
+        <w:t>(</w:t>
+      </w:r>
+      <w:r>
+        <w:rPr>
+          <w:rFonts w:ascii="Times New Roman" w:hAnsi="Times New Roman" w:cs="Times New Roman"/>
+          <w:sz w:val="28"/>
+          <w:szCs w:val="28"/>
+        </w:rPr>
+        <w:t>9</w:t>
+      </w:r>
+      <w:r>
+        <w:rPr>
+          <w:rFonts w:ascii="Times New Roman" w:hAnsi="Times New Roman" w:cs="Times New Roman"/>
+          <w:sz w:val="28"/>
+          <w:szCs w:val="28"/>
+        </w:rPr>
+        <w:t>)</w:t>
+      </w:r>
     </w:p>
     <w:p>
       <w:pPr>
@@ -1073,6 +1286,40 @@
         </w:rPr>
         <w:t>Seleção de Features</w:t>
       </w:r>
+      <w:r>
+        <w:rPr>
+          <w:rFonts w:ascii="Times New Roman" w:hAnsi="Times New Roman" w:cs="Times New Roman"/>
+          <w:b/>
+          <w:bCs/>
+          <w:sz w:val="40"/>
+          <w:szCs w:val="40"/>
+        </w:rPr>
+        <w:t xml:space="preserve"> </w:t>
+      </w:r>
+      <w:r>
+        <w:rPr>
+          <w:rFonts w:ascii="Times New Roman" w:hAnsi="Times New Roman" w:cs="Times New Roman"/>
+          <w:sz w:val="28"/>
+          <w:szCs w:val="28"/>
+        </w:rPr>
+        <w:t>(1</w:t>
+      </w:r>
+      <w:r>
+        <w:rPr>
+          <w:rFonts w:ascii="Times New Roman" w:hAnsi="Times New Roman" w:cs="Times New Roman"/>
+          <w:sz w:val="28"/>
+          <w:szCs w:val="28"/>
+        </w:rPr>
+        <w:t>0</w:t>
+      </w:r>
+      <w:r>
+        <w:rPr>
+          <w:rFonts w:ascii="Times New Roman" w:hAnsi="Times New Roman" w:cs="Times New Roman"/>
+          <w:sz w:val="28"/>
+          <w:szCs w:val="28"/>
+        </w:rPr>
+        <w:t>)</w:t>
+      </w:r>
     </w:p>
     <w:p>
       <w:pPr>
@@ -1100,6 +1347,40 @@
         </w:rPr>
         <w:t>Aumentação dos Dados</w:t>
       </w:r>
+      <w:r>
+        <w:rPr>
+          <w:rFonts w:ascii="Times New Roman" w:hAnsi="Times New Roman" w:cs="Times New Roman"/>
+          <w:b/>
+          <w:bCs/>
+          <w:sz w:val="40"/>
+          <w:szCs w:val="40"/>
+        </w:rPr>
+        <w:t xml:space="preserve"> </w:t>
+      </w:r>
+      <w:r>
+        <w:rPr>
+          <w:rFonts w:ascii="Times New Roman" w:hAnsi="Times New Roman" w:cs="Times New Roman"/>
+          <w:sz w:val="28"/>
+          <w:szCs w:val="28"/>
+        </w:rPr>
+        <w:t>(1</w:t>
+      </w:r>
+      <w:r>
+        <w:rPr>
+          <w:rFonts w:ascii="Times New Roman" w:hAnsi="Times New Roman" w:cs="Times New Roman"/>
+          <w:sz w:val="28"/>
+          <w:szCs w:val="28"/>
+        </w:rPr>
+        <w:t>1</w:t>
+      </w:r>
+      <w:r>
+        <w:rPr>
+          <w:rFonts w:ascii="Times New Roman" w:hAnsi="Times New Roman" w:cs="Times New Roman"/>
+          <w:sz w:val="28"/>
+          <w:szCs w:val="28"/>
+        </w:rPr>
+        <w:t>)</w:t>
+      </w:r>
     </w:p>
     <w:p>
       <w:pPr>
@@ -1127,6 +1408,40 @@
         </w:rPr>
         <w:t>Embeddings</w:t>
       </w:r>
+      <w:r>
+        <w:rPr>
+          <w:rFonts w:ascii="Times New Roman" w:hAnsi="Times New Roman" w:cs="Times New Roman"/>
+          <w:b/>
+          <w:bCs/>
+          <w:sz w:val="40"/>
+          <w:szCs w:val="40"/>
+        </w:rPr>
+        <w:t xml:space="preserve"> </w:t>
+      </w:r>
+      <w:r>
+        <w:rPr>
+          <w:rFonts w:ascii="Times New Roman" w:hAnsi="Times New Roman" w:cs="Times New Roman"/>
+          <w:sz w:val="28"/>
+          <w:szCs w:val="28"/>
+        </w:rPr>
+        <w:t>(1</w:t>
+      </w:r>
+      <w:r>
+        <w:rPr>
+          <w:rFonts w:ascii="Times New Roman" w:hAnsi="Times New Roman" w:cs="Times New Roman"/>
+          <w:sz w:val="28"/>
+          <w:szCs w:val="28"/>
+        </w:rPr>
+        <w:t>2</w:t>
+      </w:r>
+      <w:r>
+        <w:rPr>
+          <w:rFonts w:ascii="Times New Roman" w:hAnsi="Times New Roman" w:cs="Times New Roman"/>
+          <w:sz w:val="28"/>
+          <w:szCs w:val="28"/>
+        </w:rPr>
+        <w:t>)</w:t>
+      </w:r>
     </w:p>
     <w:p>
       <w:pPr>
@@ -1154,6 +1469,40 @@
         </w:rPr>
         <w:t>Estratégias de Divisão de Dados</w:t>
       </w:r>
+      <w:r>
+        <w:rPr>
+          <w:rFonts w:ascii="Times New Roman" w:hAnsi="Times New Roman" w:cs="Times New Roman"/>
+          <w:b/>
+          <w:bCs/>
+          <w:sz w:val="40"/>
+          <w:szCs w:val="40"/>
+        </w:rPr>
+        <w:t xml:space="preserve"> </w:t>
+      </w:r>
+      <w:r>
+        <w:rPr>
+          <w:rFonts w:ascii="Times New Roman" w:hAnsi="Times New Roman" w:cs="Times New Roman"/>
+          <w:sz w:val="28"/>
+          <w:szCs w:val="28"/>
+        </w:rPr>
+        <w:t>(1</w:t>
+      </w:r>
+      <w:r>
+        <w:rPr>
+          <w:rFonts w:ascii="Times New Roman" w:hAnsi="Times New Roman" w:cs="Times New Roman"/>
+          <w:sz w:val="28"/>
+          <w:szCs w:val="28"/>
+        </w:rPr>
+        <w:t>2</w:t>
+      </w:r>
+      <w:r>
+        <w:rPr>
+          <w:rFonts w:ascii="Times New Roman" w:hAnsi="Times New Roman" w:cs="Times New Roman"/>
+          <w:sz w:val="28"/>
+          <w:szCs w:val="28"/>
+        </w:rPr>
+        <w:t>)</w:t>
+      </w:r>
     </w:p>
     <w:p>
       <w:pPr>
@@ -1181,6 +1530,40 @@
         </w:rPr>
         <w:t>Classificador k-Nearest Neighbors</w:t>
       </w:r>
+      <w:r>
+        <w:rPr>
+          <w:rFonts w:ascii="Times New Roman" w:hAnsi="Times New Roman" w:cs="Times New Roman"/>
+          <w:b/>
+          <w:bCs/>
+          <w:sz w:val="40"/>
+          <w:szCs w:val="40"/>
+        </w:rPr>
+        <w:t xml:space="preserve"> </w:t>
+      </w:r>
+      <w:r>
+        <w:rPr>
+          <w:rFonts w:ascii="Times New Roman" w:hAnsi="Times New Roman" w:cs="Times New Roman"/>
+          <w:sz w:val="28"/>
+          <w:szCs w:val="28"/>
+        </w:rPr>
+        <w:t>(1</w:t>
+      </w:r>
+      <w:r>
+        <w:rPr>
+          <w:rFonts w:ascii="Times New Roman" w:hAnsi="Times New Roman" w:cs="Times New Roman"/>
+          <w:sz w:val="28"/>
+          <w:szCs w:val="28"/>
+        </w:rPr>
+        <w:t>3</w:t>
+      </w:r>
+      <w:r>
+        <w:rPr>
+          <w:rFonts w:ascii="Times New Roman" w:hAnsi="Times New Roman" w:cs="Times New Roman"/>
+          <w:sz w:val="28"/>
+          <w:szCs w:val="28"/>
+        </w:rPr>
+        <w:t>)</w:t>
+      </w:r>
     </w:p>
     <w:p>
       <w:pPr>
@@ -1208,6 +1591,40 @@
         </w:rPr>
         <w:t>Avaliação dos Modelos</w:t>
       </w:r>
+      <w:r>
+        <w:rPr>
+          <w:rFonts w:ascii="Times New Roman" w:hAnsi="Times New Roman" w:cs="Times New Roman"/>
+          <w:b/>
+          <w:bCs/>
+          <w:sz w:val="40"/>
+          <w:szCs w:val="40"/>
+        </w:rPr>
+        <w:t xml:space="preserve"> </w:t>
+      </w:r>
+      <w:r>
+        <w:rPr>
+          <w:rFonts w:ascii="Times New Roman" w:hAnsi="Times New Roman" w:cs="Times New Roman"/>
+          <w:sz w:val="28"/>
+          <w:szCs w:val="28"/>
+        </w:rPr>
+        <w:t>(1</w:t>
+      </w:r>
+      <w:r>
+        <w:rPr>
+          <w:rFonts w:ascii="Times New Roman" w:hAnsi="Times New Roman" w:cs="Times New Roman"/>
+          <w:sz w:val="28"/>
+          <w:szCs w:val="28"/>
+        </w:rPr>
+        <w:t>4</w:t>
+      </w:r>
+      <w:r>
+        <w:rPr>
+          <w:rFonts w:ascii="Times New Roman" w:hAnsi="Times New Roman" w:cs="Times New Roman"/>
+          <w:sz w:val="28"/>
+          <w:szCs w:val="28"/>
+        </w:rPr>
+        <w:t>)</w:t>
+      </w:r>
     </w:p>
     <w:p>
       <w:pPr>
@@ -1235,6 +1652,40 @@
         </w:rPr>
         <w:t>Testes de Hipótese</w:t>
       </w:r>
+      <w:r>
+        <w:rPr>
+          <w:rFonts w:ascii="Times New Roman" w:hAnsi="Times New Roman" w:cs="Times New Roman"/>
+          <w:b/>
+          <w:bCs/>
+          <w:sz w:val="40"/>
+          <w:szCs w:val="40"/>
+        </w:rPr>
+        <w:t xml:space="preserve"> </w:t>
+      </w:r>
+      <w:r>
+        <w:rPr>
+          <w:rFonts w:ascii="Times New Roman" w:hAnsi="Times New Roman" w:cs="Times New Roman"/>
+          <w:sz w:val="28"/>
+          <w:szCs w:val="28"/>
+        </w:rPr>
+        <w:t>(1</w:t>
+      </w:r>
+      <w:r>
+        <w:rPr>
+          <w:rFonts w:ascii="Times New Roman" w:hAnsi="Times New Roman" w:cs="Times New Roman"/>
+          <w:sz w:val="28"/>
+          <w:szCs w:val="28"/>
+        </w:rPr>
+        <w:t>6</w:t>
+      </w:r>
+      <w:r>
+        <w:rPr>
+          <w:rFonts w:ascii="Times New Roman" w:hAnsi="Times New Roman" w:cs="Times New Roman"/>
+          <w:sz w:val="28"/>
+          <w:szCs w:val="28"/>
+        </w:rPr>
+        <w:t>)</w:t>
+      </w:r>
     </w:p>
     <w:p>
       <w:pPr>
@@ -1261,6 +1712,40 @@
           <w:szCs w:val="40"/>
         </w:rPr>
         <w:t>Modelo de Implantação</w:t>
+      </w:r>
+      <w:r>
+        <w:rPr>
+          <w:rFonts w:ascii="Times New Roman" w:hAnsi="Times New Roman" w:cs="Times New Roman"/>
+          <w:b/>
+          <w:bCs/>
+          <w:sz w:val="40"/>
+          <w:szCs w:val="40"/>
+        </w:rPr>
+        <w:t xml:space="preserve"> </w:t>
+      </w:r>
+      <w:r>
+        <w:rPr>
+          <w:rFonts w:ascii="Times New Roman" w:hAnsi="Times New Roman" w:cs="Times New Roman"/>
+          <w:sz w:val="28"/>
+          <w:szCs w:val="28"/>
+        </w:rPr>
+        <w:t>(1</w:t>
+      </w:r>
+      <w:r>
+        <w:rPr>
+          <w:rFonts w:ascii="Times New Roman" w:hAnsi="Times New Roman" w:cs="Times New Roman"/>
+          <w:sz w:val="28"/>
+          <w:szCs w:val="28"/>
+        </w:rPr>
+        <w:t>8</w:t>
+      </w:r>
+      <w:r>
+        <w:rPr>
+          <w:rFonts w:ascii="Times New Roman" w:hAnsi="Times New Roman" w:cs="Times New Roman"/>
+          <w:sz w:val="28"/>
+          <w:szCs w:val="28"/>
+        </w:rPr>
+        <w:t>)</w:t>
       </w:r>
     </w:p>
     <w:p>
@@ -5004,7 +5489,7 @@
           <w:szCs w:val="28"/>
         </w:rPr>
         <w:drawing>
-          <wp:anchor distT="0" distB="0" distL="114300" distR="114300" simplePos="0" relativeHeight="251675648" behindDoc="1" locked="0" layoutInCell="1" allowOverlap="1" wp14:anchorId="54A8846A" wp14:editId="25772555">
+          <wp:anchor distT="0" distB="0" distL="114300" distR="114300" simplePos="0" relativeHeight="251675648" behindDoc="1" locked="0" layoutInCell="1" allowOverlap="1" wp14:anchorId="54A8846A" wp14:editId="0CBB94B4">
             <wp:simplePos x="0" y="0"/>
             <wp:positionH relativeFrom="margin">
               <wp:posOffset>-325289</wp:posOffset>
@@ -5481,7 +5966,6 @@
           <w:rFonts w:ascii="Times New Roman" w:hAnsi="Times New Roman" w:cs="Times New Roman"/>
           <w:sz w:val="28"/>
           <w:szCs w:val="28"/>
-          <w:lang w:val="en-US"/>
         </w:rPr>
         <w:t xml:space="preserve"> </w:t>
       </w:r>
@@ -6085,35 +6569,27 @@
           <w:szCs w:val="28"/>
           <w:lang w:val="en-US"/>
         </w:rPr>
-        <w:t xml:space="preserve"> </w:t>
-      </w:r>
-      <w:r>
-        <w:rPr>
-          <w:rFonts w:ascii="Times New Roman" w:hAnsi="Times New Roman" w:cs="Times New Roman"/>
-          <w:sz w:val="28"/>
-          <w:szCs w:val="28"/>
-          <w:lang w:val="en-US"/>
-        </w:rPr>
-        <w:t>1819 samples</w:t>
-      </w:r>
-    </w:p>
-    <w:p>
-      <w:pPr>
-        <w:jc w:val="both"/>
-        <w:rPr>
-          <w:rFonts w:ascii="Times New Roman" w:hAnsi="Times New Roman" w:cs="Times New Roman"/>
-          <w:sz w:val="28"/>
-          <w:szCs w:val="28"/>
-        </w:rPr>
-      </w:pPr>
-      <w:r>
-        <w:rPr>
-          <w:rFonts w:ascii="Times New Roman" w:hAnsi="Times New Roman" w:cs="Times New Roman"/>
+        <w:t xml:space="preserve"> 1819 samples</w:t>
+      </w:r>
+    </w:p>
+    <w:p>
+      <w:pPr>
+        <w:jc w:val="both"/>
+        <w:rPr>
+          <w:rFonts w:ascii="Times New Roman" w:hAnsi="Times New Roman" w:cs="Times New Roman"/>
+          <w:sz w:val="28"/>
+          <w:szCs w:val="28"/>
+        </w:rPr>
+      </w:pPr>
+      <w:r>
+        <w:rPr>
+          <w:rFonts w:ascii="Times New Roman" w:hAnsi="Times New Roman" w:cs="Times New Roman"/>
+          <w:noProof/>
           <w:sz w:val="28"/>
           <w:szCs w:val="28"/>
         </w:rPr>
         <w:drawing>
-          <wp:anchor distT="0" distB="0" distL="114300" distR="114300" simplePos="0" relativeHeight="251678720" behindDoc="1" locked="0" layoutInCell="1" allowOverlap="1" wp14:anchorId="47794484" wp14:editId="18C28407">
+          <wp:anchor distT="0" distB="0" distL="114300" distR="114300" simplePos="0" relativeHeight="251678720" behindDoc="1" locked="0" layoutInCell="1" allowOverlap="1" wp14:anchorId="47794484" wp14:editId="3994638B">
             <wp:simplePos x="0" y="0"/>
             <wp:positionH relativeFrom="margin">
               <wp:align>left</wp:align>
@@ -7534,6 +8010,7 @@
       <w:r>
         <w:rPr>
           <w:rFonts w:ascii="Times New Roman" w:hAnsi="Times New Roman" w:cs="Times New Roman"/>
+          <w:noProof/>
           <w:sz w:val="28"/>
           <w:szCs w:val="28"/>
         </w:rPr>
@@ -7806,6 +8283,7 @@
       <w:r>
         <w:rPr>
           <w:rFonts w:ascii="Times New Roman" w:hAnsi="Times New Roman" w:cs="Times New Roman"/>
+          <w:noProof/>
           <w:sz w:val="28"/>
           <w:szCs w:val="28"/>
         </w:rPr>
@@ -7877,6 +8355,7 @@
       <w:r>
         <w:rPr>
           <w:rFonts w:ascii="Times New Roman" w:hAnsi="Times New Roman" w:cs="Times New Roman"/>
+          <w:noProof/>
           <w:sz w:val="28"/>
           <w:szCs w:val="28"/>
         </w:rPr>
@@ -8039,6 +8518,7 @@
       <w:r>
         <w:rPr>
           <w:rFonts w:ascii="Times New Roman" w:hAnsi="Times New Roman" w:cs="Times New Roman"/>
+          <w:noProof/>
           <w:sz w:val="28"/>
           <w:szCs w:val="28"/>
         </w:rPr>
@@ -8553,6 +9033,7 @@
       <w:r>
         <w:rPr>
           <w:rFonts w:ascii="Times New Roman" w:eastAsia="Times New Roman" w:hAnsi="Times New Roman" w:cs="Times New Roman"/>
+          <w:noProof/>
           <w:kern w:val="0"/>
           <w:sz w:val="28"/>
           <w:szCs w:val="28"/>
@@ -8560,7 +9041,7 @@
           <w14:ligatures w14:val="none"/>
         </w:rPr>
         <w:drawing>
-          <wp:anchor distT="0" distB="0" distL="114300" distR="114300" simplePos="0" relativeHeight="251683840" behindDoc="1" locked="0" layoutInCell="1" allowOverlap="1" wp14:anchorId="7FB286B5" wp14:editId="1D27F176">
+          <wp:anchor distT="0" distB="0" distL="114300" distR="114300" simplePos="0" relativeHeight="251683840" behindDoc="1" locked="0" layoutInCell="1" allowOverlap="1" wp14:anchorId="7FB286B5" wp14:editId="1747D3C8">
             <wp:simplePos x="0" y="0"/>
             <wp:positionH relativeFrom="margin">
               <wp:align>center</wp:align>
@@ -8704,6 +9185,7 @@
       <w:r>
         <w:rPr>
           <w:rFonts w:ascii="Times New Roman" w:eastAsia="Times New Roman" w:hAnsi="Times New Roman" w:cs="Times New Roman"/>
+          <w:noProof/>
           <w:kern w:val="0"/>
           <w:sz w:val="28"/>
           <w:szCs w:val="28"/>
@@ -8712,7 +9194,7 @@
         </w:rPr>
         <w:lastRenderedPageBreak/>
         <w:drawing>
-          <wp:anchor distT="0" distB="0" distL="114300" distR="114300" simplePos="0" relativeHeight="251684864" behindDoc="1" locked="0" layoutInCell="1" allowOverlap="1" wp14:anchorId="085CAE01" wp14:editId="738EA127">
+          <wp:anchor distT="0" distB="0" distL="114300" distR="114300" simplePos="0" relativeHeight="251684864" behindDoc="1" locked="0" layoutInCell="1" allowOverlap="1" wp14:anchorId="085CAE01" wp14:editId="57E214E1">
             <wp:simplePos x="0" y="0"/>
             <wp:positionH relativeFrom="margin">
               <wp:align>center</wp:align>
@@ -8886,9 +9368,13 @@
           <w:lang w:eastAsia="pt-PT"/>
           <w14:ligatures w14:val="none"/>
         </w:rPr>
-        <w:t>Comparações entre modelos int</w:t>
-      </w:r>
-      <w:r>
+        <w:t>Comparações entre modelos inter-participante</w:t>
+      </w:r>
+    </w:p>
+    <w:p>
+      <w:pPr>
+        <w:spacing w:before="100" w:beforeAutospacing="1" w:after="100" w:afterAutospacing="1" w:line="240" w:lineRule="auto"/>
+        <w:jc w:val="both"/>
         <w:rPr>
           <w:rFonts w:ascii="Times New Roman" w:eastAsia="Times New Roman" w:hAnsi="Times New Roman" w:cs="Times New Roman"/>
           <w:kern w:val="0"/>
@@ -8897,8 +9383,7 @@
           <w:lang w:eastAsia="pt-PT"/>
           <w14:ligatures w14:val="none"/>
         </w:rPr>
-        <w:t>er</w:t>
-      </w:r>
+      </w:pPr>
       <w:r>
         <w:rPr>
           <w:rFonts w:ascii="Times New Roman" w:eastAsia="Times New Roman" w:hAnsi="Times New Roman" w:cs="Times New Roman"/>
@@ -8908,13 +9393,9 @@
           <w:lang w:eastAsia="pt-PT"/>
           <w14:ligatures w14:val="none"/>
         </w:rPr>
-        <w:t>-participante</w:t>
-      </w:r>
-    </w:p>
-    <w:p>
-      <w:pPr>
-        <w:spacing w:before="100" w:beforeAutospacing="1" w:after="100" w:afterAutospacing="1" w:line="240" w:lineRule="auto"/>
-        <w:jc w:val="both"/>
+        <w:t>Finalmente, a aplicação de testes t</w:t>
+      </w:r>
+      <w:r>
         <w:rPr>
           <w:rFonts w:ascii="Times New Roman" w:eastAsia="Times New Roman" w:hAnsi="Times New Roman" w:cs="Times New Roman"/>
           <w:kern w:val="0"/>
@@ -8923,7 +9404,8 @@
           <w:lang w:eastAsia="pt-PT"/>
           <w14:ligatures w14:val="none"/>
         </w:rPr>
-      </w:pPr>
+        <w:t xml:space="preserve"> </w:t>
+      </w:r>
       <w:r>
         <w:rPr>
           <w:rFonts w:ascii="Times New Roman" w:eastAsia="Times New Roman" w:hAnsi="Times New Roman" w:cs="Times New Roman"/>
@@ -8933,9 +9415,13 @@
           <w:lang w:eastAsia="pt-PT"/>
           <w14:ligatures w14:val="none"/>
         </w:rPr>
-        <w:t>Finalmente, a aplicação de testes t</w:t>
-      </w:r>
-      <w:r>
+        <w:t>independentes para comparar as estratégias de divisão de dados confirmou que a diferença de desempenho entre a abordagem intra-participante e a inter-participante não é fruto do acaso. Esta evidência estatística valida a hipótese de que modelos avaliados em novos utilizadores sofrem um impacto real na precisão devido à variabilidade biomecânica, consolidando a estratégia baseada em participantes como o método mais honesto e robusto para estimar o sucesso do sistema em cenários reais.</w:t>
+      </w:r>
+    </w:p>
+    <w:p>
+      <w:pPr>
+        <w:spacing w:before="100" w:beforeAutospacing="1" w:after="100" w:afterAutospacing="1" w:line="240" w:lineRule="auto"/>
+        <w:jc w:val="both"/>
         <w:rPr>
           <w:rFonts w:ascii="Times New Roman" w:eastAsia="Times New Roman" w:hAnsi="Times New Roman" w:cs="Times New Roman"/>
           <w:kern w:val="0"/>
@@ -8944,44 +9430,19 @@
           <w:lang w:eastAsia="pt-PT"/>
           <w14:ligatures w14:val="none"/>
         </w:rPr>
-        <w:t xml:space="preserve"> </w:t>
-      </w:r>
+      </w:pPr>
       <w:r>
         <w:rPr>
           <w:rFonts w:ascii="Times New Roman" w:eastAsia="Times New Roman" w:hAnsi="Times New Roman" w:cs="Times New Roman"/>
+          <w:noProof/>
           <w:kern w:val="0"/>
           <w:sz w:val="28"/>
           <w:szCs w:val="28"/>
           <w:lang w:eastAsia="pt-PT"/>
           <w14:ligatures w14:val="none"/>
         </w:rPr>
-        <w:t>independentes para comparar as estratégias de divisão de dados confirmou que a diferença de desempenho entre a abordagem intra-participante e a inter-participante não é fruto do acaso. Esta evidência estatística valida a hipótese de que modelos avaliados em novos utilizadores sofrem um impacto real na precisão devido à variabilidade biomecânica, consolidando a estratégia baseada em participantes como o método mais honesto e robusto para estimar o sucesso do sistema em cenários reais.</w:t>
-      </w:r>
-    </w:p>
-    <w:p>
-      <w:pPr>
-        <w:spacing w:before="100" w:beforeAutospacing="1" w:after="100" w:afterAutospacing="1" w:line="240" w:lineRule="auto"/>
-        <w:jc w:val="both"/>
-        <w:rPr>
-          <w:rFonts w:ascii="Times New Roman" w:eastAsia="Times New Roman" w:hAnsi="Times New Roman" w:cs="Times New Roman"/>
-          <w:kern w:val="0"/>
-          <w:sz w:val="28"/>
-          <w:szCs w:val="28"/>
-          <w:lang w:eastAsia="pt-PT"/>
-          <w14:ligatures w14:val="none"/>
-        </w:rPr>
-      </w:pPr>
-      <w:r>
-        <w:rPr>
-          <w:rFonts w:ascii="Times New Roman" w:eastAsia="Times New Roman" w:hAnsi="Times New Roman" w:cs="Times New Roman"/>
-          <w:kern w:val="0"/>
-          <w:sz w:val="28"/>
-          <w:szCs w:val="28"/>
-          <w:lang w:eastAsia="pt-PT"/>
-          <w14:ligatures w14:val="none"/>
-        </w:rPr>
         <w:drawing>
-          <wp:anchor distT="0" distB="0" distL="114300" distR="114300" simplePos="0" relativeHeight="251685888" behindDoc="1" locked="0" layoutInCell="1" allowOverlap="1" wp14:anchorId="22E5AD2D" wp14:editId="6581D15A">
+          <wp:anchor distT="0" distB="0" distL="114300" distR="114300" simplePos="0" relativeHeight="251685888" behindDoc="1" locked="0" layoutInCell="1" allowOverlap="1" wp14:anchorId="22E5AD2D" wp14:editId="779630FB">
             <wp:simplePos x="0" y="0"/>
             <wp:positionH relativeFrom="margin">
               <wp:align>center</wp:align>
@@ -9171,18 +9632,7 @@
           <w:lang w:eastAsia="pt-PT"/>
           <w14:ligatures w14:val="none"/>
         </w:rPr>
-        <w:t xml:space="preserve">                       </w:t>
-      </w:r>
-      <w:r>
-        <w:rPr>
-          <w:rFonts w:ascii="Times New Roman" w:eastAsia="Times New Roman" w:hAnsi="Times New Roman" w:cs="Times New Roman"/>
-          <w:kern w:val="0"/>
-          <w:sz w:val="28"/>
-          <w:szCs w:val="28"/>
-          <w:lang w:eastAsia="pt-PT"/>
-          <w14:ligatures w14:val="none"/>
-        </w:rPr>
-        <w:t xml:space="preserve">Comparações entre </w:t>
+        <w:t xml:space="preserve">                       Comparações entre </w:t>
       </w:r>
       <w:r>
         <w:rPr>
@@ -9685,6 +10135,7 @@
           <w:sz w:val="28"/>
           <w:szCs w:val="28"/>
         </w:rPr>
+        <w:lastRenderedPageBreak/>
         <w:t>Métrica de Manhattan:</w:t>
       </w:r>
       <w:r>
@@ -14042,6 +14493,7 @@
   <w:style w:type="character" w:default="1" w:styleId="DefaultParagraphFont">
     <w:name w:val="Default Paragraph Font"/>
     <w:uiPriority w:val="1"/>
+    <w:semiHidden/>
     <w:unhideWhenUsed/>
   </w:style>
   <w:style w:type="table" w:default="1" w:styleId="TableNormal">

</xml_diff>